<commit_message>
docs: add inline screenshots to user guide
</commit_message>
<xml_diff>
--- a/docs/Mahosample-user-guide-with-test-cases-and-screenshots.docx
+++ b/docs/Mahosample-user-guide-with-test-cases-and-screenshots.docx
@@ -653,6 +653,7 @@
     <w:p>
       <w:pPr>
         <w:pStyle w:val="Heading1"/>
+        <w:keepNext w:val="0"/>
       </w:pPr>
       <w:r>
         <w:t>Mahosample Public User Guide</w:t>
@@ -669,9 +670,55 @@
     <w:p>
       <w:pPr>
         <w:pStyle w:val="Heading2"/>
+        <w:keepNext/>
       </w:pPr>
       <w:r>
         <w:t>1. เข้าใช้งานหน้าแบบฟอร์ม</w:t>
+      </w:r>
+    </w:p>
+    <w:p>
+      <w:pPr>
+        <w:pStyle w:val="Heading3"/>
+        <w:keepNext/>
+      </w:pPr>
+      <w:r>
+        <w:t>ภาพประกอบ: หน้าแบบฟอร์มลงทะเบียนรับตัวอย่าง มะโฮ</w:t>
+      </w:r>
+    </w:p>
+    <w:p>
+      <w:r>
+        <w:drawing>
+          <wp:inline xmlns:a="http://schemas.openxmlformats.org/drawingml/2006/main" xmlns:pic="http://schemas.openxmlformats.org/drawingml/2006/picture">
+            <wp:extent cx="5394960" cy="3540442"/>
+            <wp:docPr id="1" name="Picture 1"/>
+            <wp:cNvGraphicFramePr>
+              <a:graphicFrameLocks noChangeAspect="1"/>
+            </wp:cNvGraphicFramePr>
+            <a:graphic>
+              <a:graphicData uri="http://schemas.openxmlformats.org/drawingml/2006/picture">
+                <pic:pic>
+                  <pic:nvPicPr>
+                    <pic:cNvPr id="0" name="20260902154721-public-registration-form.png"/>
+                    <pic:cNvPicPr/>
+                  </pic:nvPicPr>
+                  <pic:blipFill>
+                    <a:blip r:embed="rId10"/>
+                    <a:stretch>
+                      <a:fillRect/>
+                    </a:stretch>
+                  </pic:blipFill>
+                  <pic:spPr>
+                    <a:xfrm>
+                      <a:off x="0" y="0"/>
+                      <a:ext cx="5394960" cy="3540442"/>
+                    </a:xfrm>
+                    <a:prstGeom prst="rect"/>
+                  </pic:spPr>
+                </pic:pic>
+              </a:graphicData>
+            </a:graphic>
+          </wp:inline>
+        </w:drawing>
       </w:r>
     </w:p>
     <w:p>
@@ -726,12 +773,103 @@
     <w:p>
       <w:pPr>
         <w:pStyle w:val="Heading2"/>
+        <w:keepNext/>
       </w:pPr>
       <w:r>
         <w:t>2. กรอกข้อมูลผู้ลงทะเบียน</w:t>
       </w:r>
     </w:p>
     <w:p>
+      <w:pPr>
+        <w:pStyle w:val="Heading3"/>
+        <w:keepNext/>
+      </w:pPr>
+      <w:r>
+        <w:t>ภาพประกอบ: หน้าแบบฟอร์มลงทะเบียนรับตัวอย่าง มะโฮ</w:t>
+      </w:r>
+    </w:p>
+    <w:p>
+      <w:r>
+        <w:drawing>
+          <wp:inline xmlns:a="http://schemas.openxmlformats.org/drawingml/2006/main" xmlns:pic="http://schemas.openxmlformats.org/drawingml/2006/picture">
+            <wp:extent cx="5394960" cy="3540442"/>
+            <wp:docPr id="2" name="Picture 2"/>
+            <wp:cNvGraphicFramePr>
+              <a:graphicFrameLocks noChangeAspect="1"/>
+            </wp:cNvGraphicFramePr>
+            <a:graphic>
+              <a:graphicData uri="http://schemas.openxmlformats.org/drawingml/2006/picture">
+                <pic:pic>
+                  <pic:nvPicPr>
+                    <pic:cNvPr id="0" name="20260902154721-public-registration-form.png"/>
+                    <pic:cNvPicPr/>
+                  </pic:nvPicPr>
+                  <pic:blipFill>
+                    <a:blip r:embed="rId10"/>
+                    <a:stretch>
+                      <a:fillRect/>
+                    </a:stretch>
+                  </pic:blipFill>
+                  <pic:spPr>
+                    <a:xfrm>
+                      <a:off x="0" y="0"/>
+                      <a:ext cx="5394960" cy="3540442"/>
+                    </a:xfrm>
+                    <a:prstGeom prst="rect"/>
+                  </pic:spPr>
+                </pic:pic>
+              </a:graphicData>
+            </a:graphic>
+          </wp:inline>
+        </w:drawing>
+      </w:r>
+    </w:p>
+    <w:p>
+      <w:pPr>
+        <w:pStyle w:val="Heading3"/>
+        <w:keepNext/>
+      </w:pPr>
+      <w:r>
+        <w:t>ภาพประกอบ: Validation เมื่อไม่กรอกช่องทางติดต่อ</w:t>
+      </w:r>
+    </w:p>
+    <w:p>
+      <w:r>
+        <w:drawing>
+          <wp:inline xmlns:a="http://schemas.openxmlformats.org/drawingml/2006/main" xmlns:pic="http://schemas.openxmlformats.org/drawingml/2006/picture">
+            <wp:extent cx="5394960" cy="3540442"/>
+            <wp:docPr id="3" name="Picture 3"/>
+            <wp:cNvGraphicFramePr>
+              <a:graphicFrameLocks noChangeAspect="1"/>
+            </wp:cNvGraphicFramePr>
+            <a:graphic>
+              <a:graphicData uri="http://schemas.openxmlformats.org/drawingml/2006/picture">
+                <pic:pic>
+                  <pic:nvPicPr>
+                    <pic:cNvPr id="0" name="20260902154721-public-contact-validation.png"/>
+                    <pic:cNvPicPr/>
+                  </pic:nvPicPr>
+                  <pic:blipFill>
+                    <a:blip r:embed="rId11"/>
+                    <a:stretch>
+                      <a:fillRect/>
+                    </a:stretch>
+                  </pic:blipFill>
+                  <pic:spPr>
+                    <a:xfrm>
+                      <a:off x="0" y="0"/>
+                      <a:ext cx="5394960" cy="3540442"/>
+                    </a:xfrm>
+                    <a:prstGeom prst="rect"/>
+                  </pic:spPr>
+                </pic:pic>
+              </a:graphicData>
+            </a:graphic>
+          </wp:inline>
+        </w:drawing>
+      </w:r>
+    </w:p>
+    <w:p>
       <w:r>
         <w:rPr>
           <w:rFonts w:ascii="Aptos" w:hAnsi="Aptos" w:eastAsia="Aptos"/>
@@ -816,12 +954,58 @@
     <w:p>
       <w:pPr>
         <w:pStyle w:val="Heading2"/>
+        <w:keepNext/>
       </w:pPr>
       <w:r>
         <w:t>3. กรอกข้อมูลจัดส่ง</w:t>
       </w:r>
     </w:p>
     <w:p>
+      <w:pPr>
+        <w:pStyle w:val="Heading3"/>
+        <w:keepNext/>
+      </w:pPr>
+      <w:r>
+        <w:t>ภาพประกอบ: หน้าแบบฟอร์มลงทะเบียนรับตัวอย่าง มะโฮ</w:t>
+      </w:r>
+    </w:p>
+    <w:p>
+      <w:r>
+        <w:drawing>
+          <wp:inline xmlns:a="http://schemas.openxmlformats.org/drawingml/2006/main" xmlns:pic="http://schemas.openxmlformats.org/drawingml/2006/picture">
+            <wp:extent cx="5394960" cy="3540442"/>
+            <wp:docPr id="4" name="Picture 4"/>
+            <wp:cNvGraphicFramePr>
+              <a:graphicFrameLocks noChangeAspect="1"/>
+            </wp:cNvGraphicFramePr>
+            <a:graphic>
+              <a:graphicData uri="http://schemas.openxmlformats.org/drawingml/2006/picture">
+                <pic:pic>
+                  <pic:nvPicPr>
+                    <pic:cNvPr id="0" name="20260902154721-public-registration-form.png"/>
+                    <pic:cNvPicPr/>
+                  </pic:nvPicPr>
+                  <pic:blipFill>
+                    <a:blip r:embed="rId10"/>
+                    <a:stretch>
+                      <a:fillRect/>
+                    </a:stretch>
+                  </pic:blipFill>
+                  <pic:spPr>
+                    <a:xfrm>
+                      <a:off x="0" y="0"/>
+                      <a:ext cx="5394960" cy="3540442"/>
+                    </a:xfrm>
+                    <a:prstGeom prst="rect"/>
+                  </pic:spPr>
+                </pic:pic>
+              </a:graphicData>
+            </a:graphic>
+          </wp:inline>
+        </w:drawing>
+      </w:r>
+    </w:p>
+    <w:p>
       <w:r>
         <w:rPr>
           <w:rFonts w:ascii="Aptos" w:hAnsi="Aptos" w:eastAsia="Aptos"/>
@@ -917,12 +1101,58 @@
     <w:p>
       <w:pPr>
         <w:pStyle w:val="Heading2"/>
+        <w:keepNext/>
       </w:pPr>
       <w:r>
         <w:t>4. ยินยอมใช้ข้อมูลส่วนบุคคล</w:t>
       </w:r>
     </w:p>
     <w:p>
+      <w:pPr>
+        <w:pStyle w:val="Heading3"/>
+        <w:keepNext/>
+      </w:pPr>
+      <w:r>
+        <w:t>ภาพประกอบ: หน้าแบบฟอร์มลงทะเบียนรับตัวอย่าง มะโฮ</w:t>
+      </w:r>
+    </w:p>
+    <w:p>
+      <w:r>
+        <w:drawing>
+          <wp:inline xmlns:a="http://schemas.openxmlformats.org/drawingml/2006/main" xmlns:pic="http://schemas.openxmlformats.org/drawingml/2006/picture">
+            <wp:extent cx="5394960" cy="3540442"/>
+            <wp:docPr id="5" name="Picture 5"/>
+            <wp:cNvGraphicFramePr>
+              <a:graphicFrameLocks noChangeAspect="1"/>
+            </wp:cNvGraphicFramePr>
+            <a:graphic>
+              <a:graphicData uri="http://schemas.openxmlformats.org/drawingml/2006/picture">
+                <pic:pic>
+                  <pic:nvPicPr>
+                    <pic:cNvPr id="0" name="20260902154721-public-registration-form.png"/>
+                    <pic:cNvPicPr/>
+                  </pic:nvPicPr>
+                  <pic:blipFill>
+                    <a:blip r:embed="rId10"/>
+                    <a:stretch>
+                      <a:fillRect/>
+                    </a:stretch>
+                  </pic:blipFill>
+                  <pic:spPr>
+                    <a:xfrm>
+                      <a:off x="0" y="0"/>
+                      <a:ext cx="5394960" cy="3540442"/>
+                    </a:xfrm>
+                    <a:prstGeom prst="rect"/>
+                  </pic:spPr>
+                </pic:pic>
+              </a:graphicData>
+            </a:graphic>
+          </wp:inline>
+        </w:drawing>
+      </w:r>
+    </w:p>
+    <w:p>
       <w:r>
         <w:rPr>
           <w:rFonts w:ascii="Aptos" w:hAnsi="Aptos" w:eastAsia="Aptos"/>
@@ -974,9 +1204,55 @@
     <w:p>
       <w:pPr>
         <w:pStyle w:val="Heading2"/>
+        <w:keepNext/>
       </w:pPr>
       <w:r>
         <w:t>5. ส่งแบบฟอร์มสำเร็จ</w:t>
+      </w:r>
+    </w:p>
+    <w:p>
+      <w:pPr>
+        <w:pStyle w:val="Heading3"/>
+        <w:keepNext/>
+      </w:pPr>
+      <w:r>
+        <w:t>ภาพประกอบ: Success card หลังส่งฟอร์ม พร้อมเลขรายการภายใน</w:t>
+      </w:r>
+    </w:p>
+    <w:p>
+      <w:r>
+        <w:drawing>
+          <wp:inline xmlns:a="http://schemas.openxmlformats.org/drawingml/2006/main" xmlns:pic="http://schemas.openxmlformats.org/drawingml/2006/picture">
+            <wp:extent cx="5394960" cy="3540442"/>
+            <wp:docPr id="6" name="Picture 6"/>
+            <wp:cNvGraphicFramePr>
+              <a:graphicFrameLocks noChangeAspect="1"/>
+            </wp:cNvGraphicFramePr>
+            <a:graphic>
+              <a:graphicData uri="http://schemas.openxmlformats.org/drawingml/2006/picture">
+                <pic:pic>
+                  <pic:nvPicPr>
+                    <pic:cNvPr id="0" name="20260902154721-public-success-card.png"/>
+                    <pic:cNvPicPr/>
+                  </pic:nvPicPr>
+                  <pic:blipFill>
+                    <a:blip r:embed="rId12"/>
+                    <a:stretch>
+                      <a:fillRect/>
+                    </a:stretch>
+                  </pic:blipFill>
+                  <pic:spPr>
+                    <a:xfrm>
+                      <a:off x="0" y="0"/>
+                      <a:ext cx="5394960" cy="3540442"/>
+                    </a:xfrm>
+                    <a:prstGeom prst="rect"/>
+                  </pic:spPr>
+                </pic:pic>
+              </a:graphicData>
+            </a:graphic>
+          </wp:inline>
+        </w:drawing>
       </w:r>
     </w:p>
     <w:p>
@@ -1054,12 +1330,58 @@
     <w:p>
       <w:pPr>
         <w:pStyle w:val="Heading2"/>
+        <w:keepNext/>
       </w:pPr>
       <w:r>
         <w:t>6. กรณีข้อมูลซ้ำ</w:t>
       </w:r>
     </w:p>
     <w:p>
+      <w:pPr>
+        <w:pStyle w:val="Heading3"/>
+        <w:keepNext/>
+      </w:pPr>
+      <w:r>
+        <w:t>ภาพประกอบ: Validation เมื่อไม่กรอกช่องทางติดต่อ</w:t>
+      </w:r>
+    </w:p>
+    <w:p>
+      <w:r>
+        <w:drawing>
+          <wp:inline xmlns:a="http://schemas.openxmlformats.org/drawingml/2006/main" xmlns:pic="http://schemas.openxmlformats.org/drawingml/2006/picture">
+            <wp:extent cx="5394960" cy="3540442"/>
+            <wp:docPr id="7" name="Picture 7"/>
+            <wp:cNvGraphicFramePr>
+              <a:graphicFrameLocks noChangeAspect="1"/>
+            </wp:cNvGraphicFramePr>
+            <a:graphic>
+              <a:graphicData uri="http://schemas.openxmlformats.org/drawingml/2006/picture">
+                <pic:pic>
+                  <pic:nvPicPr>
+                    <pic:cNvPr id="0" name="20260902154721-public-contact-validation.png"/>
+                    <pic:cNvPicPr/>
+                  </pic:nvPicPr>
+                  <pic:blipFill>
+                    <a:blip r:embed="rId11"/>
+                    <a:stretch>
+                      <a:fillRect/>
+                    </a:stretch>
+                  </pic:blipFill>
+                  <pic:spPr>
+                    <a:xfrm>
+                      <a:off x="0" y="0"/>
+                      <a:ext cx="5394960" cy="3540442"/>
+                    </a:xfrm>
+                    <a:prstGeom prst="rect"/>
+                  </pic:spPr>
+                </pic:pic>
+              </a:graphicData>
+            </a:graphic>
+          </wp:inline>
+        </w:drawing>
+      </w:r>
+    </w:p>
+    <w:p>
       <w:r>
         <w:rPr>
           <w:rFonts w:ascii="Aptos" w:hAnsi="Aptos" w:eastAsia="Aptos"/>
@@ -1111,9 +1433,55 @@
     <w:p>
       <w:pPr>
         <w:pStyle w:val="Heading2"/>
+        <w:keepNext/>
       </w:pPr>
       <w:r>
         <w:t>7. ตรวจสอบสถานะพัสดุ</w:t>
+      </w:r>
+    </w:p>
+    <w:p>
+      <w:pPr>
+        <w:pStyle w:val="Heading3"/>
+        <w:keepNext/>
+      </w:pPr>
+      <w:r>
+        <w:t>ภาพประกอบ: หน้าเช็คสถานะพบเลข tracking และ Tracking URL</w:t>
+      </w:r>
+    </w:p>
+    <w:p>
+      <w:r>
+        <w:drawing>
+          <wp:inline xmlns:a="http://schemas.openxmlformats.org/drawingml/2006/main" xmlns:pic="http://schemas.openxmlformats.org/drawingml/2006/picture">
+            <wp:extent cx="5394960" cy="3540442"/>
+            <wp:docPr id="8" name="Picture 8"/>
+            <wp:cNvGraphicFramePr>
+              <a:graphicFrameLocks noChangeAspect="1"/>
+            </wp:cNvGraphicFramePr>
+            <a:graphic>
+              <a:graphicData uri="http://schemas.openxmlformats.org/drawingml/2006/picture">
+                <pic:pic>
+                  <pic:nvPicPr>
+                    <pic:cNvPr id="0" name="20260902154721-tracking-found.png"/>
+                    <pic:cNvPicPr/>
+                  </pic:nvPicPr>
+                  <pic:blipFill>
+                    <a:blip r:embed="rId13"/>
+                    <a:stretch>
+                      <a:fillRect/>
+                    </a:stretch>
+                  </pic:blipFill>
+                  <pic:spPr>
+                    <a:xfrm>
+                      <a:off x="0" y="0"/>
+                      <a:ext cx="5394960" cy="3540442"/>
+                    </a:xfrm>
+                    <a:prstGeom prst="rect"/>
+                  </pic:spPr>
+                </pic:pic>
+              </a:graphicData>
+            </a:graphic>
+          </wp:inline>
+        </w:drawing>
       </w:r>
     </w:p>
     <w:p>
@@ -1228,12 +1596,58 @@
     <w:p>
       <w:pPr>
         <w:pStyle w:val="Heading2"/>
+        <w:keepNext/>
       </w:pPr>
       <w:r>
         <w:t>8. ไม่พบเลข tracking</w:t>
       </w:r>
     </w:p>
     <w:p>
+      <w:pPr>
+        <w:pStyle w:val="Heading3"/>
+        <w:keepNext/>
+      </w:pPr>
+      <w:r>
+        <w:t>ภาพประกอบ: หน้าเช็คสถานะเมื่อไม่พบเลข tracking</w:t>
+      </w:r>
+    </w:p>
+    <w:p>
+      <w:r>
+        <w:drawing>
+          <wp:inline xmlns:a="http://schemas.openxmlformats.org/drawingml/2006/main" xmlns:pic="http://schemas.openxmlformats.org/drawingml/2006/picture">
+            <wp:extent cx="5394960" cy="3540442"/>
+            <wp:docPr id="9" name="Picture 9"/>
+            <wp:cNvGraphicFramePr>
+              <a:graphicFrameLocks noChangeAspect="1"/>
+            </wp:cNvGraphicFramePr>
+            <a:graphic>
+              <a:graphicData uri="http://schemas.openxmlformats.org/drawingml/2006/picture">
+                <pic:pic>
+                  <pic:nvPicPr>
+                    <pic:cNvPr id="0" name="20260902154721-tracking-not-found.png"/>
+                    <pic:cNvPicPr/>
+                  </pic:nvPicPr>
+                  <pic:blipFill>
+                    <a:blip r:embed="rId14"/>
+                    <a:stretch>
+                      <a:fillRect/>
+                    </a:stretch>
+                  </pic:blipFill>
+                  <pic:spPr>
+                    <a:xfrm>
+                      <a:off x="0" y="0"/>
+                      <a:ext cx="5394960" cy="3540442"/>
+                    </a:xfrm>
+                    <a:prstGeom prst="rect"/>
+                  </pic:spPr>
+                </pic:pic>
+              </a:graphicData>
+            </a:graphic>
+          </wp:inline>
+        </w:drawing>
+      </w:r>
+    </w:p>
+    <w:p>
       <w:r>
         <w:rPr>
           <w:rFonts w:ascii="Aptos" w:hAnsi="Aptos" w:eastAsia="Aptos"/>
@@ -1277,9 +1691,55 @@
     <w:p>
       <w:pPr>
         <w:pStyle w:val="Heading2"/>
+        <w:keepNext/>
       </w:pPr>
       <w:r>
         <w:t>9. แนวทางความปลอดภัยของข้อมูล</w:t>
+      </w:r>
+    </w:p>
+    <w:p>
+      <w:pPr>
+        <w:pStyle w:val="Heading3"/>
+        <w:keepNext/>
+      </w:pPr>
+      <w:r>
+        <w:t>ภาพประกอบ: หน้าแบบฟอร์มลงทะเบียนรับตัวอย่าง มะโฮ</w:t>
+      </w:r>
+    </w:p>
+    <w:p>
+      <w:r>
+        <w:drawing>
+          <wp:inline xmlns:a="http://schemas.openxmlformats.org/drawingml/2006/main" xmlns:pic="http://schemas.openxmlformats.org/drawingml/2006/picture">
+            <wp:extent cx="5394960" cy="3540442"/>
+            <wp:docPr id="10" name="Picture 10"/>
+            <wp:cNvGraphicFramePr>
+              <a:graphicFrameLocks noChangeAspect="1"/>
+            </wp:cNvGraphicFramePr>
+            <a:graphic>
+              <a:graphicData uri="http://schemas.openxmlformats.org/drawingml/2006/picture">
+                <pic:pic>
+                  <pic:nvPicPr>
+                    <pic:cNvPr id="0" name="20260902154721-public-registration-form.png"/>
+                    <pic:cNvPicPr/>
+                  </pic:nvPicPr>
+                  <pic:blipFill>
+                    <a:blip r:embed="rId10"/>
+                    <a:stretch>
+                      <a:fillRect/>
+                    </a:stretch>
+                  </pic:blipFill>
+                  <pic:spPr>
+                    <a:xfrm>
+                      <a:off x="0" y="0"/>
+                      <a:ext cx="5394960" cy="3540442"/>
+                    </a:xfrm>
+                    <a:prstGeom prst="rect"/>
+                  </pic:spPr>
+                </pic:pic>
+              </a:graphicData>
+            </a:graphic>
+          </wp:inline>
+        </w:drawing>
       </w:r>
     </w:p>
     <w:p>
@@ -1336,6 +1796,7 @@
     <w:p>
       <w:pPr>
         <w:pStyle w:val="Heading1"/>
+        <w:keepNext w:val="0"/>
       </w:pPr>
       <w:r>
         <w:t>Mahosample Staff User Guide</w:t>
@@ -1352,9 +1813,55 @@
     <w:p>
       <w:pPr>
         <w:pStyle w:val="Heading2"/>
+        <w:keepNext/>
       </w:pPr>
       <w:r>
         <w:t>1. เข้าใช้งาน</w:t>
+      </w:r>
+    </w:p>
+    <w:p>
+      <w:pPr>
+        <w:pStyle w:val="Heading3"/>
+        <w:keepNext/>
+      </w:pPr>
+      <w:r>
+        <w:t>ภาพประกอบ: Dashboard พนักงานหลัง login</w:t>
+      </w:r>
+    </w:p>
+    <w:p>
+      <w:r>
+        <w:drawing>
+          <wp:inline xmlns:a="http://schemas.openxmlformats.org/drawingml/2006/main" xmlns:pic="http://schemas.openxmlformats.org/drawingml/2006/picture">
+            <wp:extent cx="5394960" cy="3540442"/>
+            <wp:docPr id="11" name="Picture 11"/>
+            <wp:cNvGraphicFramePr>
+              <a:graphicFrameLocks noChangeAspect="1"/>
+            </wp:cNvGraphicFramePr>
+            <a:graphic>
+              <a:graphicData uri="http://schemas.openxmlformats.org/drawingml/2006/picture">
+                <pic:pic>
+                  <pic:nvPicPr>
+                    <pic:cNvPr id="0" name="20260902154721-staff-dashboard.png"/>
+                    <pic:cNvPicPr/>
+                  </pic:nvPicPr>
+                  <pic:blipFill>
+                    <a:blip r:embed="rId15"/>
+                    <a:stretch>
+                      <a:fillRect/>
+                    </a:stretch>
+                  </pic:blipFill>
+                  <pic:spPr>
+                    <a:xfrm>
+                      <a:off x="0" y="0"/>
+                      <a:ext cx="5394960" cy="3540442"/>
+                    </a:xfrm>
+                    <a:prstGeom prst="rect"/>
+                  </pic:spPr>
+                </pic:pic>
+              </a:graphicData>
+            </a:graphic>
+          </wp:inline>
+        </w:drawing>
       </w:r>
     </w:p>
     <w:p>
@@ -1417,12 +1924,58 @@
     <w:p>
       <w:pPr>
         <w:pStyle w:val="Heading2"/>
+        <w:keepNext/>
       </w:pPr>
       <w:r>
         <w:t>2. หน้า Dashboard</w:t>
       </w:r>
     </w:p>
     <w:p>
+      <w:pPr>
+        <w:pStyle w:val="Heading3"/>
+        <w:keepNext/>
+      </w:pPr>
+      <w:r>
+        <w:t>ภาพประกอบ: Dashboard พนักงานหลัง login</w:t>
+      </w:r>
+    </w:p>
+    <w:p>
+      <w:r>
+        <w:drawing>
+          <wp:inline xmlns:a="http://schemas.openxmlformats.org/drawingml/2006/main" xmlns:pic="http://schemas.openxmlformats.org/drawingml/2006/picture">
+            <wp:extent cx="5394960" cy="3540442"/>
+            <wp:docPr id="12" name="Picture 12"/>
+            <wp:cNvGraphicFramePr>
+              <a:graphicFrameLocks noChangeAspect="1"/>
+            </wp:cNvGraphicFramePr>
+            <a:graphic>
+              <a:graphicData uri="http://schemas.openxmlformats.org/drawingml/2006/picture">
+                <pic:pic>
+                  <pic:nvPicPr>
+                    <pic:cNvPr id="0" name="20260902154721-staff-dashboard.png"/>
+                    <pic:cNvPicPr/>
+                  </pic:nvPicPr>
+                  <pic:blipFill>
+                    <a:blip r:embed="rId15"/>
+                    <a:stretch>
+                      <a:fillRect/>
+                    </a:stretch>
+                  </pic:blipFill>
+                  <pic:spPr>
+                    <a:xfrm>
+                      <a:off x="0" y="0"/>
+                      <a:ext cx="5394960" cy="3540442"/>
+                    </a:xfrm>
+                    <a:prstGeom prst="rect"/>
+                  </pic:spPr>
+                </pic:pic>
+              </a:graphicData>
+            </a:graphic>
+          </wp:inline>
+        </w:drawing>
+      </w:r>
+    </w:p>
+    <w:p>
       <w:r>
         <w:rPr>
           <w:rFonts w:ascii="Aptos" w:hAnsi="Aptos" w:eastAsia="Aptos"/>
@@ -1526,6 +2079,7 @@
     <w:p>
       <w:pPr>
         <w:pStyle w:val="Heading2"/>
+        <w:keepNext w:val="0"/>
       </w:pPr>
       <w:r>
         <w:t>3. ความหมายของสถานะคำขอ</w:t>
@@ -1667,6 +2221,7 @@
     <w:p>
       <w:pPr>
         <w:pStyle w:val="Heading2"/>
+        <w:keepNext w:val="0"/>
       </w:pPr>
       <w:r>
         <w:t>4. ความหมายของสถานะขนส่ง</w:t>
@@ -1770,9 +2325,55 @@
     <w:p>
       <w:pPr>
         <w:pStyle w:val="Heading2"/>
+        <w:keepNext/>
       </w:pPr>
       <w:r>
         <w:t>5. ปุ่มบันทึกคำขอ</w:t>
+      </w:r>
+    </w:p>
+    <w:p>
+      <w:pPr>
+        <w:pStyle w:val="Heading3"/>
+        <w:keepNext/>
+      </w:pPr>
+      <w:r>
+        <w:t>ภาพประกอบ: Drawer รายละเอียด พร้อมบันทึกคำขอและอัปเดตขนส่ง</w:t>
+      </w:r>
+    </w:p>
+    <w:p>
+      <w:r>
+        <w:drawing>
+          <wp:inline xmlns:a="http://schemas.openxmlformats.org/drawingml/2006/main" xmlns:pic="http://schemas.openxmlformats.org/drawingml/2006/picture">
+            <wp:extent cx="5394960" cy="3540442"/>
+            <wp:docPr id="13" name="Picture 13"/>
+            <wp:cNvGraphicFramePr>
+              <a:graphicFrameLocks noChangeAspect="1"/>
+            </wp:cNvGraphicFramePr>
+            <a:graphic>
+              <a:graphicData uri="http://schemas.openxmlformats.org/drawingml/2006/picture">
+                <pic:pic>
+                  <pic:nvPicPr>
+                    <pic:cNvPr id="0" name="20260902154721-staff-detail-drawer.png"/>
+                    <pic:cNvPicPr/>
+                  </pic:nvPicPr>
+                  <pic:blipFill>
+                    <a:blip r:embed="rId16"/>
+                    <a:stretch>
+                      <a:fillRect/>
+                    </a:stretch>
+                  </pic:blipFill>
+                  <pic:spPr>
+                    <a:xfrm>
+                      <a:off x="0" y="0"/>
+                      <a:ext cx="5394960" cy="3540442"/>
+                    </a:xfrm>
+                    <a:prstGeom prst="rect"/>
+                  </pic:spPr>
+                </pic:pic>
+              </a:graphicData>
+            </a:graphic>
+          </wp:inline>
+        </w:drawing>
       </w:r>
     </w:p>
     <w:p>
@@ -1892,9 +2493,100 @@
     <w:p>
       <w:pPr>
         <w:pStyle w:val="Heading2"/>
+        <w:keepNext/>
       </w:pPr>
       <w:r>
         <w:t>6. ปุ่มอัปเดตขนส่ง</w:t>
+      </w:r>
+    </w:p>
+    <w:p>
+      <w:pPr>
+        <w:pStyle w:val="Heading3"/>
+        <w:keepNext/>
+      </w:pPr>
+      <w:r>
+        <w:t>ภาพประกอบ: Drawer รายละเอียด พร้อมบันทึกคำขอและอัปเดตขนส่ง</w:t>
+      </w:r>
+    </w:p>
+    <w:p>
+      <w:r>
+        <w:drawing>
+          <wp:inline xmlns:a="http://schemas.openxmlformats.org/drawingml/2006/main" xmlns:pic="http://schemas.openxmlformats.org/drawingml/2006/picture">
+            <wp:extent cx="5394960" cy="3540442"/>
+            <wp:docPr id="14" name="Picture 14"/>
+            <wp:cNvGraphicFramePr>
+              <a:graphicFrameLocks noChangeAspect="1"/>
+            </wp:cNvGraphicFramePr>
+            <a:graphic>
+              <a:graphicData uri="http://schemas.openxmlformats.org/drawingml/2006/picture">
+                <pic:pic>
+                  <pic:nvPicPr>
+                    <pic:cNvPr id="0" name="20260902154721-staff-detail-drawer.png"/>
+                    <pic:cNvPicPr/>
+                  </pic:nvPicPr>
+                  <pic:blipFill>
+                    <a:blip r:embed="rId16"/>
+                    <a:stretch>
+                      <a:fillRect/>
+                    </a:stretch>
+                  </pic:blipFill>
+                  <pic:spPr>
+                    <a:xfrm>
+                      <a:off x="0" y="0"/>
+                      <a:ext cx="5394960" cy="3540442"/>
+                    </a:xfrm>
+                    <a:prstGeom prst="rect"/>
+                  </pic:spPr>
+                </pic:pic>
+              </a:graphicData>
+            </a:graphic>
+          </wp:inline>
+        </w:drawing>
+      </w:r>
+    </w:p>
+    <w:p>
+      <w:pPr>
+        <w:pStyle w:val="Heading3"/>
+        <w:keepNext/>
+      </w:pPr>
+      <w:r>
+        <w:t>ภาพประกอบ: Tracking URL แสดงเป็น link คลิกได้</w:t>
+      </w:r>
+    </w:p>
+    <w:p>
+      <w:r>
+        <w:drawing>
+          <wp:inline xmlns:a="http://schemas.openxmlformats.org/drawingml/2006/main" xmlns:pic="http://schemas.openxmlformats.org/drawingml/2006/picture">
+            <wp:extent cx="5394960" cy="3540442"/>
+            <wp:docPr id="15" name="Picture 15"/>
+            <wp:cNvGraphicFramePr>
+              <a:graphicFrameLocks noChangeAspect="1"/>
+            </wp:cNvGraphicFramePr>
+            <a:graphic>
+              <a:graphicData uri="http://schemas.openxmlformats.org/drawingml/2006/picture">
+                <pic:pic>
+                  <pic:nvPicPr>
+                    <pic:cNvPr id="0" name="20260902154721-staff-tracking-url-link.png"/>
+                    <pic:cNvPicPr/>
+                  </pic:nvPicPr>
+                  <pic:blipFill>
+                    <a:blip r:embed="rId17"/>
+                    <a:stretch>
+                      <a:fillRect/>
+                    </a:stretch>
+                  </pic:blipFill>
+                  <pic:spPr>
+                    <a:xfrm>
+                      <a:off x="0" y="0"/>
+                      <a:ext cx="5394960" cy="3540442"/>
+                    </a:xfrm>
+                    <a:prstGeom prst="rect"/>
+                  </pic:spPr>
+                </pic:pic>
+              </a:graphicData>
+            </a:graphic>
+          </wp:inline>
+        </w:drawing>
       </w:r>
     </w:p>
     <w:p>
@@ -2022,9 +2714,55 @@
     <w:p>
       <w:pPr>
         <w:pStyle w:val="Heading2"/>
+        <w:keepNext/>
       </w:pPr>
       <w:r>
         <w:t>7. หน้าตารางข้อมูลเต็ม</w:t>
+      </w:r>
+    </w:p>
+    <w:p>
+      <w:pPr>
+        <w:pStyle w:val="Heading3"/>
+        <w:keepNext/>
+      </w:pPr>
+      <w:r>
+        <w:t>ภาพประกอบ: หน้าตารางข้อมูลเต็ม แสดง column ข้อมูลทั้งหมด</w:t>
+      </w:r>
+    </w:p>
+    <w:p>
+      <w:r>
+        <w:drawing>
+          <wp:inline xmlns:a="http://schemas.openxmlformats.org/drawingml/2006/main" xmlns:pic="http://schemas.openxmlformats.org/drawingml/2006/picture">
+            <wp:extent cx="5394960" cy="3540442"/>
+            <wp:docPr id="16" name="Picture 16"/>
+            <wp:cNvGraphicFramePr>
+              <a:graphicFrameLocks noChangeAspect="1"/>
+            </wp:cNvGraphicFramePr>
+            <a:graphic>
+              <a:graphicData uri="http://schemas.openxmlformats.org/drawingml/2006/picture">
+                <pic:pic>
+                  <pic:nvPicPr>
+                    <pic:cNvPr id="0" name="20260902154721-staff-full-table.png"/>
+                    <pic:cNvPicPr/>
+                  </pic:nvPicPr>
+                  <pic:blipFill>
+                    <a:blip r:embed="rId18"/>
+                    <a:stretch>
+                      <a:fillRect/>
+                    </a:stretch>
+                  </pic:blipFill>
+                  <pic:spPr>
+                    <a:xfrm>
+                      <a:off x="0" y="0"/>
+                      <a:ext cx="5394960" cy="3540442"/>
+                    </a:xfrm>
+                    <a:prstGeom prst="rect"/>
+                  </pic:spPr>
+                </pic:pic>
+              </a:graphicData>
+            </a:graphic>
+          </wp:inline>
+        </w:drawing>
       </w:r>
     </w:p>
     <w:p>
@@ -2194,9 +2932,145 @@
     <w:p>
       <w:pPr>
         <w:pStyle w:val="Heading2"/>
+        <w:keepNext/>
       </w:pPr>
       <w:r>
         <w:t>8. การค้นหาและจัดเรียงในตาราง</w:t>
+      </w:r>
+    </w:p>
+    <w:p>
+      <w:pPr>
+        <w:pStyle w:val="Heading3"/>
+        <w:keepNext/>
+      </w:pPr>
+      <w:r>
+        <w:t>ภาพประกอบ: Filter header ตารางด้วยจังหวัด</w:t>
+      </w:r>
+    </w:p>
+    <w:p>
+      <w:r>
+        <w:drawing>
+          <wp:inline xmlns:a="http://schemas.openxmlformats.org/drawingml/2006/main" xmlns:pic="http://schemas.openxmlformats.org/drawingml/2006/picture">
+            <wp:extent cx="5394960" cy="3540442"/>
+            <wp:docPr id="17" name="Picture 17"/>
+            <wp:cNvGraphicFramePr>
+              <a:graphicFrameLocks noChangeAspect="1"/>
+            </wp:cNvGraphicFramePr>
+            <a:graphic>
+              <a:graphicData uri="http://schemas.openxmlformats.org/drawingml/2006/picture">
+                <pic:pic>
+                  <pic:nvPicPr>
+                    <pic:cNvPr id="0" name="20260902154721-staff-filter-province.png"/>
+                    <pic:cNvPicPr/>
+                  </pic:nvPicPr>
+                  <pic:blipFill>
+                    <a:blip r:embed="rId19"/>
+                    <a:stretch>
+                      <a:fillRect/>
+                    </a:stretch>
+                  </pic:blipFill>
+                  <pic:spPr>
+                    <a:xfrm>
+                      <a:off x="0" y="0"/>
+                      <a:ext cx="5394960" cy="3540442"/>
+                    </a:xfrm>
+                    <a:prstGeom prst="rect"/>
+                  </pic:spPr>
+                </pic:pic>
+              </a:graphicData>
+            </a:graphic>
+          </wp:inline>
+        </w:drawing>
+      </w:r>
+    </w:p>
+    <w:p>
+      <w:pPr>
+        <w:pStyle w:val="Heading3"/>
+        <w:keepNext/>
+      </w:pPr>
+      <w:r>
+        <w:t>ภาพประกอบ: Filter วันที่ส่งและวันที่ลงทะเบียนแบบช่วงเวลา</w:t>
+      </w:r>
+    </w:p>
+    <w:p>
+      <w:r>
+        <w:drawing>
+          <wp:inline xmlns:a="http://schemas.openxmlformats.org/drawingml/2006/main" xmlns:pic="http://schemas.openxmlformats.org/drawingml/2006/picture">
+            <wp:extent cx="5394960" cy="3540442"/>
+            <wp:docPr id="18" name="Picture 18"/>
+            <wp:cNvGraphicFramePr>
+              <a:graphicFrameLocks noChangeAspect="1"/>
+            </wp:cNvGraphicFramePr>
+            <a:graphic>
+              <a:graphicData uri="http://schemas.openxmlformats.org/drawingml/2006/picture">
+                <pic:pic>
+                  <pic:nvPicPr>
+                    <pic:cNvPr id="0" name="20260902154721-staff-date-range-filter.png"/>
+                    <pic:cNvPicPr/>
+                  </pic:nvPicPr>
+                  <pic:blipFill>
+                    <a:blip r:embed="rId20"/>
+                    <a:stretch>
+                      <a:fillRect/>
+                    </a:stretch>
+                  </pic:blipFill>
+                  <pic:spPr>
+                    <a:xfrm>
+                      <a:off x="0" y="0"/>
+                      <a:ext cx="5394960" cy="3540442"/>
+                    </a:xfrm>
+                    <a:prstGeom prst="rect"/>
+                  </pic:spPr>
+                </pic:pic>
+              </a:graphicData>
+            </a:graphic>
+          </wp:inline>
+        </w:drawing>
+      </w:r>
+    </w:p>
+    <w:p>
+      <w:pPr>
+        <w:pStyle w:val="Heading3"/>
+        <w:keepNext/>
+      </w:pPr>
+      <w:r>
+        <w:t>ภาพประกอบ: Sorting จาก header ตาราง</w:t>
+      </w:r>
+    </w:p>
+    <w:p>
+      <w:r>
+        <w:drawing>
+          <wp:inline xmlns:a="http://schemas.openxmlformats.org/drawingml/2006/main" xmlns:pic="http://schemas.openxmlformats.org/drawingml/2006/picture">
+            <wp:extent cx="5394960" cy="3540442"/>
+            <wp:docPr id="19" name="Picture 19"/>
+            <wp:cNvGraphicFramePr>
+              <a:graphicFrameLocks noChangeAspect="1"/>
+            </wp:cNvGraphicFramePr>
+            <a:graphic>
+              <a:graphicData uri="http://schemas.openxmlformats.org/drawingml/2006/picture">
+                <pic:pic>
+                  <pic:nvPicPr>
+                    <pic:cNvPr id="0" name="20260902154721-staff-sorting.png"/>
+                    <pic:cNvPicPr/>
+                  </pic:nvPicPr>
+                  <pic:blipFill>
+                    <a:blip r:embed="rId21"/>
+                    <a:stretch>
+                      <a:fillRect/>
+                    </a:stretch>
+                  </pic:blipFill>
+                  <pic:spPr>
+                    <a:xfrm>
+                      <a:off x="0" y="0"/>
+                      <a:ext cx="5394960" cy="3540442"/>
+                    </a:xfrm>
+                    <a:prstGeom prst="rect"/>
+                  </pic:spPr>
+                </pic:pic>
+              </a:graphicData>
+            </a:graphic>
+          </wp:inline>
+        </w:drawing>
       </w:r>
     </w:p>
     <w:p>
@@ -2325,9 +3199,55 @@
     <w:p>
       <w:pPr>
         <w:pStyle w:val="Heading2"/>
+        <w:keepNext/>
       </w:pPr>
       <w:r>
         <w:t>9. Tracking URL</w:t>
+      </w:r>
+    </w:p>
+    <w:p>
+      <w:pPr>
+        <w:pStyle w:val="Heading3"/>
+        <w:keepNext/>
+      </w:pPr>
+      <w:r>
+        <w:t>ภาพประกอบ: Tracking URL แสดงเป็น link คลิกได้</w:t>
+      </w:r>
+    </w:p>
+    <w:p>
+      <w:r>
+        <w:drawing>
+          <wp:inline xmlns:a="http://schemas.openxmlformats.org/drawingml/2006/main" xmlns:pic="http://schemas.openxmlformats.org/drawingml/2006/picture">
+            <wp:extent cx="5394960" cy="3540442"/>
+            <wp:docPr id="20" name="Picture 20"/>
+            <wp:cNvGraphicFramePr>
+              <a:graphicFrameLocks noChangeAspect="1"/>
+            </wp:cNvGraphicFramePr>
+            <a:graphic>
+              <a:graphicData uri="http://schemas.openxmlformats.org/drawingml/2006/picture">
+                <pic:pic>
+                  <pic:nvPicPr>
+                    <pic:cNvPr id="0" name="20260902154721-staff-tracking-url-link.png"/>
+                    <pic:cNvPicPr/>
+                  </pic:nvPicPr>
+                  <pic:blipFill>
+                    <a:blip r:embed="rId17"/>
+                    <a:stretch>
+                      <a:fillRect/>
+                    </a:stretch>
+                  </pic:blipFill>
+                  <pic:spPr>
+                    <a:xfrm>
+                      <a:off x="0" y="0"/>
+                      <a:ext cx="5394960" cy="3540442"/>
+                    </a:xfrm>
+                    <a:prstGeom prst="rect"/>
+                  </pic:spPr>
+                </pic:pic>
+              </a:graphicData>
+            </a:graphic>
+          </wp:inline>
+        </w:drawing>
       </w:r>
     </w:p>
     <w:p>
@@ -2373,9 +3293,55 @@
     <w:p>
       <w:pPr>
         <w:pStyle w:val="Heading2"/>
+        <w:keepNext/>
       </w:pPr>
       <w:r>
         <w:t>10. Export CSV สำหรับไปรษณีย์</w:t>
+      </w:r>
+    </w:p>
+    <w:p>
+      <w:pPr>
+        <w:pStyle w:val="Heading3"/>
+        <w:keepNext/>
+      </w:pPr>
+      <w:r>
+        <w:t>ภาพประกอบ: Export CSV จากหน้าพนักงาน</w:t>
+      </w:r>
+    </w:p>
+    <w:p>
+      <w:r>
+        <w:drawing>
+          <wp:inline xmlns:a="http://schemas.openxmlformats.org/drawingml/2006/main" xmlns:pic="http://schemas.openxmlformats.org/drawingml/2006/picture">
+            <wp:extent cx="5394960" cy="3540442"/>
+            <wp:docPr id="21" name="Picture 21"/>
+            <wp:cNvGraphicFramePr>
+              <a:graphicFrameLocks noChangeAspect="1"/>
+            </wp:cNvGraphicFramePr>
+            <a:graphic>
+              <a:graphicData uri="http://schemas.openxmlformats.org/drawingml/2006/picture">
+                <pic:pic>
+                  <pic:nvPicPr>
+                    <pic:cNvPr id="0" name="20260902154721-staff-export.png"/>
+                    <pic:cNvPicPr/>
+                  </pic:nvPicPr>
+                  <pic:blipFill>
+                    <a:blip r:embed="rId22"/>
+                    <a:stretch>
+                      <a:fillRect/>
+                    </a:stretch>
+                  </pic:blipFill>
+                  <pic:spPr>
+                    <a:xfrm>
+                      <a:off x="0" y="0"/>
+                      <a:ext cx="5394960" cy="3540442"/>
+                    </a:xfrm>
+                    <a:prstGeom prst="rect"/>
+                  </pic:spPr>
+                </pic:pic>
+              </a:graphicData>
+            </a:graphic>
+          </wp:inline>
+        </w:drawing>
       </w:r>
     </w:p>
     <w:p>
@@ -2520,9 +3486,55 @@
     <w:p>
       <w:pPr>
         <w:pStyle w:val="Heading2"/>
+        <w:keepNext/>
       </w:pPr>
       <w:r>
         <w:t>11. Import tracking กลับเข้าระบบ</w:t>
+      </w:r>
+    </w:p>
+    <w:p>
+      <w:pPr>
+        <w:pStyle w:val="Heading3"/>
+        <w:keepNext/>
+      </w:pPr>
+      <w:r>
+        <w:t>ภาพประกอบ: หน้าตารางข้อมูลเต็ม แสดง column ข้อมูลทั้งหมด</w:t>
+      </w:r>
+    </w:p>
+    <w:p>
+      <w:r>
+        <w:drawing>
+          <wp:inline xmlns:a="http://schemas.openxmlformats.org/drawingml/2006/main" xmlns:pic="http://schemas.openxmlformats.org/drawingml/2006/picture">
+            <wp:extent cx="5394960" cy="3540442"/>
+            <wp:docPr id="22" name="Picture 22"/>
+            <wp:cNvGraphicFramePr>
+              <a:graphicFrameLocks noChangeAspect="1"/>
+            </wp:cNvGraphicFramePr>
+            <a:graphic>
+              <a:graphicData uri="http://schemas.openxmlformats.org/drawingml/2006/picture">
+                <pic:pic>
+                  <pic:nvPicPr>
+                    <pic:cNvPr id="0" name="20260902154721-staff-full-table.png"/>
+                    <pic:cNvPicPr/>
+                  </pic:nvPicPr>
+                  <pic:blipFill>
+                    <a:blip r:embed="rId18"/>
+                    <a:stretch>
+                      <a:fillRect/>
+                    </a:stretch>
+                  </pic:blipFill>
+                  <pic:spPr>
+                    <a:xfrm>
+                      <a:off x="0" y="0"/>
+                      <a:ext cx="5394960" cy="3540442"/>
+                    </a:xfrm>
+                    <a:prstGeom prst="rect"/>
+                  </pic:spPr>
+                </pic:pic>
+              </a:graphicData>
+            </a:graphic>
+          </wp:inline>
+        </w:drawing>
       </w:r>
     </w:p>
     <w:p>
@@ -2769,9 +3781,55 @@
     <w:p>
       <w:pPr>
         <w:pStyle w:val="Heading2"/>
+        <w:keepNext/>
       </w:pPr>
       <w:r>
         <w:t>12. เช็คสถานะให้ลูกค้า</w:t>
+      </w:r>
+    </w:p>
+    <w:p>
+      <w:pPr>
+        <w:pStyle w:val="Heading3"/>
+        <w:keepNext/>
+      </w:pPr>
+      <w:r>
+        <w:t>ภาพประกอบ: หน้าเช็คสถานะพบเลข tracking และ Tracking URL</w:t>
+      </w:r>
+    </w:p>
+    <w:p>
+      <w:r>
+        <w:drawing>
+          <wp:inline xmlns:a="http://schemas.openxmlformats.org/drawingml/2006/main" xmlns:pic="http://schemas.openxmlformats.org/drawingml/2006/picture">
+            <wp:extent cx="5394960" cy="3540442"/>
+            <wp:docPr id="23" name="Picture 23"/>
+            <wp:cNvGraphicFramePr>
+              <a:graphicFrameLocks noChangeAspect="1"/>
+            </wp:cNvGraphicFramePr>
+            <a:graphic>
+              <a:graphicData uri="http://schemas.openxmlformats.org/drawingml/2006/picture">
+                <pic:pic>
+                  <pic:nvPicPr>
+                    <pic:cNvPr id="0" name="20260902154721-tracking-found.png"/>
+                    <pic:cNvPicPr/>
+                  </pic:nvPicPr>
+                  <pic:blipFill>
+                    <a:blip r:embed="rId13"/>
+                    <a:stretch>
+                      <a:fillRect/>
+                    </a:stretch>
+                  </pic:blipFill>
+                  <pic:spPr>
+                    <a:xfrm>
+                      <a:off x="0" y="0"/>
+                      <a:ext cx="5394960" cy="3540442"/>
+                    </a:xfrm>
+                    <a:prstGeom prst="rect"/>
+                  </pic:spPr>
+                </pic:pic>
+              </a:graphicData>
+            </a:graphic>
+          </wp:inline>
+        </w:drawing>
       </w:r>
     </w:p>
     <w:p>
@@ -2823,6 +3881,7 @@
     <w:p>
       <w:pPr>
         <w:pStyle w:val="Heading2"/>
+        <w:keepNext w:val="0"/>
       </w:pPr>
       <w:r>
         <w:t>13. แนวทางปฏิบัติเรื่องข้อมูลส่วนบุคคล</w:t>
@@ -2886,9 +3945,55 @@
     <w:p>
       <w:pPr>
         <w:pStyle w:val="Heading2"/>
+        <w:keepNext/>
       </w:pPr>
       <w:r>
         <w:t>14. ปัญหาที่พบบ่อย</w:t>
+      </w:r>
+    </w:p>
+    <w:p>
+      <w:pPr>
+        <w:pStyle w:val="Heading3"/>
+        <w:keepNext/>
+      </w:pPr>
+      <w:r>
+        <w:t>ภาพประกอบ: หน้าตารางข้อมูลเต็ม แสดง column ข้อมูลทั้งหมด</w:t>
+      </w:r>
+    </w:p>
+    <w:p>
+      <w:r>
+        <w:drawing>
+          <wp:inline xmlns:a="http://schemas.openxmlformats.org/drawingml/2006/main" xmlns:pic="http://schemas.openxmlformats.org/drawingml/2006/picture">
+            <wp:extent cx="5394960" cy="3540442"/>
+            <wp:docPr id="24" name="Picture 24"/>
+            <wp:cNvGraphicFramePr>
+              <a:graphicFrameLocks noChangeAspect="1"/>
+            </wp:cNvGraphicFramePr>
+            <a:graphic>
+              <a:graphicData uri="http://schemas.openxmlformats.org/drawingml/2006/picture">
+                <pic:pic>
+                  <pic:nvPicPr>
+                    <pic:cNvPr id="0" name="20260902154721-staff-full-table.png"/>
+                    <pic:cNvPicPr/>
+                  </pic:nvPicPr>
+                  <pic:blipFill>
+                    <a:blip r:embed="rId18"/>
+                    <a:stretch>
+                      <a:fillRect/>
+                    </a:stretch>
+                  </pic:blipFill>
+                  <pic:spPr>
+                    <a:xfrm>
+                      <a:off x="0" y="0"/>
+                      <a:ext cx="5394960" cy="3540442"/>
+                    </a:xfrm>
+                    <a:prstGeom prst="rect"/>
+                  </pic:spPr>
+                </pic:pic>
+              </a:graphicData>
+            </a:graphic>
+          </wp:inline>
+        </w:drawing>
       </w:r>
     </w:p>
     <w:p>
@@ -3052,6 +4157,7 @@
     <w:p>
       <w:pPr>
         <w:pStyle w:val="Heading1"/>
+        <w:keepNext w:val="0"/>
       </w:pPr>
       <w:r>
         <w:t>Mahosample Test Cases</w:t>
@@ -3068,6 +4174,7 @@
     <w:p>
       <w:pPr>
         <w:pStyle w:val="Heading2"/>
+        <w:keepNext w:val="0"/>
       </w:pPr>
       <w:r>
         <w:t>ขอบเขตการทดสอบ</w:t>
@@ -3175,6 +4282,7 @@
     <w:p>
       <w:pPr>
         <w:pStyle w:val="Heading2"/>
+        <w:keepNext w:val="0"/>
       </w:pPr>
       <w:r>
         <w:t>ข้อมูลทดสอบ</w:t>
@@ -3248,9 +4356,100 @@
     <w:p>
       <w:pPr>
         <w:pStyle w:val="Heading2"/>
+        <w:keepNext/>
       </w:pPr>
       <w:r>
         <w:t>TC-PUB-001 ส่งแบบฟอร์มลงทะเบียนสำเร็จ</w:t>
+      </w:r>
+    </w:p>
+    <w:p>
+      <w:pPr>
+        <w:pStyle w:val="Heading3"/>
+        <w:keepNext/>
+      </w:pPr>
+      <w:r>
+        <w:t>ภาพประกอบ: หน้าแบบฟอร์มลงทะเบียนรับตัวอย่าง มะโฮ</w:t>
+      </w:r>
+    </w:p>
+    <w:p>
+      <w:r>
+        <w:drawing>
+          <wp:inline xmlns:a="http://schemas.openxmlformats.org/drawingml/2006/main" xmlns:pic="http://schemas.openxmlformats.org/drawingml/2006/picture">
+            <wp:extent cx="5394960" cy="3540442"/>
+            <wp:docPr id="25" name="Picture 25"/>
+            <wp:cNvGraphicFramePr>
+              <a:graphicFrameLocks noChangeAspect="1"/>
+            </wp:cNvGraphicFramePr>
+            <a:graphic>
+              <a:graphicData uri="http://schemas.openxmlformats.org/drawingml/2006/picture">
+                <pic:pic>
+                  <pic:nvPicPr>
+                    <pic:cNvPr id="0" name="20260902154721-public-registration-form.png"/>
+                    <pic:cNvPicPr/>
+                  </pic:nvPicPr>
+                  <pic:blipFill>
+                    <a:blip r:embed="rId10"/>
+                    <a:stretch>
+                      <a:fillRect/>
+                    </a:stretch>
+                  </pic:blipFill>
+                  <pic:spPr>
+                    <a:xfrm>
+                      <a:off x="0" y="0"/>
+                      <a:ext cx="5394960" cy="3540442"/>
+                    </a:xfrm>
+                    <a:prstGeom prst="rect"/>
+                  </pic:spPr>
+                </pic:pic>
+              </a:graphicData>
+            </a:graphic>
+          </wp:inline>
+        </w:drawing>
+      </w:r>
+    </w:p>
+    <w:p>
+      <w:pPr>
+        <w:pStyle w:val="Heading3"/>
+        <w:keepNext/>
+      </w:pPr>
+      <w:r>
+        <w:t>ภาพประกอบ: Success card หลังส่งฟอร์ม พร้อมเลขรายการภายใน</w:t>
+      </w:r>
+    </w:p>
+    <w:p>
+      <w:r>
+        <w:drawing>
+          <wp:inline xmlns:a="http://schemas.openxmlformats.org/drawingml/2006/main" xmlns:pic="http://schemas.openxmlformats.org/drawingml/2006/picture">
+            <wp:extent cx="5394960" cy="3540442"/>
+            <wp:docPr id="26" name="Picture 26"/>
+            <wp:cNvGraphicFramePr>
+              <a:graphicFrameLocks noChangeAspect="1"/>
+            </wp:cNvGraphicFramePr>
+            <a:graphic>
+              <a:graphicData uri="http://schemas.openxmlformats.org/drawingml/2006/picture">
+                <pic:pic>
+                  <pic:nvPicPr>
+                    <pic:cNvPr id="0" name="20260902154721-public-success-card.png"/>
+                    <pic:cNvPicPr/>
+                  </pic:nvPicPr>
+                  <pic:blipFill>
+                    <a:blip r:embed="rId12"/>
+                    <a:stretch>
+                      <a:fillRect/>
+                    </a:stretch>
+                  </pic:blipFill>
+                  <pic:spPr>
+                    <a:xfrm>
+                      <a:off x="0" y="0"/>
+                      <a:ext cx="5394960" cy="3540442"/>
+                    </a:xfrm>
+                    <a:prstGeom prst="rect"/>
+                  </pic:spPr>
+                </pic:pic>
+              </a:graphicData>
+            </a:graphic>
+          </wp:inline>
+        </w:drawing>
       </w:r>
     </w:p>
     <w:p>
@@ -3475,12 +4674,58 @@
     <w:p>
       <w:pPr>
         <w:pStyle w:val="Heading2"/>
+        <w:keepNext/>
       </w:pPr>
       <w:r>
         <w:t>TC-PUB-002 ตรวจ validation เมื่อไม่กรอกช่องทางติดต่อ</w:t>
       </w:r>
     </w:p>
     <w:p>
+      <w:pPr>
+        <w:pStyle w:val="Heading3"/>
+        <w:keepNext/>
+      </w:pPr>
+      <w:r>
+        <w:t>ภาพประกอบ: Validation เมื่อไม่กรอกช่องทางติดต่อ</w:t>
+      </w:r>
+    </w:p>
+    <w:p>
+      <w:r>
+        <w:drawing>
+          <wp:inline xmlns:a="http://schemas.openxmlformats.org/drawingml/2006/main" xmlns:pic="http://schemas.openxmlformats.org/drawingml/2006/picture">
+            <wp:extent cx="5394960" cy="3540442"/>
+            <wp:docPr id="27" name="Picture 27"/>
+            <wp:cNvGraphicFramePr>
+              <a:graphicFrameLocks noChangeAspect="1"/>
+            </wp:cNvGraphicFramePr>
+            <a:graphic>
+              <a:graphicData uri="http://schemas.openxmlformats.org/drawingml/2006/picture">
+                <pic:pic>
+                  <pic:nvPicPr>
+                    <pic:cNvPr id="0" name="20260902154721-public-contact-validation.png"/>
+                    <pic:cNvPicPr/>
+                  </pic:nvPicPr>
+                  <pic:blipFill>
+                    <a:blip r:embed="rId11"/>
+                    <a:stretch>
+                      <a:fillRect/>
+                    </a:stretch>
+                  </pic:blipFill>
+                  <pic:spPr>
+                    <a:xfrm>
+                      <a:off x="0" y="0"/>
+                      <a:ext cx="5394960" cy="3540442"/>
+                    </a:xfrm>
+                    <a:prstGeom prst="rect"/>
+                  </pic:spPr>
+                </pic:pic>
+              </a:graphicData>
+            </a:graphic>
+          </wp:inline>
+        </w:drawing>
+      </w:r>
+    </w:p>
+    <w:p>
       <w:r>
         <w:rPr>
           <w:rFonts w:ascii="Aptos" w:hAnsi="Aptos" w:eastAsia="Aptos"/>
@@ -3573,12 +4818,58 @@
     <w:p>
       <w:pPr>
         <w:pStyle w:val="Heading2"/>
+        <w:keepNext/>
       </w:pPr>
       <w:r>
         <w:t>TC-PUB-003 ตรวจ validation เบอร์โทรศัพท์</w:t>
       </w:r>
     </w:p>
     <w:p>
+      <w:pPr>
+        <w:pStyle w:val="Heading3"/>
+        <w:keepNext/>
+      </w:pPr>
+      <w:r>
+        <w:t>ภาพประกอบ: Validation เมื่อไม่กรอกช่องทางติดต่อ</w:t>
+      </w:r>
+    </w:p>
+    <w:p>
+      <w:r>
+        <w:drawing>
+          <wp:inline xmlns:a="http://schemas.openxmlformats.org/drawingml/2006/main" xmlns:pic="http://schemas.openxmlformats.org/drawingml/2006/picture">
+            <wp:extent cx="5394960" cy="3540442"/>
+            <wp:docPr id="28" name="Picture 28"/>
+            <wp:cNvGraphicFramePr>
+              <a:graphicFrameLocks noChangeAspect="1"/>
+            </wp:cNvGraphicFramePr>
+            <a:graphic>
+              <a:graphicData uri="http://schemas.openxmlformats.org/drawingml/2006/picture">
+                <pic:pic>
+                  <pic:nvPicPr>
+                    <pic:cNvPr id="0" name="20260902154721-public-contact-validation.png"/>
+                    <pic:cNvPicPr/>
+                  </pic:nvPicPr>
+                  <pic:blipFill>
+                    <a:blip r:embed="rId11"/>
+                    <a:stretch>
+                      <a:fillRect/>
+                    </a:stretch>
+                  </pic:blipFill>
+                  <pic:spPr>
+                    <a:xfrm>
+                      <a:off x="0" y="0"/>
+                      <a:ext cx="5394960" cy="3540442"/>
+                    </a:xfrm>
+                    <a:prstGeom prst="rect"/>
+                  </pic:spPr>
+                </pic:pic>
+              </a:graphicData>
+            </a:graphic>
+          </wp:inline>
+        </w:drawing>
+      </w:r>
+    </w:p>
+    <w:p>
       <w:r>
         <w:rPr>
           <w:rFonts w:ascii="Aptos" w:hAnsi="Aptos" w:eastAsia="Aptos"/>
@@ -3641,12 +4932,58 @@
     <w:p>
       <w:pPr>
         <w:pStyle w:val="Heading2"/>
+        <w:keepNext/>
       </w:pPr>
       <w:r>
         <w:t>TC-PUB-004 ตรวจ validation รหัสไปรษณีย์</w:t>
       </w:r>
     </w:p>
     <w:p>
+      <w:pPr>
+        <w:pStyle w:val="Heading3"/>
+        <w:keepNext/>
+      </w:pPr>
+      <w:r>
+        <w:t>ภาพประกอบ: Validation เมื่อไม่กรอกช่องทางติดต่อ</w:t>
+      </w:r>
+    </w:p>
+    <w:p>
+      <w:r>
+        <w:drawing>
+          <wp:inline xmlns:a="http://schemas.openxmlformats.org/drawingml/2006/main" xmlns:pic="http://schemas.openxmlformats.org/drawingml/2006/picture">
+            <wp:extent cx="5394960" cy="3540442"/>
+            <wp:docPr id="29" name="Picture 29"/>
+            <wp:cNvGraphicFramePr>
+              <a:graphicFrameLocks noChangeAspect="1"/>
+            </wp:cNvGraphicFramePr>
+            <a:graphic>
+              <a:graphicData uri="http://schemas.openxmlformats.org/drawingml/2006/picture">
+                <pic:pic>
+                  <pic:nvPicPr>
+                    <pic:cNvPr id="0" name="20260902154721-public-contact-validation.png"/>
+                    <pic:cNvPicPr/>
+                  </pic:nvPicPr>
+                  <pic:blipFill>
+                    <a:blip r:embed="rId11"/>
+                    <a:stretch>
+                      <a:fillRect/>
+                    </a:stretch>
+                  </pic:blipFill>
+                  <pic:spPr>
+                    <a:xfrm>
+                      <a:off x="0" y="0"/>
+                      <a:ext cx="5394960" cy="3540442"/>
+                    </a:xfrm>
+                    <a:prstGeom prst="rect"/>
+                  </pic:spPr>
+                </pic:pic>
+              </a:graphicData>
+            </a:graphic>
+          </wp:inline>
+        </w:drawing>
+      </w:r>
+    </w:p>
+    <w:p>
       <w:r>
         <w:rPr>
           <w:rFonts w:ascii="Aptos" w:hAnsi="Aptos" w:eastAsia="Aptos"/>
@@ -3709,12 +5046,58 @@
     <w:p>
       <w:pPr>
         <w:pStyle w:val="Heading2"/>
+        <w:keepNext/>
       </w:pPr>
       <w:r>
         <w:t>TC-PUB-005 ตรวจ validation PDPA</w:t>
       </w:r>
     </w:p>
     <w:p>
+      <w:pPr>
+        <w:pStyle w:val="Heading3"/>
+        <w:keepNext/>
+      </w:pPr>
+      <w:r>
+        <w:t>ภาพประกอบ: Validation เมื่อไม่กรอกช่องทางติดต่อ</w:t>
+      </w:r>
+    </w:p>
+    <w:p>
+      <w:r>
+        <w:drawing>
+          <wp:inline xmlns:a="http://schemas.openxmlformats.org/drawingml/2006/main" xmlns:pic="http://schemas.openxmlformats.org/drawingml/2006/picture">
+            <wp:extent cx="5394960" cy="3540442"/>
+            <wp:docPr id="30" name="Picture 30"/>
+            <wp:cNvGraphicFramePr>
+              <a:graphicFrameLocks noChangeAspect="1"/>
+            </wp:cNvGraphicFramePr>
+            <a:graphic>
+              <a:graphicData uri="http://schemas.openxmlformats.org/drawingml/2006/picture">
+                <pic:pic>
+                  <pic:nvPicPr>
+                    <pic:cNvPr id="0" name="20260902154721-public-contact-validation.png"/>
+                    <pic:cNvPicPr/>
+                  </pic:nvPicPr>
+                  <pic:blipFill>
+                    <a:blip r:embed="rId11"/>
+                    <a:stretch>
+                      <a:fillRect/>
+                    </a:stretch>
+                  </pic:blipFill>
+                  <pic:spPr>
+                    <a:xfrm>
+                      <a:off x="0" y="0"/>
+                      <a:ext cx="5394960" cy="3540442"/>
+                    </a:xfrm>
+                    <a:prstGeom prst="rect"/>
+                  </pic:spPr>
+                </pic:pic>
+              </a:graphicData>
+            </a:graphic>
+          </wp:inline>
+        </w:drawing>
+      </w:r>
+    </w:p>
+    <w:p>
       <w:r>
         <w:rPr>
           <w:rFonts w:ascii="Aptos" w:hAnsi="Aptos" w:eastAsia="Aptos"/>
@@ -3788,12 +5171,58 @@
     <w:p>
       <w:pPr>
         <w:pStyle w:val="Heading2"/>
+        <w:keepNext/>
       </w:pPr>
       <w:r>
         <w:t>TC-PUB-006 ตรวจ duplicate เบอร์โทรศัพท์</w:t>
       </w:r>
     </w:p>
     <w:p>
+      <w:pPr>
+        <w:pStyle w:val="Heading3"/>
+        <w:keepNext/>
+      </w:pPr>
+      <w:r>
+        <w:t>ภาพประกอบ: Validation เมื่อไม่กรอกช่องทางติดต่อ</w:t>
+      </w:r>
+    </w:p>
+    <w:p>
+      <w:r>
+        <w:drawing>
+          <wp:inline xmlns:a="http://schemas.openxmlformats.org/drawingml/2006/main" xmlns:pic="http://schemas.openxmlformats.org/drawingml/2006/picture">
+            <wp:extent cx="5394960" cy="3540442"/>
+            <wp:docPr id="31" name="Picture 31"/>
+            <wp:cNvGraphicFramePr>
+              <a:graphicFrameLocks noChangeAspect="1"/>
+            </wp:cNvGraphicFramePr>
+            <a:graphic>
+              <a:graphicData uri="http://schemas.openxmlformats.org/drawingml/2006/picture">
+                <pic:pic>
+                  <pic:nvPicPr>
+                    <pic:cNvPr id="0" name="20260902154721-public-contact-validation.png"/>
+                    <pic:cNvPicPr/>
+                  </pic:nvPicPr>
+                  <pic:blipFill>
+                    <a:blip r:embed="rId11"/>
+                    <a:stretch>
+                      <a:fillRect/>
+                    </a:stretch>
+                  </pic:blipFill>
+                  <pic:spPr>
+                    <a:xfrm>
+                      <a:off x="0" y="0"/>
+                      <a:ext cx="5394960" cy="3540442"/>
+                    </a:xfrm>
+                    <a:prstGeom prst="rect"/>
+                  </pic:spPr>
+                </pic:pic>
+              </a:graphicData>
+            </a:graphic>
+          </wp:inline>
+        </w:drawing>
+      </w:r>
+    </w:p>
+    <w:p>
       <w:r>
         <w:rPr>
           <w:rFonts w:ascii="Aptos" w:hAnsi="Aptos" w:eastAsia="Aptos"/>
@@ -3886,12 +5315,58 @@
     <w:p>
       <w:pPr>
         <w:pStyle w:val="Heading2"/>
+        <w:keepNext/>
       </w:pPr>
       <w:r>
         <w:t>TC-PUB-007 ตรวจ duplicate ที่อยู่จัดส่ง</w:t>
       </w:r>
     </w:p>
     <w:p>
+      <w:pPr>
+        <w:pStyle w:val="Heading3"/>
+        <w:keepNext/>
+      </w:pPr>
+      <w:r>
+        <w:t>ภาพประกอบ: Validation เมื่อไม่กรอกช่องทางติดต่อ</w:t>
+      </w:r>
+    </w:p>
+    <w:p>
+      <w:r>
+        <w:drawing>
+          <wp:inline xmlns:a="http://schemas.openxmlformats.org/drawingml/2006/main" xmlns:pic="http://schemas.openxmlformats.org/drawingml/2006/picture">
+            <wp:extent cx="5394960" cy="3540442"/>
+            <wp:docPr id="32" name="Picture 32"/>
+            <wp:cNvGraphicFramePr>
+              <a:graphicFrameLocks noChangeAspect="1"/>
+            </wp:cNvGraphicFramePr>
+            <a:graphic>
+              <a:graphicData uri="http://schemas.openxmlformats.org/drawingml/2006/picture">
+                <pic:pic>
+                  <pic:nvPicPr>
+                    <pic:cNvPr id="0" name="20260902154721-public-contact-validation.png"/>
+                    <pic:cNvPicPr/>
+                  </pic:nvPicPr>
+                  <pic:blipFill>
+                    <a:blip r:embed="rId11"/>
+                    <a:stretch>
+                      <a:fillRect/>
+                    </a:stretch>
+                  </pic:blipFill>
+                  <pic:spPr>
+                    <a:xfrm>
+                      <a:off x="0" y="0"/>
+                      <a:ext cx="5394960" cy="3540442"/>
+                    </a:xfrm>
+                    <a:prstGeom prst="rect"/>
+                  </pic:spPr>
+                </pic:pic>
+              </a:graphicData>
+            </a:graphic>
+          </wp:inline>
+        </w:drawing>
+      </w:r>
+    </w:p>
+    <w:p>
       <w:r>
         <w:rPr>
           <w:rFonts w:ascii="Aptos" w:hAnsi="Aptos" w:eastAsia="Aptos"/>
@@ -3984,12 +5459,58 @@
     <w:p>
       <w:pPr>
         <w:pStyle w:val="Heading2"/>
+        <w:keepNext/>
       </w:pPr>
       <w:r>
         <w:t>TC-PUB-008 ตรวจ duplicate ทั้งเบอร์โทรศัพท์และที่อยู่จัดส่ง</w:t>
       </w:r>
     </w:p>
     <w:p>
+      <w:pPr>
+        <w:pStyle w:val="Heading3"/>
+        <w:keepNext/>
+      </w:pPr>
+      <w:r>
+        <w:t>ภาพประกอบ: Validation เมื่อไม่กรอกช่องทางติดต่อ</w:t>
+      </w:r>
+    </w:p>
+    <w:p>
+      <w:r>
+        <w:drawing>
+          <wp:inline xmlns:a="http://schemas.openxmlformats.org/drawingml/2006/main" xmlns:pic="http://schemas.openxmlformats.org/drawingml/2006/picture">
+            <wp:extent cx="5394960" cy="3540442"/>
+            <wp:docPr id="33" name="Picture 33"/>
+            <wp:cNvGraphicFramePr>
+              <a:graphicFrameLocks noChangeAspect="1"/>
+            </wp:cNvGraphicFramePr>
+            <a:graphic>
+              <a:graphicData uri="http://schemas.openxmlformats.org/drawingml/2006/picture">
+                <pic:pic>
+                  <pic:nvPicPr>
+                    <pic:cNvPr id="0" name="20260902154721-public-contact-validation.png"/>
+                    <pic:cNvPicPr/>
+                  </pic:nvPicPr>
+                  <pic:blipFill>
+                    <a:blip r:embed="rId11"/>
+                    <a:stretch>
+                      <a:fillRect/>
+                    </a:stretch>
+                  </pic:blipFill>
+                  <pic:spPr>
+                    <a:xfrm>
+                      <a:off x="0" y="0"/>
+                      <a:ext cx="5394960" cy="3540442"/>
+                    </a:xfrm>
+                    <a:prstGeom prst="rect"/>
+                  </pic:spPr>
+                </pic:pic>
+              </a:graphicData>
+            </a:graphic>
+          </wp:inline>
+        </w:drawing>
+      </w:r>
+    </w:p>
+    <w:p>
       <w:r>
         <w:rPr>
           <w:rFonts w:ascii="Aptos" w:hAnsi="Aptos" w:eastAsia="Aptos"/>
@@ -4082,9 +5603,55 @@
     <w:p>
       <w:pPr>
         <w:pStyle w:val="Heading2"/>
+        <w:keepNext/>
       </w:pPr>
       <w:r>
         <w:t>TC-TRK-001 เช็คสถานะด้วยเลข tracking</w:t>
+      </w:r>
+    </w:p>
+    <w:p>
+      <w:pPr>
+        <w:pStyle w:val="Heading3"/>
+        <w:keepNext/>
+      </w:pPr>
+      <w:r>
+        <w:t>ภาพประกอบ: หน้าเช็คสถานะพบเลข tracking และ Tracking URL</w:t>
+      </w:r>
+    </w:p>
+    <w:p>
+      <w:r>
+        <w:drawing>
+          <wp:inline xmlns:a="http://schemas.openxmlformats.org/drawingml/2006/main" xmlns:pic="http://schemas.openxmlformats.org/drawingml/2006/picture">
+            <wp:extent cx="5394960" cy="3540442"/>
+            <wp:docPr id="34" name="Picture 34"/>
+            <wp:cNvGraphicFramePr>
+              <a:graphicFrameLocks noChangeAspect="1"/>
+            </wp:cNvGraphicFramePr>
+            <a:graphic>
+              <a:graphicData uri="http://schemas.openxmlformats.org/drawingml/2006/picture">
+                <pic:pic>
+                  <pic:nvPicPr>
+                    <pic:cNvPr id="0" name="20260902154721-tracking-found.png"/>
+                    <pic:cNvPicPr/>
+                  </pic:nvPicPr>
+                  <pic:blipFill>
+                    <a:blip r:embed="rId13"/>
+                    <a:stretch>
+                      <a:fillRect/>
+                    </a:stretch>
+                  </pic:blipFill>
+                  <pic:spPr>
+                    <a:xfrm>
+                      <a:off x="0" y="0"/>
+                      <a:ext cx="5394960" cy="3540442"/>
+                    </a:xfrm>
+                    <a:prstGeom prst="rect"/>
+                  </pic:spPr>
+                </pic:pic>
+              </a:graphicData>
+            </a:graphic>
+          </wp:inline>
+        </w:drawing>
       </w:r>
     </w:p>
     <w:p>
@@ -4221,12 +5788,58 @@
     <w:p>
       <w:pPr>
         <w:pStyle w:val="Heading2"/>
+        <w:keepNext/>
       </w:pPr>
       <w:r>
         <w:t>TC-TRK-002 ไม่พบเลข tracking</w:t>
       </w:r>
     </w:p>
     <w:p>
+      <w:pPr>
+        <w:pStyle w:val="Heading3"/>
+        <w:keepNext/>
+      </w:pPr>
+      <w:r>
+        <w:t>ภาพประกอบ: หน้าเช็คสถานะเมื่อไม่พบเลข tracking</w:t>
+      </w:r>
+    </w:p>
+    <w:p>
+      <w:r>
+        <w:drawing>
+          <wp:inline xmlns:a="http://schemas.openxmlformats.org/drawingml/2006/main" xmlns:pic="http://schemas.openxmlformats.org/drawingml/2006/picture">
+            <wp:extent cx="5394960" cy="3540442"/>
+            <wp:docPr id="35" name="Picture 35"/>
+            <wp:cNvGraphicFramePr>
+              <a:graphicFrameLocks noChangeAspect="1"/>
+            </wp:cNvGraphicFramePr>
+            <a:graphic>
+              <a:graphicData uri="http://schemas.openxmlformats.org/drawingml/2006/picture">
+                <pic:pic>
+                  <pic:nvPicPr>
+                    <pic:cNvPr id="0" name="20260902154721-tracking-not-found.png"/>
+                    <pic:cNvPicPr/>
+                  </pic:nvPicPr>
+                  <pic:blipFill>
+                    <a:blip r:embed="rId14"/>
+                    <a:stretch>
+                      <a:fillRect/>
+                    </a:stretch>
+                  </pic:blipFill>
+                  <pic:spPr>
+                    <a:xfrm>
+                      <a:off x="0" y="0"/>
+                      <a:ext cx="5394960" cy="3540442"/>
+                    </a:xfrm>
+                    <a:prstGeom prst="rect"/>
+                  </pic:spPr>
+                </pic:pic>
+              </a:graphicData>
+            </a:graphic>
+          </wp:inline>
+        </w:drawing>
+      </w:r>
+    </w:p>
+    <w:p>
       <w:r>
         <w:rPr>
           <w:rFonts w:ascii="Aptos" w:hAnsi="Aptos" w:eastAsia="Aptos"/>
@@ -4289,9 +5902,55 @@
     <w:p>
       <w:pPr>
         <w:pStyle w:val="Heading2"/>
+        <w:keepNext/>
       </w:pPr>
       <w:r>
         <w:t>TC-STF-001 Login พนักงานสำเร็จ</w:t>
+      </w:r>
+    </w:p>
+    <w:p>
+      <w:pPr>
+        <w:pStyle w:val="Heading3"/>
+        <w:keepNext/>
+      </w:pPr>
+      <w:r>
+        <w:t>ภาพประกอบ: Dashboard พนักงานหลัง login</w:t>
+      </w:r>
+    </w:p>
+    <w:p>
+      <w:r>
+        <w:drawing>
+          <wp:inline xmlns:a="http://schemas.openxmlformats.org/drawingml/2006/main" xmlns:pic="http://schemas.openxmlformats.org/drawingml/2006/picture">
+            <wp:extent cx="5394960" cy="3540442"/>
+            <wp:docPr id="36" name="Picture 36"/>
+            <wp:cNvGraphicFramePr>
+              <a:graphicFrameLocks noChangeAspect="1"/>
+            </wp:cNvGraphicFramePr>
+            <a:graphic>
+              <a:graphicData uri="http://schemas.openxmlformats.org/drawingml/2006/picture">
+                <pic:pic>
+                  <pic:nvPicPr>
+                    <pic:cNvPr id="0" name="20260902154721-staff-dashboard.png"/>
+                    <pic:cNvPicPr/>
+                  </pic:nvPicPr>
+                  <pic:blipFill>
+                    <a:blip r:embed="rId15"/>
+                    <a:stretch>
+                      <a:fillRect/>
+                    </a:stretch>
+                  </pic:blipFill>
+                  <pic:spPr>
+                    <a:xfrm>
+                      <a:off x="0" y="0"/>
+                      <a:ext cx="5394960" cy="3540442"/>
+                    </a:xfrm>
+                    <a:prstGeom prst="rect"/>
+                  </pic:spPr>
+                </pic:pic>
+              </a:graphicData>
+            </a:graphic>
+          </wp:inline>
+        </w:drawing>
       </w:r>
     </w:p>
     <w:p>
@@ -4395,6 +6054,7 @@
     <w:p>
       <w:pPr>
         <w:pStyle w:val="Heading2"/>
+        <w:keepNext w:val="0"/>
       </w:pPr>
       <w:r>
         <w:t>TC-STF-002 ป้องกันการเข้าถึงข้อมูลพนักงานโดยไม่ login</w:t>
@@ -4463,9 +6123,55 @@
     <w:p>
       <w:pPr>
         <w:pStyle w:val="Heading2"/>
+        <w:keepNext/>
       </w:pPr>
       <w:r>
         <w:t>TC-STF-003 ดู Dashboard พนักงาน</w:t>
+      </w:r>
+    </w:p>
+    <w:p>
+      <w:pPr>
+        <w:pStyle w:val="Heading3"/>
+        <w:keepNext/>
+      </w:pPr>
+      <w:r>
+        <w:t>ภาพประกอบ: Dashboard พนักงานหลัง login</w:t>
+      </w:r>
+    </w:p>
+    <w:p>
+      <w:r>
+        <w:drawing>
+          <wp:inline xmlns:a="http://schemas.openxmlformats.org/drawingml/2006/main" xmlns:pic="http://schemas.openxmlformats.org/drawingml/2006/picture">
+            <wp:extent cx="5394960" cy="3540442"/>
+            <wp:docPr id="37" name="Picture 37"/>
+            <wp:cNvGraphicFramePr>
+              <a:graphicFrameLocks noChangeAspect="1"/>
+            </wp:cNvGraphicFramePr>
+            <a:graphic>
+              <a:graphicData uri="http://schemas.openxmlformats.org/drawingml/2006/picture">
+                <pic:pic>
+                  <pic:nvPicPr>
+                    <pic:cNvPr id="0" name="20260902154721-staff-dashboard.png"/>
+                    <pic:cNvPicPr/>
+                  </pic:nvPicPr>
+                  <pic:blipFill>
+                    <a:blip r:embed="rId15"/>
+                    <a:stretch>
+                      <a:fillRect/>
+                    </a:stretch>
+                  </pic:blipFill>
+                  <pic:spPr>
+                    <a:xfrm>
+                      <a:off x="0" y="0"/>
+                      <a:ext cx="5394960" cy="3540442"/>
+                    </a:xfrm>
+                    <a:prstGeom prst="rect"/>
+                  </pic:spPr>
+                </pic:pic>
+              </a:graphicData>
+            </a:graphic>
+          </wp:inline>
+        </w:drawing>
       </w:r>
     </w:p>
     <w:p>
@@ -4550,9 +6256,55 @@
     <w:p>
       <w:pPr>
         <w:pStyle w:val="Heading2"/>
+        <w:keepNext/>
       </w:pPr>
       <w:r>
         <w:t>TC-STF-004 บันทึกคำขอ</w:t>
+      </w:r>
+    </w:p>
+    <w:p>
+      <w:pPr>
+        <w:pStyle w:val="Heading3"/>
+        <w:keepNext/>
+      </w:pPr>
+      <w:r>
+        <w:t>ภาพประกอบ: Drawer รายละเอียด พร้อมบันทึกคำขอและอัปเดตขนส่ง</w:t>
+      </w:r>
+    </w:p>
+    <w:p>
+      <w:r>
+        <w:drawing>
+          <wp:inline xmlns:a="http://schemas.openxmlformats.org/drawingml/2006/main" xmlns:pic="http://schemas.openxmlformats.org/drawingml/2006/picture">
+            <wp:extent cx="5394960" cy="3540442"/>
+            <wp:docPr id="38" name="Picture 38"/>
+            <wp:cNvGraphicFramePr>
+              <a:graphicFrameLocks noChangeAspect="1"/>
+            </wp:cNvGraphicFramePr>
+            <a:graphic>
+              <a:graphicData uri="http://schemas.openxmlformats.org/drawingml/2006/picture">
+                <pic:pic>
+                  <pic:nvPicPr>
+                    <pic:cNvPr id="0" name="20260902154721-staff-detail-drawer.png"/>
+                    <pic:cNvPicPr/>
+                  </pic:nvPicPr>
+                  <pic:blipFill>
+                    <a:blip r:embed="rId16"/>
+                    <a:stretch>
+                      <a:fillRect/>
+                    </a:stretch>
+                  </pic:blipFill>
+                  <pic:spPr>
+                    <a:xfrm>
+                      <a:off x="0" y="0"/>
+                      <a:ext cx="5394960" cy="3540442"/>
+                    </a:xfrm>
+                    <a:prstGeom prst="rect"/>
+                  </pic:spPr>
+                </pic:pic>
+              </a:graphicData>
+            </a:graphic>
+          </wp:inline>
+        </w:drawing>
       </w:r>
     </w:p>
     <w:p>
@@ -4678,9 +6430,55 @@
     <w:p>
       <w:pPr>
         <w:pStyle w:val="Heading2"/>
+        <w:keepNext/>
       </w:pPr>
       <w:r>
         <w:t>TC-STF-005 อัปเดตขนส่ง</w:t>
+      </w:r>
+    </w:p>
+    <w:p>
+      <w:pPr>
+        <w:pStyle w:val="Heading3"/>
+        <w:keepNext/>
+      </w:pPr>
+      <w:r>
+        <w:t>ภาพประกอบ: Drawer รายละเอียด พร้อมบันทึกคำขอและอัปเดตขนส่ง</w:t>
+      </w:r>
+    </w:p>
+    <w:p>
+      <w:r>
+        <w:drawing>
+          <wp:inline xmlns:a="http://schemas.openxmlformats.org/drawingml/2006/main" xmlns:pic="http://schemas.openxmlformats.org/drawingml/2006/picture">
+            <wp:extent cx="5394960" cy="3540442"/>
+            <wp:docPr id="39" name="Picture 39"/>
+            <wp:cNvGraphicFramePr>
+              <a:graphicFrameLocks noChangeAspect="1"/>
+            </wp:cNvGraphicFramePr>
+            <a:graphic>
+              <a:graphicData uri="http://schemas.openxmlformats.org/drawingml/2006/picture">
+                <pic:pic>
+                  <pic:nvPicPr>
+                    <pic:cNvPr id="0" name="20260902154721-staff-detail-drawer.png"/>
+                    <pic:cNvPicPr/>
+                  </pic:nvPicPr>
+                  <pic:blipFill>
+                    <a:blip r:embed="rId16"/>
+                    <a:stretch>
+                      <a:fillRect/>
+                    </a:stretch>
+                  </pic:blipFill>
+                  <pic:spPr>
+                    <a:xfrm>
+                      <a:off x="0" y="0"/>
+                      <a:ext cx="5394960" cy="3540442"/>
+                    </a:xfrm>
+                    <a:prstGeom prst="rect"/>
+                  </pic:spPr>
+                </pic:pic>
+              </a:graphicData>
+            </a:graphic>
+          </wp:inline>
+        </w:drawing>
       </w:r>
     </w:p>
     <w:p>
@@ -4839,9 +6637,100 @@
     <w:p>
       <w:pPr>
         <w:pStyle w:val="Heading2"/>
+        <w:keepNext/>
       </w:pPr>
       <w:r>
         <w:t>TC-STF-006 ตารางข้อมูลเต็ม แสดงข้อมูลและเปิดรายละเอียด</w:t>
+      </w:r>
+    </w:p>
+    <w:p>
+      <w:pPr>
+        <w:pStyle w:val="Heading3"/>
+        <w:keepNext/>
+      </w:pPr>
+      <w:r>
+        <w:t>ภาพประกอบ: หน้าตารางข้อมูลเต็ม แสดง column ข้อมูลทั้งหมด</w:t>
+      </w:r>
+    </w:p>
+    <w:p>
+      <w:r>
+        <w:drawing>
+          <wp:inline xmlns:a="http://schemas.openxmlformats.org/drawingml/2006/main" xmlns:pic="http://schemas.openxmlformats.org/drawingml/2006/picture">
+            <wp:extent cx="5394960" cy="3540442"/>
+            <wp:docPr id="40" name="Picture 40"/>
+            <wp:cNvGraphicFramePr>
+              <a:graphicFrameLocks noChangeAspect="1"/>
+            </wp:cNvGraphicFramePr>
+            <a:graphic>
+              <a:graphicData uri="http://schemas.openxmlformats.org/drawingml/2006/picture">
+                <pic:pic>
+                  <pic:nvPicPr>
+                    <pic:cNvPr id="0" name="20260902154721-staff-full-table.png"/>
+                    <pic:cNvPicPr/>
+                  </pic:nvPicPr>
+                  <pic:blipFill>
+                    <a:blip r:embed="rId18"/>
+                    <a:stretch>
+                      <a:fillRect/>
+                    </a:stretch>
+                  </pic:blipFill>
+                  <pic:spPr>
+                    <a:xfrm>
+                      <a:off x="0" y="0"/>
+                      <a:ext cx="5394960" cy="3540442"/>
+                    </a:xfrm>
+                    <a:prstGeom prst="rect"/>
+                  </pic:spPr>
+                </pic:pic>
+              </a:graphicData>
+            </a:graphic>
+          </wp:inline>
+        </w:drawing>
+      </w:r>
+    </w:p>
+    <w:p>
+      <w:pPr>
+        <w:pStyle w:val="Heading3"/>
+        <w:keepNext/>
+      </w:pPr>
+      <w:r>
+        <w:t>ภาพประกอบ: Drawer รายละเอียด พร้อมบันทึกคำขอและอัปเดตขนส่ง</w:t>
+      </w:r>
+    </w:p>
+    <w:p>
+      <w:r>
+        <w:drawing>
+          <wp:inline xmlns:a="http://schemas.openxmlformats.org/drawingml/2006/main" xmlns:pic="http://schemas.openxmlformats.org/drawingml/2006/picture">
+            <wp:extent cx="5394960" cy="3540442"/>
+            <wp:docPr id="41" name="Picture 41"/>
+            <wp:cNvGraphicFramePr>
+              <a:graphicFrameLocks noChangeAspect="1"/>
+            </wp:cNvGraphicFramePr>
+            <a:graphic>
+              <a:graphicData uri="http://schemas.openxmlformats.org/drawingml/2006/picture">
+                <pic:pic>
+                  <pic:nvPicPr>
+                    <pic:cNvPr id="0" name="20260902154721-staff-detail-drawer.png"/>
+                    <pic:cNvPicPr/>
+                  </pic:nvPicPr>
+                  <pic:blipFill>
+                    <a:blip r:embed="rId16"/>
+                    <a:stretch>
+                      <a:fillRect/>
+                    </a:stretch>
+                  </pic:blipFill>
+                  <pic:spPr>
+                    <a:xfrm>
+                      <a:off x="0" y="0"/>
+                      <a:ext cx="5394960" cy="3540442"/>
+                    </a:xfrm>
+                    <a:prstGeom prst="rect"/>
+                  </pic:spPr>
+                </pic:pic>
+              </a:graphicData>
+            </a:graphic>
+          </wp:inline>
+        </w:drawing>
       </w:r>
     </w:p>
     <w:p>
@@ -4937,9 +6826,55 @@
     <w:p>
       <w:pPr>
         <w:pStyle w:val="Heading2"/>
+        <w:keepNext/>
       </w:pPr>
       <w:r>
         <w:t>TC-STF-007 Sorting ใน header ตาราง</w:t>
+      </w:r>
+    </w:p>
+    <w:p>
+      <w:pPr>
+        <w:pStyle w:val="Heading3"/>
+        <w:keepNext/>
+      </w:pPr>
+      <w:r>
+        <w:t>ภาพประกอบ: Sorting จาก header ตาราง</w:t>
+      </w:r>
+    </w:p>
+    <w:p>
+      <w:r>
+        <w:drawing>
+          <wp:inline xmlns:a="http://schemas.openxmlformats.org/drawingml/2006/main" xmlns:pic="http://schemas.openxmlformats.org/drawingml/2006/picture">
+            <wp:extent cx="5394960" cy="3540442"/>
+            <wp:docPr id="42" name="Picture 42"/>
+            <wp:cNvGraphicFramePr>
+              <a:graphicFrameLocks noChangeAspect="1"/>
+            </wp:cNvGraphicFramePr>
+            <a:graphic>
+              <a:graphicData uri="http://schemas.openxmlformats.org/drawingml/2006/picture">
+                <pic:pic>
+                  <pic:nvPicPr>
+                    <pic:cNvPr id="0" name="20260902154721-staff-sorting.png"/>
+                    <pic:cNvPicPr/>
+                  </pic:nvPicPr>
+                  <pic:blipFill>
+                    <a:blip r:embed="rId21"/>
+                    <a:stretch>
+                      <a:fillRect/>
+                    </a:stretch>
+                  </pic:blipFill>
+                  <pic:spPr>
+                    <a:xfrm>
+                      <a:off x="0" y="0"/>
+                      <a:ext cx="5394960" cy="3540442"/>
+                    </a:xfrm>
+                    <a:prstGeom prst="rect"/>
+                  </pic:spPr>
+                </pic:pic>
+              </a:graphicData>
+            </a:graphic>
+          </wp:inline>
+        </w:drawing>
       </w:r>
     </w:p>
     <w:p>
@@ -5035,9 +6970,55 @@
     <w:p>
       <w:pPr>
         <w:pStyle w:val="Heading2"/>
+        <w:keepNext/>
       </w:pPr>
       <w:r>
         <w:t>TC-STF-008 Filter ใน header ตาราง</w:t>
+      </w:r>
+    </w:p>
+    <w:p>
+      <w:pPr>
+        <w:pStyle w:val="Heading3"/>
+        <w:keepNext/>
+      </w:pPr>
+      <w:r>
+        <w:t>ภาพประกอบ: Filter header ตารางด้วยจังหวัด</w:t>
+      </w:r>
+    </w:p>
+    <w:p>
+      <w:r>
+        <w:drawing>
+          <wp:inline xmlns:a="http://schemas.openxmlformats.org/drawingml/2006/main" xmlns:pic="http://schemas.openxmlformats.org/drawingml/2006/picture">
+            <wp:extent cx="5394960" cy="3540442"/>
+            <wp:docPr id="43" name="Picture 43"/>
+            <wp:cNvGraphicFramePr>
+              <a:graphicFrameLocks noChangeAspect="1"/>
+            </wp:cNvGraphicFramePr>
+            <a:graphic>
+              <a:graphicData uri="http://schemas.openxmlformats.org/drawingml/2006/picture">
+                <pic:pic>
+                  <pic:nvPicPr>
+                    <pic:cNvPr id="0" name="20260902154721-staff-filter-province.png"/>
+                    <pic:cNvPicPr/>
+                  </pic:nvPicPr>
+                  <pic:blipFill>
+                    <a:blip r:embed="rId19"/>
+                    <a:stretch>
+                      <a:fillRect/>
+                    </a:stretch>
+                  </pic:blipFill>
+                  <pic:spPr>
+                    <a:xfrm>
+                      <a:off x="0" y="0"/>
+                      <a:ext cx="5394960" cy="3540442"/>
+                    </a:xfrm>
+                    <a:prstGeom prst="rect"/>
+                  </pic:spPr>
+                </pic:pic>
+              </a:graphicData>
+            </a:graphic>
+          </wp:inline>
+        </w:drawing>
       </w:r>
     </w:p>
     <w:p>
@@ -5147,9 +7128,55 @@
     <w:p>
       <w:pPr>
         <w:pStyle w:val="Heading2"/>
+        <w:keepNext/>
       </w:pPr>
       <w:r>
         <w:t>TC-STF-009 Filter วันที่ส่งแบบช่วงเวลา</w:t>
+      </w:r>
+    </w:p>
+    <w:p>
+      <w:pPr>
+        <w:pStyle w:val="Heading3"/>
+        <w:keepNext/>
+      </w:pPr>
+      <w:r>
+        <w:t>ภาพประกอบ: Filter วันที่ส่งและวันที่ลงทะเบียนแบบช่วงเวลา</w:t>
+      </w:r>
+    </w:p>
+    <w:p>
+      <w:r>
+        <w:drawing>
+          <wp:inline xmlns:a="http://schemas.openxmlformats.org/drawingml/2006/main" xmlns:pic="http://schemas.openxmlformats.org/drawingml/2006/picture">
+            <wp:extent cx="5394960" cy="3540442"/>
+            <wp:docPr id="44" name="Picture 44"/>
+            <wp:cNvGraphicFramePr>
+              <a:graphicFrameLocks noChangeAspect="1"/>
+            </wp:cNvGraphicFramePr>
+            <a:graphic>
+              <a:graphicData uri="http://schemas.openxmlformats.org/drawingml/2006/picture">
+                <pic:pic>
+                  <pic:nvPicPr>
+                    <pic:cNvPr id="0" name="20260902154721-staff-date-range-filter.png"/>
+                    <pic:cNvPicPr/>
+                  </pic:nvPicPr>
+                  <pic:blipFill>
+                    <a:blip r:embed="rId20"/>
+                    <a:stretch>
+                      <a:fillRect/>
+                    </a:stretch>
+                  </pic:blipFill>
+                  <pic:spPr>
+                    <a:xfrm>
+                      <a:off x="0" y="0"/>
+                      <a:ext cx="5394960" cy="3540442"/>
+                    </a:xfrm>
+                    <a:prstGeom prst="rect"/>
+                  </pic:spPr>
+                </pic:pic>
+              </a:graphicData>
+            </a:graphic>
+          </wp:inline>
+        </w:drawing>
       </w:r>
     </w:p>
     <w:p>
@@ -5250,9 +7277,55 @@
     <w:p>
       <w:pPr>
         <w:pStyle w:val="Heading2"/>
+        <w:keepNext/>
       </w:pPr>
       <w:r>
         <w:t>TC-STF-010 Filter วันที่ลงทะเบียนแบบช่วงเวลา</w:t>
+      </w:r>
+    </w:p>
+    <w:p>
+      <w:pPr>
+        <w:pStyle w:val="Heading3"/>
+        <w:keepNext/>
+      </w:pPr>
+      <w:r>
+        <w:t>ภาพประกอบ: Filter วันที่ส่งและวันที่ลงทะเบียนแบบช่วงเวลา</w:t>
+      </w:r>
+    </w:p>
+    <w:p>
+      <w:r>
+        <w:drawing>
+          <wp:inline xmlns:a="http://schemas.openxmlformats.org/drawingml/2006/main" xmlns:pic="http://schemas.openxmlformats.org/drawingml/2006/picture">
+            <wp:extent cx="5394960" cy="3540442"/>
+            <wp:docPr id="45" name="Picture 45"/>
+            <wp:cNvGraphicFramePr>
+              <a:graphicFrameLocks noChangeAspect="1"/>
+            </wp:cNvGraphicFramePr>
+            <a:graphic>
+              <a:graphicData uri="http://schemas.openxmlformats.org/drawingml/2006/picture">
+                <pic:pic>
+                  <pic:nvPicPr>
+                    <pic:cNvPr id="0" name="20260902154721-staff-date-range-filter.png"/>
+                    <pic:cNvPicPr/>
+                  </pic:nvPicPr>
+                  <pic:blipFill>
+                    <a:blip r:embed="rId20"/>
+                    <a:stretch>
+                      <a:fillRect/>
+                    </a:stretch>
+                  </pic:blipFill>
+                  <pic:spPr>
+                    <a:xfrm>
+                      <a:off x="0" y="0"/>
+                      <a:ext cx="5394960" cy="3540442"/>
+                    </a:xfrm>
+                    <a:prstGeom prst="rect"/>
+                  </pic:spPr>
+                </pic:pic>
+              </a:graphicData>
+            </a:graphic>
+          </wp:inline>
+        </w:drawing>
       </w:r>
     </w:p>
     <w:p>
@@ -5353,9 +7426,55 @@
     <w:p>
       <w:pPr>
         <w:pStyle w:val="Heading2"/>
+        <w:keepNext/>
       </w:pPr>
       <w:r>
         <w:t>TC-STF-011 แสดงผลครั้งละ 100 รายการ</w:t>
+      </w:r>
+    </w:p>
+    <w:p>
+      <w:pPr>
+        <w:pStyle w:val="Heading3"/>
+        <w:keepNext/>
+      </w:pPr>
+      <w:r>
+        <w:t>ภาพประกอบ: หน้าตารางข้อมูลเต็ม แสดง column ข้อมูลทั้งหมด</w:t>
+      </w:r>
+    </w:p>
+    <w:p>
+      <w:r>
+        <w:drawing>
+          <wp:inline xmlns:a="http://schemas.openxmlformats.org/drawingml/2006/main" xmlns:pic="http://schemas.openxmlformats.org/drawingml/2006/picture">
+            <wp:extent cx="5394960" cy="3540442"/>
+            <wp:docPr id="46" name="Picture 46"/>
+            <wp:cNvGraphicFramePr>
+              <a:graphicFrameLocks noChangeAspect="1"/>
+            </wp:cNvGraphicFramePr>
+            <a:graphic>
+              <a:graphicData uri="http://schemas.openxmlformats.org/drawingml/2006/picture">
+                <pic:pic>
+                  <pic:nvPicPr>
+                    <pic:cNvPr id="0" name="20260902154721-staff-full-table.png"/>
+                    <pic:cNvPicPr/>
+                  </pic:nvPicPr>
+                  <pic:blipFill>
+                    <a:blip r:embed="rId18"/>
+                    <a:stretch>
+                      <a:fillRect/>
+                    </a:stretch>
+                  </pic:blipFill>
+                  <pic:spPr>
+                    <a:xfrm>
+                      <a:off x="0" y="0"/>
+                      <a:ext cx="5394960" cy="3540442"/>
+                    </a:xfrm>
+                    <a:prstGeom prst="rect"/>
+                  </pic:spPr>
+                </pic:pic>
+              </a:graphicData>
+            </a:graphic>
+          </wp:inline>
+        </w:drawing>
       </w:r>
     </w:p>
     <w:p>
@@ -5448,9 +7567,55 @@
     <w:p>
       <w:pPr>
         <w:pStyle w:val="Heading2"/>
+        <w:keepNext/>
       </w:pPr>
       <w:r>
         <w:t>TC-STF-012 Tracking URL คลิกได้</w:t>
+      </w:r>
+    </w:p>
+    <w:p>
+      <w:pPr>
+        <w:pStyle w:val="Heading3"/>
+        <w:keepNext/>
+      </w:pPr>
+      <w:r>
+        <w:t>ภาพประกอบ: Tracking URL แสดงเป็น link คลิกได้</w:t>
+      </w:r>
+    </w:p>
+    <w:p>
+      <w:r>
+        <w:drawing>
+          <wp:inline xmlns:a="http://schemas.openxmlformats.org/drawingml/2006/main" xmlns:pic="http://schemas.openxmlformats.org/drawingml/2006/picture">
+            <wp:extent cx="5394960" cy="3540442"/>
+            <wp:docPr id="47" name="Picture 47"/>
+            <wp:cNvGraphicFramePr>
+              <a:graphicFrameLocks noChangeAspect="1"/>
+            </wp:cNvGraphicFramePr>
+            <a:graphic>
+              <a:graphicData uri="http://schemas.openxmlformats.org/drawingml/2006/picture">
+                <pic:pic>
+                  <pic:nvPicPr>
+                    <pic:cNvPr id="0" name="20260902154721-staff-tracking-url-link.png"/>
+                    <pic:cNvPicPr/>
+                  </pic:nvPicPr>
+                  <pic:blipFill>
+                    <a:blip r:embed="rId17"/>
+                    <a:stretch>
+                      <a:fillRect/>
+                    </a:stretch>
+                  </pic:blipFill>
+                  <pic:spPr>
+                    <a:xfrm>
+                      <a:off x="0" y="0"/>
+                      <a:ext cx="5394960" cy="3540442"/>
+                    </a:xfrm>
+                    <a:prstGeom prst="rect"/>
+                  </pic:spPr>
+                </pic:pic>
+              </a:graphicData>
+            </a:graphic>
+          </wp:inline>
+        </w:drawing>
       </w:r>
     </w:p>
     <w:p>
@@ -5573,9 +7738,55 @@
     <w:p>
       <w:pPr>
         <w:pStyle w:val="Heading2"/>
+        <w:keepNext/>
       </w:pPr>
       <w:r>
         <w:t>TC-EXP-001 Export CSV สำหรับไปรษณีย์</w:t>
+      </w:r>
+    </w:p>
+    <w:p>
+      <w:pPr>
+        <w:pStyle w:val="Heading3"/>
+        <w:keepNext/>
+      </w:pPr>
+      <w:r>
+        <w:t>ภาพประกอบ: Export CSV จากหน้าพนักงาน</w:t>
+      </w:r>
+    </w:p>
+    <w:p>
+      <w:r>
+        <w:drawing>
+          <wp:inline xmlns:a="http://schemas.openxmlformats.org/drawingml/2006/main" xmlns:pic="http://schemas.openxmlformats.org/drawingml/2006/picture">
+            <wp:extent cx="5394960" cy="3540442"/>
+            <wp:docPr id="48" name="Picture 48"/>
+            <wp:cNvGraphicFramePr>
+              <a:graphicFrameLocks noChangeAspect="1"/>
+            </wp:cNvGraphicFramePr>
+            <a:graphic>
+              <a:graphicData uri="http://schemas.openxmlformats.org/drawingml/2006/picture">
+                <pic:pic>
+                  <pic:nvPicPr>
+                    <pic:cNvPr id="0" name="20260902154721-staff-export.png"/>
+                    <pic:cNvPicPr/>
+                  </pic:nvPicPr>
+                  <pic:blipFill>
+                    <a:blip r:embed="rId22"/>
+                    <a:stretch>
+                      <a:fillRect/>
+                    </a:stretch>
+                  </pic:blipFill>
+                  <pic:spPr>
+                    <a:xfrm>
+                      <a:off x="0" y="0"/>
+                      <a:ext cx="5394960" cy="3540442"/>
+                    </a:xfrm>
+                    <a:prstGeom prst="rect"/>
+                  </pic:spPr>
+                </pic:pic>
+              </a:graphicData>
+            </a:graphic>
+          </wp:inline>
+        </w:drawing>
       </w:r>
     </w:p>
     <w:p>
@@ -5725,9 +7936,55 @@
     <w:p>
       <w:pPr>
         <w:pStyle w:val="Heading2"/>
+        <w:keepNext/>
       </w:pPr>
       <w:r>
         <w:t>TC-EXP-002 Export CSV จากตารางข้อมูลเต็มตาม filter</w:t>
+      </w:r>
+    </w:p>
+    <w:p>
+      <w:pPr>
+        <w:pStyle w:val="Heading3"/>
+        <w:keepNext/>
+      </w:pPr>
+      <w:r>
+        <w:t>ภาพประกอบ: Export CSV จากหน้าพนักงาน</w:t>
+      </w:r>
+    </w:p>
+    <w:p>
+      <w:r>
+        <w:drawing>
+          <wp:inline xmlns:a="http://schemas.openxmlformats.org/drawingml/2006/main" xmlns:pic="http://schemas.openxmlformats.org/drawingml/2006/picture">
+            <wp:extent cx="5394960" cy="3540442"/>
+            <wp:docPr id="49" name="Picture 49"/>
+            <wp:cNvGraphicFramePr>
+              <a:graphicFrameLocks noChangeAspect="1"/>
+            </wp:cNvGraphicFramePr>
+            <a:graphic>
+              <a:graphicData uri="http://schemas.openxmlformats.org/drawingml/2006/picture">
+                <pic:pic>
+                  <pic:nvPicPr>
+                    <pic:cNvPr id="0" name="20260902154721-staff-export.png"/>
+                    <pic:cNvPicPr/>
+                  </pic:nvPicPr>
+                  <pic:blipFill>
+                    <a:blip r:embed="rId22"/>
+                    <a:stretch>
+                      <a:fillRect/>
+                    </a:stretch>
+                  </pic:blipFill>
+                  <pic:spPr>
+                    <a:xfrm>
+                      <a:off x="0" y="0"/>
+                      <a:ext cx="5394960" cy="3540442"/>
+                    </a:xfrm>
+                    <a:prstGeom prst="rect"/>
+                  </pic:spPr>
+                </pic:pic>
+              </a:graphicData>
+            </a:graphic>
+          </wp:inline>
+        </w:drawing>
       </w:r>
     </w:p>
     <w:p>
@@ -5839,9 +8096,55 @@
     <w:p>
       <w:pPr>
         <w:pStyle w:val="Heading2"/>
+        <w:keepNext/>
       </w:pPr>
       <w:r>
         <w:t>TC-IMP-001 Import tracking จาก CSV</w:t>
+      </w:r>
+    </w:p>
+    <w:p>
+      <w:pPr>
+        <w:pStyle w:val="Heading3"/>
+        <w:keepNext/>
+      </w:pPr>
+      <w:r>
+        <w:t>ภาพประกอบ: หน้าตารางข้อมูลเต็ม แสดง column ข้อมูลทั้งหมด</w:t>
+      </w:r>
+    </w:p>
+    <w:p>
+      <w:r>
+        <w:drawing>
+          <wp:inline xmlns:a="http://schemas.openxmlformats.org/drawingml/2006/main" xmlns:pic="http://schemas.openxmlformats.org/drawingml/2006/picture">
+            <wp:extent cx="5394960" cy="3540442"/>
+            <wp:docPr id="50" name="Picture 50"/>
+            <wp:cNvGraphicFramePr>
+              <a:graphicFrameLocks noChangeAspect="1"/>
+            </wp:cNvGraphicFramePr>
+            <a:graphic>
+              <a:graphicData uri="http://schemas.openxmlformats.org/drawingml/2006/picture">
+                <pic:pic>
+                  <pic:nvPicPr>
+                    <pic:cNvPr id="0" name="20260902154721-staff-full-table.png"/>
+                    <pic:cNvPicPr/>
+                  </pic:nvPicPr>
+                  <pic:blipFill>
+                    <a:blip r:embed="rId18"/>
+                    <a:stretch>
+                      <a:fillRect/>
+                    </a:stretch>
+                  </pic:blipFill>
+                  <pic:spPr>
+                    <a:xfrm>
+                      <a:off x="0" y="0"/>
+                      <a:ext cx="5394960" cy="3540442"/>
+                    </a:xfrm>
+                    <a:prstGeom prst="rect"/>
+                  </pic:spPr>
+                </pic:pic>
+              </a:graphicData>
+            </a:graphic>
+          </wp:inline>
+        </w:drawing>
       </w:r>
     </w:p>
     <w:p>
@@ -6006,9 +8309,55 @@
     <w:p>
       <w:pPr>
         <w:pStyle w:val="Heading2"/>
+        <w:keepNext/>
       </w:pPr>
       <w:r>
         <w:t>TC-IMP-002 Import tracking จากไฟล์ KEX XLSX</w:t>
+      </w:r>
+    </w:p>
+    <w:p>
+      <w:pPr>
+        <w:pStyle w:val="Heading3"/>
+        <w:keepNext/>
+      </w:pPr>
+      <w:r>
+        <w:t>ภาพประกอบ: หน้าตารางข้อมูลเต็ม แสดง column ข้อมูลทั้งหมด</w:t>
+      </w:r>
+    </w:p>
+    <w:p>
+      <w:r>
+        <w:drawing>
+          <wp:inline xmlns:a="http://schemas.openxmlformats.org/drawingml/2006/main" xmlns:pic="http://schemas.openxmlformats.org/drawingml/2006/picture">
+            <wp:extent cx="5394960" cy="3540442"/>
+            <wp:docPr id="51" name="Picture 51"/>
+            <wp:cNvGraphicFramePr>
+              <a:graphicFrameLocks noChangeAspect="1"/>
+            </wp:cNvGraphicFramePr>
+            <a:graphic>
+              <a:graphicData uri="http://schemas.openxmlformats.org/drawingml/2006/picture">
+                <pic:pic>
+                  <pic:nvPicPr>
+                    <pic:cNvPr id="0" name="20260902154721-staff-full-table.png"/>
+                    <pic:cNvPicPr/>
+                  </pic:nvPicPr>
+                  <pic:blipFill>
+                    <a:blip r:embed="rId18"/>
+                    <a:stretch>
+                      <a:fillRect/>
+                    </a:stretch>
+                  </pic:blipFill>
+                  <pic:spPr>
+                    <a:xfrm>
+                      <a:off x="0" y="0"/>
+                      <a:ext cx="5394960" cy="3540442"/>
+                    </a:xfrm>
+                    <a:prstGeom prst="rect"/>
+                  </pic:spPr>
+                </pic:pic>
+              </a:graphicData>
+            </a:graphic>
+          </wp:inline>
+        </w:drawing>
       </w:r>
     </w:p>
     <w:p>
@@ -6198,6 +8547,7 @@
     <w:p>
       <w:pPr>
         <w:pStyle w:val="Heading2"/>
+        <w:keepNext w:val="0"/>
       </w:pPr>
       <w:r>
         <w:t>TC-ADM-001 ลบรายการโดย admin</w:t>
@@ -8475,7 +10825,7 @@
         <w:drawing>
           <wp:inline xmlns:a="http://schemas.openxmlformats.org/drawingml/2006/main" xmlns:pic="http://schemas.openxmlformats.org/drawingml/2006/picture">
             <wp:extent cx="5852160" cy="3840480"/>
-            <wp:docPr id="1" name="Picture 1"/>
+            <wp:docPr id="52" name="Picture 52"/>
             <wp:cNvGraphicFramePr>
               <a:graphicFrameLocks noChangeAspect="1"/>
             </wp:cNvGraphicFramePr>
@@ -8520,7 +10870,7 @@
         <w:drawing>
           <wp:inline xmlns:a="http://schemas.openxmlformats.org/drawingml/2006/main" xmlns:pic="http://schemas.openxmlformats.org/drawingml/2006/picture">
             <wp:extent cx="5852160" cy="3840480"/>
-            <wp:docPr id="2" name="Picture 2"/>
+            <wp:docPr id="53" name="Picture 53"/>
             <wp:cNvGraphicFramePr>
               <a:graphicFrameLocks noChangeAspect="1"/>
             </wp:cNvGraphicFramePr>
@@ -8565,7 +10915,7 @@
         <w:drawing>
           <wp:inline xmlns:a="http://schemas.openxmlformats.org/drawingml/2006/main" xmlns:pic="http://schemas.openxmlformats.org/drawingml/2006/picture">
             <wp:extent cx="5852160" cy="3840480"/>
-            <wp:docPr id="3" name="Picture 3"/>
+            <wp:docPr id="54" name="Picture 54"/>
             <wp:cNvGraphicFramePr>
               <a:graphicFrameLocks noChangeAspect="1"/>
             </wp:cNvGraphicFramePr>
@@ -8610,7 +10960,7 @@
         <w:drawing>
           <wp:inline xmlns:a="http://schemas.openxmlformats.org/drawingml/2006/main" xmlns:pic="http://schemas.openxmlformats.org/drawingml/2006/picture">
             <wp:extent cx="5852160" cy="3840480"/>
-            <wp:docPr id="4" name="Picture 4"/>
+            <wp:docPr id="55" name="Picture 55"/>
             <wp:cNvGraphicFramePr>
               <a:graphicFrameLocks noChangeAspect="1"/>
             </wp:cNvGraphicFramePr>
@@ -8655,7 +11005,7 @@
         <w:drawing>
           <wp:inline xmlns:a="http://schemas.openxmlformats.org/drawingml/2006/main" xmlns:pic="http://schemas.openxmlformats.org/drawingml/2006/picture">
             <wp:extent cx="5852160" cy="3840480"/>
-            <wp:docPr id="5" name="Picture 5"/>
+            <wp:docPr id="56" name="Picture 56"/>
             <wp:cNvGraphicFramePr>
               <a:graphicFrameLocks noChangeAspect="1"/>
             </wp:cNvGraphicFramePr>
@@ -8700,7 +11050,7 @@
         <w:drawing>
           <wp:inline xmlns:a="http://schemas.openxmlformats.org/drawingml/2006/main" xmlns:pic="http://schemas.openxmlformats.org/drawingml/2006/picture">
             <wp:extent cx="5852160" cy="3840480"/>
-            <wp:docPr id="6" name="Picture 6"/>
+            <wp:docPr id="57" name="Picture 57"/>
             <wp:cNvGraphicFramePr>
               <a:graphicFrameLocks noChangeAspect="1"/>
             </wp:cNvGraphicFramePr>
@@ -8745,7 +11095,7 @@
         <w:drawing>
           <wp:inline xmlns:a="http://schemas.openxmlformats.org/drawingml/2006/main" xmlns:pic="http://schemas.openxmlformats.org/drawingml/2006/picture">
             <wp:extent cx="5852160" cy="3840480"/>
-            <wp:docPr id="7" name="Picture 7"/>
+            <wp:docPr id="58" name="Picture 58"/>
             <wp:cNvGraphicFramePr>
               <a:graphicFrameLocks noChangeAspect="1"/>
             </wp:cNvGraphicFramePr>
@@ -8754,6 +11104,186 @@
                 <pic:pic>
                   <pic:nvPicPr>
                     <pic:cNvPr id="0" name="20260902154721-staff-full-table.png"/>
+                    <pic:cNvPicPr/>
+                  </pic:nvPicPr>
+                  <pic:blipFill>
+                    <a:blip r:embed="rId18"/>
+                    <a:stretch>
+                      <a:fillRect/>
+                    </a:stretch>
+                  </pic:blipFill>
+                  <pic:spPr>
+                    <a:xfrm>
+                      <a:off x="0" y="0"/>
+                      <a:ext cx="5852160" cy="3840480"/>
+                    </a:xfrm>
+                    <a:prstGeom prst="rect"/>
+                  </pic:spPr>
+                </pic:pic>
+              </a:graphicData>
+            </a:graphic>
+          </wp:inline>
+        </w:drawing>
+      </w:r>
+    </w:p>
+    <w:p>
+      <w:pPr>
+        <w:pStyle w:val="Heading2"/>
+        <w:keepNext/>
+      </w:pPr>
+      <w:r>
+        <w:t>ภาพที่ 8: Filter header ตารางด้วยจังหวัด</w:t>
+      </w:r>
+    </w:p>
+    <w:p>
+      <w:r>
+        <w:drawing>
+          <wp:inline xmlns:a="http://schemas.openxmlformats.org/drawingml/2006/main" xmlns:pic="http://schemas.openxmlformats.org/drawingml/2006/picture">
+            <wp:extent cx="5852160" cy="3840480"/>
+            <wp:docPr id="59" name="Picture 59"/>
+            <wp:cNvGraphicFramePr>
+              <a:graphicFrameLocks noChangeAspect="1"/>
+            </wp:cNvGraphicFramePr>
+            <a:graphic>
+              <a:graphicData uri="http://schemas.openxmlformats.org/drawingml/2006/picture">
+                <pic:pic>
+                  <pic:nvPicPr>
+                    <pic:cNvPr id="0" name="20260902154721-staff-filter-province.png"/>
+                    <pic:cNvPicPr/>
+                  </pic:nvPicPr>
+                  <pic:blipFill>
+                    <a:blip r:embed="rId19"/>
+                    <a:stretch>
+                      <a:fillRect/>
+                    </a:stretch>
+                  </pic:blipFill>
+                  <pic:spPr>
+                    <a:xfrm>
+                      <a:off x="0" y="0"/>
+                      <a:ext cx="5852160" cy="3840480"/>
+                    </a:xfrm>
+                    <a:prstGeom prst="rect"/>
+                  </pic:spPr>
+                </pic:pic>
+              </a:graphicData>
+            </a:graphic>
+          </wp:inline>
+        </w:drawing>
+      </w:r>
+    </w:p>
+    <w:p>
+      <w:pPr>
+        <w:pStyle w:val="Heading2"/>
+        <w:keepNext/>
+      </w:pPr>
+      <w:r>
+        <w:t>ภาพที่ 9: Filter วันที่ส่งและวันที่ลงทะเบียนแบบช่วงเวลา</w:t>
+      </w:r>
+    </w:p>
+    <w:p>
+      <w:r>
+        <w:drawing>
+          <wp:inline xmlns:a="http://schemas.openxmlformats.org/drawingml/2006/main" xmlns:pic="http://schemas.openxmlformats.org/drawingml/2006/picture">
+            <wp:extent cx="5852160" cy="3840480"/>
+            <wp:docPr id="60" name="Picture 60"/>
+            <wp:cNvGraphicFramePr>
+              <a:graphicFrameLocks noChangeAspect="1"/>
+            </wp:cNvGraphicFramePr>
+            <a:graphic>
+              <a:graphicData uri="http://schemas.openxmlformats.org/drawingml/2006/picture">
+                <pic:pic>
+                  <pic:nvPicPr>
+                    <pic:cNvPr id="0" name="20260902154721-staff-date-range-filter.png"/>
+                    <pic:cNvPicPr/>
+                  </pic:nvPicPr>
+                  <pic:blipFill>
+                    <a:blip r:embed="rId20"/>
+                    <a:stretch>
+                      <a:fillRect/>
+                    </a:stretch>
+                  </pic:blipFill>
+                  <pic:spPr>
+                    <a:xfrm>
+                      <a:off x="0" y="0"/>
+                      <a:ext cx="5852160" cy="3840480"/>
+                    </a:xfrm>
+                    <a:prstGeom prst="rect"/>
+                  </pic:spPr>
+                </pic:pic>
+              </a:graphicData>
+            </a:graphic>
+          </wp:inline>
+        </w:drawing>
+      </w:r>
+    </w:p>
+    <w:p>
+      <w:pPr>
+        <w:pStyle w:val="Heading2"/>
+        <w:keepNext/>
+      </w:pPr>
+      <w:r>
+        <w:t>ภาพที่ 10: Sorting จาก header ตาราง</w:t>
+      </w:r>
+    </w:p>
+    <w:p>
+      <w:r>
+        <w:drawing>
+          <wp:inline xmlns:a="http://schemas.openxmlformats.org/drawingml/2006/main" xmlns:pic="http://schemas.openxmlformats.org/drawingml/2006/picture">
+            <wp:extent cx="5852160" cy="3840480"/>
+            <wp:docPr id="61" name="Picture 61"/>
+            <wp:cNvGraphicFramePr>
+              <a:graphicFrameLocks noChangeAspect="1"/>
+            </wp:cNvGraphicFramePr>
+            <a:graphic>
+              <a:graphicData uri="http://schemas.openxmlformats.org/drawingml/2006/picture">
+                <pic:pic>
+                  <pic:nvPicPr>
+                    <pic:cNvPr id="0" name="20260902154721-staff-sorting.png"/>
+                    <pic:cNvPicPr/>
+                  </pic:nvPicPr>
+                  <pic:blipFill>
+                    <a:blip r:embed="rId21"/>
+                    <a:stretch>
+                      <a:fillRect/>
+                    </a:stretch>
+                  </pic:blipFill>
+                  <pic:spPr>
+                    <a:xfrm>
+                      <a:off x="0" y="0"/>
+                      <a:ext cx="5852160" cy="3840480"/>
+                    </a:xfrm>
+                    <a:prstGeom prst="rect"/>
+                  </pic:spPr>
+                </pic:pic>
+              </a:graphicData>
+            </a:graphic>
+          </wp:inline>
+        </w:drawing>
+      </w:r>
+    </w:p>
+    <w:p>
+      <w:pPr>
+        <w:pStyle w:val="Heading2"/>
+        <w:keepNext/>
+      </w:pPr>
+      <w:r>
+        <w:t>ภาพที่ 11: Drawer รายละเอียด พร้อมบันทึกคำขอและอัปเดตขนส่ง</w:t>
+      </w:r>
+    </w:p>
+    <w:p>
+      <w:r>
+        <w:drawing>
+          <wp:inline xmlns:a="http://schemas.openxmlformats.org/drawingml/2006/main" xmlns:pic="http://schemas.openxmlformats.org/drawingml/2006/picture">
+            <wp:extent cx="5852160" cy="3840480"/>
+            <wp:docPr id="62" name="Picture 62"/>
+            <wp:cNvGraphicFramePr>
+              <a:graphicFrameLocks noChangeAspect="1"/>
+            </wp:cNvGraphicFramePr>
+            <a:graphic>
+              <a:graphicData uri="http://schemas.openxmlformats.org/drawingml/2006/picture">
+                <pic:pic>
+                  <pic:nvPicPr>
+                    <pic:cNvPr id="0" name="20260902154721-staff-detail-drawer.png"/>
                     <pic:cNvPicPr/>
                   </pic:nvPicPr>
                   <pic:blipFill>
@@ -8782,7 +11312,7 @@
         <w:keepNext/>
       </w:pPr>
       <w:r>
-        <w:t>ภาพที่ 8: Filter header ตารางด้วยจังหวัด</w:t>
+        <w:t>ภาพที่ 12: Tracking URL แสดงเป็น link คลิกได้</w:t>
       </w:r>
     </w:p>
     <w:p>
@@ -8790,7 +11320,7 @@
         <w:drawing>
           <wp:inline xmlns:a="http://schemas.openxmlformats.org/drawingml/2006/main" xmlns:pic="http://schemas.openxmlformats.org/drawingml/2006/picture">
             <wp:extent cx="5852160" cy="3840480"/>
-            <wp:docPr id="8" name="Picture 8"/>
+            <wp:docPr id="63" name="Picture 63"/>
             <wp:cNvGraphicFramePr>
               <a:graphicFrameLocks noChangeAspect="1"/>
             </wp:cNvGraphicFramePr>
@@ -8798,7 +11328,7 @@
               <a:graphicData uri="http://schemas.openxmlformats.org/drawingml/2006/picture">
                 <pic:pic>
                   <pic:nvPicPr>
-                    <pic:cNvPr id="0" name="20260902154721-staff-filter-province.png"/>
+                    <pic:cNvPr id="0" name="20260902154721-staff-tracking-url-link.png"/>
                     <pic:cNvPicPr/>
                   </pic:nvPicPr>
                   <pic:blipFill>
@@ -8827,7 +11357,7 @@
         <w:keepNext/>
       </w:pPr>
       <w:r>
-        <w:t>ภาพที่ 9: Filter วันที่ส่งและวันที่ลงทะเบียนแบบช่วงเวลา</w:t>
+        <w:t>ภาพที่ 13: Export CSV จากหน้าพนักงาน</w:t>
       </w:r>
     </w:p>
     <w:p>
@@ -8835,187 +11365,7 @@
         <w:drawing>
           <wp:inline xmlns:a="http://schemas.openxmlformats.org/drawingml/2006/main" xmlns:pic="http://schemas.openxmlformats.org/drawingml/2006/picture">
             <wp:extent cx="5852160" cy="3840480"/>
-            <wp:docPr id="9" name="Picture 9"/>
-            <wp:cNvGraphicFramePr>
-              <a:graphicFrameLocks noChangeAspect="1"/>
-            </wp:cNvGraphicFramePr>
-            <a:graphic>
-              <a:graphicData uri="http://schemas.openxmlformats.org/drawingml/2006/picture">
-                <pic:pic>
-                  <pic:nvPicPr>
-                    <pic:cNvPr id="0" name="20260902154721-staff-date-range-filter.png"/>
-                    <pic:cNvPicPr/>
-                  </pic:nvPicPr>
-                  <pic:blipFill>
-                    <a:blip r:embed="rId18"/>
-                    <a:stretch>
-                      <a:fillRect/>
-                    </a:stretch>
-                  </pic:blipFill>
-                  <pic:spPr>
-                    <a:xfrm>
-                      <a:off x="0" y="0"/>
-                      <a:ext cx="5852160" cy="3840480"/>
-                    </a:xfrm>
-                    <a:prstGeom prst="rect"/>
-                  </pic:spPr>
-                </pic:pic>
-              </a:graphicData>
-            </a:graphic>
-          </wp:inline>
-        </w:drawing>
-      </w:r>
-    </w:p>
-    <w:p>
-      <w:pPr>
-        <w:pStyle w:val="Heading2"/>
-        <w:keepNext/>
-      </w:pPr>
-      <w:r>
-        <w:t>ภาพที่ 10: Sorting จาก header ตาราง</w:t>
-      </w:r>
-    </w:p>
-    <w:p>
-      <w:r>
-        <w:drawing>
-          <wp:inline xmlns:a="http://schemas.openxmlformats.org/drawingml/2006/main" xmlns:pic="http://schemas.openxmlformats.org/drawingml/2006/picture">
-            <wp:extent cx="5852160" cy="3840480"/>
-            <wp:docPr id="10" name="Picture 10"/>
-            <wp:cNvGraphicFramePr>
-              <a:graphicFrameLocks noChangeAspect="1"/>
-            </wp:cNvGraphicFramePr>
-            <a:graphic>
-              <a:graphicData uri="http://schemas.openxmlformats.org/drawingml/2006/picture">
-                <pic:pic>
-                  <pic:nvPicPr>
-                    <pic:cNvPr id="0" name="20260902154721-staff-sorting.png"/>
-                    <pic:cNvPicPr/>
-                  </pic:nvPicPr>
-                  <pic:blipFill>
-                    <a:blip r:embed="rId19"/>
-                    <a:stretch>
-                      <a:fillRect/>
-                    </a:stretch>
-                  </pic:blipFill>
-                  <pic:spPr>
-                    <a:xfrm>
-                      <a:off x="0" y="0"/>
-                      <a:ext cx="5852160" cy="3840480"/>
-                    </a:xfrm>
-                    <a:prstGeom prst="rect"/>
-                  </pic:spPr>
-                </pic:pic>
-              </a:graphicData>
-            </a:graphic>
-          </wp:inline>
-        </w:drawing>
-      </w:r>
-    </w:p>
-    <w:p>
-      <w:pPr>
-        <w:pStyle w:val="Heading2"/>
-        <w:keepNext/>
-      </w:pPr>
-      <w:r>
-        <w:t>ภาพที่ 11: Drawer รายละเอียด พร้อมบันทึกคำขอและอัปเดตขนส่ง</w:t>
-      </w:r>
-    </w:p>
-    <w:p>
-      <w:r>
-        <w:drawing>
-          <wp:inline xmlns:a="http://schemas.openxmlformats.org/drawingml/2006/main" xmlns:pic="http://schemas.openxmlformats.org/drawingml/2006/picture">
-            <wp:extent cx="5852160" cy="3840480"/>
-            <wp:docPr id="11" name="Picture 11"/>
-            <wp:cNvGraphicFramePr>
-              <a:graphicFrameLocks noChangeAspect="1"/>
-            </wp:cNvGraphicFramePr>
-            <a:graphic>
-              <a:graphicData uri="http://schemas.openxmlformats.org/drawingml/2006/picture">
-                <pic:pic>
-                  <pic:nvPicPr>
-                    <pic:cNvPr id="0" name="20260902154721-staff-detail-drawer.png"/>
-                    <pic:cNvPicPr/>
-                  </pic:nvPicPr>
-                  <pic:blipFill>
-                    <a:blip r:embed="rId20"/>
-                    <a:stretch>
-                      <a:fillRect/>
-                    </a:stretch>
-                  </pic:blipFill>
-                  <pic:spPr>
-                    <a:xfrm>
-                      <a:off x="0" y="0"/>
-                      <a:ext cx="5852160" cy="3840480"/>
-                    </a:xfrm>
-                    <a:prstGeom prst="rect"/>
-                  </pic:spPr>
-                </pic:pic>
-              </a:graphicData>
-            </a:graphic>
-          </wp:inline>
-        </w:drawing>
-      </w:r>
-    </w:p>
-    <w:p>
-      <w:pPr>
-        <w:pStyle w:val="Heading2"/>
-        <w:keepNext/>
-      </w:pPr>
-      <w:r>
-        <w:t>ภาพที่ 12: Tracking URL แสดงเป็น link คลิกได้</w:t>
-      </w:r>
-    </w:p>
-    <w:p>
-      <w:r>
-        <w:drawing>
-          <wp:inline xmlns:a="http://schemas.openxmlformats.org/drawingml/2006/main" xmlns:pic="http://schemas.openxmlformats.org/drawingml/2006/picture">
-            <wp:extent cx="5852160" cy="3840480"/>
-            <wp:docPr id="12" name="Picture 12"/>
-            <wp:cNvGraphicFramePr>
-              <a:graphicFrameLocks noChangeAspect="1"/>
-            </wp:cNvGraphicFramePr>
-            <a:graphic>
-              <a:graphicData uri="http://schemas.openxmlformats.org/drawingml/2006/picture">
-                <pic:pic>
-                  <pic:nvPicPr>
-                    <pic:cNvPr id="0" name="20260902154721-staff-tracking-url-link.png"/>
-                    <pic:cNvPicPr/>
-                  </pic:nvPicPr>
-                  <pic:blipFill>
-                    <a:blip r:embed="rId21"/>
-                    <a:stretch>
-                      <a:fillRect/>
-                    </a:stretch>
-                  </pic:blipFill>
-                  <pic:spPr>
-                    <a:xfrm>
-                      <a:off x="0" y="0"/>
-                      <a:ext cx="5852160" cy="3840480"/>
-                    </a:xfrm>
-                    <a:prstGeom prst="rect"/>
-                  </pic:spPr>
-                </pic:pic>
-              </a:graphicData>
-            </a:graphic>
-          </wp:inline>
-        </w:drawing>
-      </w:r>
-    </w:p>
-    <w:p>
-      <w:pPr>
-        <w:pStyle w:val="Heading2"/>
-        <w:keepNext/>
-      </w:pPr>
-      <w:r>
-        <w:t>ภาพที่ 13: Export CSV จากหน้าพนักงาน</w:t>
-      </w:r>
-    </w:p>
-    <w:p>
-      <w:r>
-        <w:drawing>
-          <wp:inline xmlns:a="http://schemas.openxmlformats.org/drawingml/2006/main" xmlns:pic="http://schemas.openxmlformats.org/drawingml/2006/picture">
-            <wp:extent cx="5852160" cy="3840480"/>
-            <wp:docPr id="13" name="Picture 13"/>
+            <wp:docPr id="64" name="Picture 64"/>
             <wp:cNvGraphicFramePr>
               <a:graphicFrameLocks noChangeAspect="1"/>
             </wp:cNvGraphicFramePr>

</xml_diff>

<commit_message>
docs: add inline screenshots to user guide (#37)
Co-authored-by: Krishna Sinlapasa <krishna.sinlapasa@gmail.com>
</commit_message>
<xml_diff>
--- a/docs/Mahosample-user-guide-with-test-cases-and-screenshots.docx
+++ b/docs/Mahosample-user-guide-with-test-cases-and-screenshots.docx
@@ -653,6 +653,7 @@
     <w:p>
       <w:pPr>
         <w:pStyle w:val="Heading1"/>
+        <w:keepNext w:val="0"/>
       </w:pPr>
       <w:r>
         <w:t>Mahosample Public User Guide</w:t>
@@ -669,9 +670,55 @@
     <w:p>
       <w:pPr>
         <w:pStyle w:val="Heading2"/>
+        <w:keepNext/>
       </w:pPr>
       <w:r>
         <w:t>1. เข้าใช้งานหน้าแบบฟอร์ม</w:t>
+      </w:r>
+    </w:p>
+    <w:p>
+      <w:pPr>
+        <w:pStyle w:val="Heading3"/>
+        <w:keepNext/>
+      </w:pPr>
+      <w:r>
+        <w:t>ภาพประกอบ: หน้าแบบฟอร์มลงทะเบียนรับตัวอย่าง มะโฮ</w:t>
+      </w:r>
+    </w:p>
+    <w:p>
+      <w:r>
+        <w:drawing>
+          <wp:inline xmlns:a="http://schemas.openxmlformats.org/drawingml/2006/main" xmlns:pic="http://schemas.openxmlformats.org/drawingml/2006/picture">
+            <wp:extent cx="5394960" cy="3540442"/>
+            <wp:docPr id="1" name="Picture 1"/>
+            <wp:cNvGraphicFramePr>
+              <a:graphicFrameLocks noChangeAspect="1"/>
+            </wp:cNvGraphicFramePr>
+            <a:graphic>
+              <a:graphicData uri="http://schemas.openxmlformats.org/drawingml/2006/picture">
+                <pic:pic>
+                  <pic:nvPicPr>
+                    <pic:cNvPr id="0" name="20260902154721-public-registration-form.png"/>
+                    <pic:cNvPicPr/>
+                  </pic:nvPicPr>
+                  <pic:blipFill>
+                    <a:blip r:embed="rId10"/>
+                    <a:stretch>
+                      <a:fillRect/>
+                    </a:stretch>
+                  </pic:blipFill>
+                  <pic:spPr>
+                    <a:xfrm>
+                      <a:off x="0" y="0"/>
+                      <a:ext cx="5394960" cy="3540442"/>
+                    </a:xfrm>
+                    <a:prstGeom prst="rect"/>
+                  </pic:spPr>
+                </pic:pic>
+              </a:graphicData>
+            </a:graphic>
+          </wp:inline>
+        </w:drawing>
       </w:r>
     </w:p>
     <w:p>
@@ -726,12 +773,103 @@
     <w:p>
       <w:pPr>
         <w:pStyle w:val="Heading2"/>
+        <w:keepNext/>
       </w:pPr>
       <w:r>
         <w:t>2. กรอกข้อมูลผู้ลงทะเบียน</w:t>
       </w:r>
     </w:p>
     <w:p>
+      <w:pPr>
+        <w:pStyle w:val="Heading3"/>
+        <w:keepNext/>
+      </w:pPr>
+      <w:r>
+        <w:t>ภาพประกอบ: หน้าแบบฟอร์มลงทะเบียนรับตัวอย่าง มะโฮ</w:t>
+      </w:r>
+    </w:p>
+    <w:p>
+      <w:r>
+        <w:drawing>
+          <wp:inline xmlns:a="http://schemas.openxmlformats.org/drawingml/2006/main" xmlns:pic="http://schemas.openxmlformats.org/drawingml/2006/picture">
+            <wp:extent cx="5394960" cy="3540442"/>
+            <wp:docPr id="2" name="Picture 2"/>
+            <wp:cNvGraphicFramePr>
+              <a:graphicFrameLocks noChangeAspect="1"/>
+            </wp:cNvGraphicFramePr>
+            <a:graphic>
+              <a:graphicData uri="http://schemas.openxmlformats.org/drawingml/2006/picture">
+                <pic:pic>
+                  <pic:nvPicPr>
+                    <pic:cNvPr id="0" name="20260902154721-public-registration-form.png"/>
+                    <pic:cNvPicPr/>
+                  </pic:nvPicPr>
+                  <pic:blipFill>
+                    <a:blip r:embed="rId10"/>
+                    <a:stretch>
+                      <a:fillRect/>
+                    </a:stretch>
+                  </pic:blipFill>
+                  <pic:spPr>
+                    <a:xfrm>
+                      <a:off x="0" y="0"/>
+                      <a:ext cx="5394960" cy="3540442"/>
+                    </a:xfrm>
+                    <a:prstGeom prst="rect"/>
+                  </pic:spPr>
+                </pic:pic>
+              </a:graphicData>
+            </a:graphic>
+          </wp:inline>
+        </w:drawing>
+      </w:r>
+    </w:p>
+    <w:p>
+      <w:pPr>
+        <w:pStyle w:val="Heading3"/>
+        <w:keepNext/>
+      </w:pPr>
+      <w:r>
+        <w:t>ภาพประกอบ: Validation เมื่อไม่กรอกช่องทางติดต่อ</w:t>
+      </w:r>
+    </w:p>
+    <w:p>
+      <w:r>
+        <w:drawing>
+          <wp:inline xmlns:a="http://schemas.openxmlformats.org/drawingml/2006/main" xmlns:pic="http://schemas.openxmlformats.org/drawingml/2006/picture">
+            <wp:extent cx="5394960" cy="3540442"/>
+            <wp:docPr id="3" name="Picture 3"/>
+            <wp:cNvGraphicFramePr>
+              <a:graphicFrameLocks noChangeAspect="1"/>
+            </wp:cNvGraphicFramePr>
+            <a:graphic>
+              <a:graphicData uri="http://schemas.openxmlformats.org/drawingml/2006/picture">
+                <pic:pic>
+                  <pic:nvPicPr>
+                    <pic:cNvPr id="0" name="20260902154721-public-contact-validation.png"/>
+                    <pic:cNvPicPr/>
+                  </pic:nvPicPr>
+                  <pic:blipFill>
+                    <a:blip r:embed="rId11"/>
+                    <a:stretch>
+                      <a:fillRect/>
+                    </a:stretch>
+                  </pic:blipFill>
+                  <pic:spPr>
+                    <a:xfrm>
+                      <a:off x="0" y="0"/>
+                      <a:ext cx="5394960" cy="3540442"/>
+                    </a:xfrm>
+                    <a:prstGeom prst="rect"/>
+                  </pic:spPr>
+                </pic:pic>
+              </a:graphicData>
+            </a:graphic>
+          </wp:inline>
+        </w:drawing>
+      </w:r>
+    </w:p>
+    <w:p>
       <w:r>
         <w:rPr>
           <w:rFonts w:ascii="Aptos" w:hAnsi="Aptos" w:eastAsia="Aptos"/>
@@ -816,12 +954,58 @@
     <w:p>
       <w:pPr>
         <w:pStyle w:val="Heading2"/>
+        <w:keepNext/>
       </w:pPr>
       <w:r>
         <w:t>3. กรอกข้อมูลจัดส่ง</w:t>
       </w:r>
     </w:p>
     <w:p>
+      <w:pPr>
+        <w:pStyle w:val="Heading3"/>
+        <w:keepNext/>
+      </w:pPr>
+      <w:r>
+        <w:t>ภาพประกอบ: หน้าแบบฟอร์มลงทะเบียนรับตัวอย่าง มะโฮ</w:t>
+      </w:r>
+    </w:p>
+    <w:p>
+      <w:r>
+        <w:drawing>
+          <wp:inline xmlns:a="http://schemas.openxmlformats.org/drawingml/2006/main" xmlns:pic="http://schemas.openxmlformats.org/drawingml/2006/picture">
+            <wp:extent cx="5394960" cy="3540442"/>
+            <wp:docPr id="4" name="Picture 4"/>
+            <wp:cNvGraphicFramePr>
+              <a:graphicFrameLocks noChangeAspect="1"/>
+            </wp:cNvGraphicFramePr>
+            <a:graphic>
+              <a:graphicData uri="http://schemas.openxmlformats.org/drawingml/2006/picture">
+                <pic:pic>
+                  <pic:nvPicPr>
+                    <pic:cNvPr id="0" name="20260902154721-public-registration-form.png"/>
+                    <pic:cNvPicPr/>
+                  </pic:nvPicPr>
+                  <pic:blipFill>
+                    <a:blip r:embed="rId10"/>
+                    <a:stretch>
+                      <a:fillRect/>
+                    </a:stretch>
+                  </pic:blipFill>
+                  <pic:spPr>
+                    <a:xfrm>
+                      <a:off x="0" y="0"/>
+                      <a:ext cx="5394960" cy="3540442"/>
+                    </a:xfrm>
+                    <a:prstGeom prst="rect"/>
+                  </pic:spPr>
+                </pic:pic>
+              </a:graphicData>
+            </a:graphic>
+          </wp:inline>
+        </w:drawing>
+      </w:r>
+    </w:p>
+    <w:p>
       <w:r>
         <w:rPr>
           <w:rFonts w:ascii="Aptos" w:hAnsi="Aptos" w:eastAsia="Aptos"/>
@@ -917,12 +1101,58 @@
     <w:p>
       <w:pPr>
         <w:pStyle w:val="Heading2"/>
+        <w:keepNext/>
       </w:pPr>
       <w:r>
         <w:t>4. ยินยอมใช้ข้อมูลส่วนบุคคล</w:t>
       </w:r>
     </w:p>
     <w:p>
+      <w:pPr>
+        <w:pStyle w:val="Heading3"/>
+        <w:keepNext/>
+      </w:pPr>
+      <w:r>
+        <w:t>ภาพประกอบ: หน้าแบบฟอร์มลงทะเบียนรับตัวอย่าง มะโฮ</w:t>
+      </w:r>
+    </w:p>
+    <w:p>
+      <w:r>
+        <w:drawing>
+          <wp:inline xmlns:a="http://schemas.openxmlformats.org/drawingml/2006/main" xmlns:pic="http://schemas.openxmlformats.org/drawingml/2006/picture">
+            <wp:extent cx="5394960" cy="3540442"/>
+            <wp:docPr id="5" name="Picture 5"/>
+            <wp:cNvGraphicFramePr>
+              <a:graphicFrameLocks noChangeAspect="1"/>
+            </wp:cNvGraphicFramePr>
+            <a:graphic>
+              <a:graphicData uri="http://schemas.openxmlformats.org/drawingml/2006/picture">
+                <pic:pic>
+                  <pic:nvPicPr>
+                    <pic:cNvPr id="0" name="20260902154721-public-registration-form.png"/>
+                    <pic:cNvPicPr/>
+                  </pic:nvPicPr>
+                  <pic:blipFill>
+                    <a:blip r:embed="rId10"/>
+                    <a:stretch>
+                      <a:fillRect/>
+                    </a:stretch>
+                  </pic:blipFill>
+                  <pic:spPr>
+                    <a:xfrm>
+                      <a:off x="0" y="0"/>
+                      <a:ext cx="5394960" cy="3540442"/>
+                    </a:xfrm>
+                    <a:prstGeom prst="rect"/>
+                  </pic:spPr>
+                </pic:pic>
+              </a:graphicData>
+            </a:graphic>
+          </wp:inline>
+        </w:drawing>
+      </w:r>
+    </w:p>
+    <w:p>
       <w:r>
         <w:rPr>
           <w:rFonts w:ascii="Aptos" w:hAnsi="Aptos" w:eastAsia="Aptos"/>
@@ -974,9 +1204,55 @@
     <w:p>
       <w:pPr>
         <w:pStyle w:val="Heading2"/>
+        <w:keepNext/>
       </w:pPr>
       <w:r>
         <w:t>5. ส่งแบบฟอร์มสำเร็จ</w:t>
+      </w:r>
+    </w:p>
+    <w:p>
+      <w:pPr>
+        <w:pStyle w:val="Heading3"/>
+        <w:keepNext/>
+      </w:pPr>
+      <w:r>
+        <w:t>ภาพประกอบ: Success card หลังส่งฟอร์ม พร้อมเลขรายการภายใน</w:t>
+      </w:r>
+    </w:p>
+    <w:p>
+      <w:r>
+        <w:drawing>
+          <wp:inline xmlns:a="http://schemas.openxmlformats.org/drawingml/2006/main" xmlns:pic="http://schemas.openxmlformats.org/drawingml/2006/picture">
+            <wp:extent cx="5394960" cy="3540442"/>
+            <wp:docPr id="6" name="Picture 6"/>
+            <wp:cNvGraphicFramePr>
+              <a:graphicFrameLocks noChangeAspect="1"/>
+            </wp:cNvGraphicFramePr>
+            <a:graphic>
+              <a:graphicData uri="http://schemas.openxmlformats.org/drawingml/2006/picture">
+                <pic:pic>
+                  <pic:nvPicPr>
+                    <pic:cNvPr id="0" name="20260902154721-public-success-card.png"/>
+                    <pic:cNvPicPr/>
+                  </pic:nvPicPr>
+                  <pic:blipFill>
+                    <a:blip r:embed="rId12"/>
+                    <a:stretch>
+                      <a:fillRect/>
+                    </a:stretch>
+                  </pic:blipFill>
+                  <pic:spPr>
+                    <a:xfrm>
+                      <a:off x="0" y="0"/>
+                      <a:ext cx="5394960" cy="3540442"/>
+                    </a:xfrm>
+                    <a:prstGeom prst="rect"/>
+                  </pic:spPr>
+                </pic:pic>
+              </a:graphicData>
+            </a:graphic>
+          </wp:inline>
+        </w:drawing>
       </w:r>
     </w:p>
     <w:p>
@@ -1054,12 +1330,58 @@
     <w:p>
       <w:pPr>
         <w:pStyle w:val="Heading2"/>
+        <w:keepNext/>
       </w:pPr>
       <w:r>
         <w:t>6. กรณีข้อมูลซ้ำ</w:t>
       </w:r>
     </w:p>
     <w:p>
+      <w:pPr>
+        <w:pStyle w:val="Heading3"/>
+        <w:keepNext/>
+      </w:pPr>
+      <w:r>
+        <w:t>ภาพประกอบ: Validation เมื่อไม่กรอกช่องทางติดต่อ</w:t>
+      </w:r>
+    </w:p>
+    <w:p>
+      <w:r>
+        <w:drawing>
+          <wp:inline xmlns:a="http://schemas.openxmlformats.org/drawingml/2006/main" xmlns:pic="http://schemas.openxmlformats.org/drawingml/2006/picture">
+            <wp:extent cx="5394960" cy="3540442"/>
+            <wp:docPr id="7" name="Picture 7"/>
+            <wp:cNvGraphicFramePr>
+              <a:graphicFrameLocks noChangeAspect="1"/>
+            </wp:cNvGraphicFramePr>
+            <a:graphic>
+              <a:graphicData uri="http://schemas.openxmlformats.org/drawingml/2006/picture">
+                <pic:pic>
+                  <pic:nvPicPr>
+                    <pic:cNvPr id="0" name="20260902154721-public-contact-validation.png"/>
+                    <pic:cNvPicPr/>
+                  </pic:nvPicPr>
+                  <pic:blipFill>
+                    <a:blip r:embed="rId11"/>
+                    <a:stretch>
+                      <a:fillRect/>
+                    </a:stretch>
+                  </pic:blipFill>
+                  <pic:spPr>
+                    <a:xfrm>
+                      <a:off x="0" y="0"/>
+                      <a:ext cx="5394960" cy="3540442"/>
+                    </a:xfrm>
+                    <a:prstGeom prst="rect"/>
+                  </pic:spPr>
+                </pic:pic>
+              </a:graphicData>
+            </a:graphic>
+          </wp:inline>
+        </w:drawing>
+      </w:r>
+    </w:p>
+    <w:p>
       <w:r>
         <w:rPr>
           <w:rFonts w:ascii="Aptos" w:hAnsi="Aptos" w:eastAsia="Aptos"/>
@@ -1111,9 +1433,55 @@
     <w:p>
       <w:pPr>
         <w:pStyle w:val="Heading2"/>
+        <w:keepNext/>
       </w:pPr>
       <w:r>
         <w:t>7. ตรวจสอบสถานะพัสดุ</w:t>
+      </w:r>
+    </w:p>
+    <w:p>
+      <w:pPr>
+        <w:pStyle w:val="Heading3"/>
+        <w:keepNext/>
+      </w:pPr>
+      <w:r>
+        <w:t>ภาพประกอบ: หน้าเช็คสถานะพบเลข tracking และ Tracking URL</w:t>
+      </w:r>
+    </w:p>
+    <w:p>
+      <w:r>
+        <w:drawing>
+          <wp:inline xmlns:a="http://schemas.openxmlformats.org/drawingml/2006/main" xmlns:pic="http://schemas.openxmlformats.org/drawingml/2006/picture">
+            <wp:extent cx="5394960" cy="3540442"/>
+            <wp:docPr id="8" name="Picture 8"/>
+            <wp:cNvGraphicFramePr>
+              <a:graphicFrameLocks noChangeAspect="1"/>
+            </wp:cNvGraphicFramePr>
+            <a:graphic>
+              <a:graphicData uri="http://schemas.openxmlformats.org/drawingml/2006/picture">
+                <pic:pic>
+                  <pic:nvPicPr>
+                    <pic:cNvPr id="0" name="20260902154721-tracking-found.png"/>
+                    <pic:cNvPicPr/>
+                  </pic:nvPicPr>
+                  <pic:blipFill>
+                    <a:blip r:embed="rId13"/>
+                    <a:stretch>
+                      <a:fillRect/>
+                    </a:stretch>
+                  </pic:blipFill>
+                  <pic:spPr>
+                    <a:xfrm>
+                      <a:off x="0" y="0"/>
+                      <a:ext cx="5394960" cy="3540442"/>
+                    </a:xfrm>
+                    <a:prstGeom prst="rect"/>
+                  </pic:spPr>
+                </pic:pic>
+              </a:graphicData>
+            </a:graphic>
+          </wp:inline>
+        </w:drawing>
       </w:r>
     </w:p>
     <w:p>
@@ -1228,12 +1596,58 @@
     <w:p>
       <w:pPr>
         <w:pStyle w:val="Heading2"/>
+        <w:keepNext/>
       </w:pPr>
       <w:r>
         <w:t>8. ไม่พบเลข tracking</w:t>
       </w:r>
     </w:p>
     <w:p>
+      <w:pPr>
+        <w:pStyle w:val="Heading3"/>
+        <w:keepNext/>
+      </w:pPr>
+      <w:r>
+        <w:t>ภาพประกอบ: หน้าเช็คสถานะเมื่อไม่พบเลข tracking</w:t>
+      </w:r>
+    </w:p>
+    <w:p>
+      <w:r>
+        <w:drawing>
+          <wp:inline xmlns:a="http://schemas.openxmlformats.org/drawingml/2006/main" xmlns:pic="http://schemas.openxmlformats.org/drawingml/2006/picture">
+            <wp:extent cx="5394960" cy="3540442"/>
+            <wp:docPr id="9" name="Picture 9"/>
+            <wp:cNvGraphicFramePr>
+              <a:graphicFrameLocks noChangeAspect="1"/>
+            </wp:cNvGraphicFramePr>
+            <a:graphic>
+              <a:graphicData uri="http://schemas.openxmlformats.org/drawingml/2006/picture">
+                <pic:pic>
+                  <pic:nvPicPr>
+                    <pic:cNvPr id="0" name="20260902154721-tracking-not-found.png"/>
+                    <pic:cNvPicPr/>
+                  </pic:nvPicPr>
+                  <pic:blipFill>
+                    <a:blip r:embed="rId14"/>
+                    <a:stretch>
+                      <a:fillRect/>
+                    </a:stretch>
+                  </pic:blipFill>
+                  <pic:spPr>
+                    <a:xfrm>
+                      <a:off x="0" y="0"/>
+                      <a:ext cx="5394960" cy="3540442"/>
+                    </a:xfrm>
+                    <a:prstGeom prst="rect"/>
+                  </pic:spPr>
+                </pic:pic>
+              </a:graphicData>
+            </a:graphic>
+          </wp:inline>
+        </w:drawing>
+      </w:r>
+    </w:p>
+    <w:p>
       <w:r>
         <w:rPr>
           <w:rFonts w:ascii="Aptos" w:hAnsi="Aptos" w:eastAsia="Aptos"/>
@@ -1277,9 +1691,55 @@
     <w:p>
       <w:pPr>
         <w:pStyle w:val="Heading2"/>
+        <w:keepNext/>
       </w:pPr>
       <w:r>
         <w:t>9. แนวทางความปลอดภัยของข้อมูล</w:t>
+      </w:r>
+    </w:p>
+    <w:p>
+      <w:pPr>
+        <w:pStyle w:val="Heading3"/>
+        <w:keepNext/>
+      </w:pPr>
+      <w:r>
+        <w:t>ภาพประกอบ: หน้าแบบฟอร์มลงทะเบียนรับตัวอย่าง มะโฮ</w:t>
+      </w:r>
+    </w:p>
+    <w:p>
+      <w:r>
+        <w:drawing>
+          <wp:inline xmlns:a="http://schemas.openxmlformats.org/drawingml/2006/main" xmlns:pic="http://schemas.openxmlformats.org/drawingml/2006/picture">
+            <wp:extent cx="5394960" cy="3540442"/>
+            <wp:docPr id="10" name="Picture 10"/>
+            <wp:cNvGraphicFramePr>
+              <a:graphicFrameLocks noChangeAspect="1"/>
+            </wp:cNvGraphicFramePr>
+            <a:graphic>
+              <a:graphicData uri="http://schemas.openxmlformats.org/drawingml/2006/picture">
+                <pic:pic>
+                  <pic:nvPicPr>
+                    <pic:cNvPr id="0" name="20260902154721-public-registration-form.png"/>
+                    <pic:cNvPicPr/>
+                  </pic:nvPicPr>
+                  <pic:blipFill>
+                    <a:blip r:embed="rId10"/>
+                    <a:stretch>
+                      <a:fillRect/>
+                    </a:stretch>
+                  </pic:blipFill>
+                  <pic:spPr>
+                    <a:xfrm>
+                      <a:off x="0" y="0"/>
+                      <a:ext cx="5394960" cy="3540442"/>
+                    </a:xfrm>
+                    <a:prstGeom prst="rect"/>
+                  </pic:spPr>
+                </pic:pic>
+              </a:graphicData>
+            </a:graphic>
+          </wp:inline>
+        </w:drawing>
       </w:r>
     </w:p>
     <w:p>
@@ -1336,6 +1796,7 @@
     <w:p>
       <w:pPr>
         <w:pStyle w:val="Heading1"/>
+        <w:keepNext w:val="0"/>
       </w:pPr>
       <w:r>
         <w:t>Mahosample Staff User Guide</w:t>
@@ -1352,9 +1813,55 @@
     <w:p>
       <w:pPr>
         <w:pStyle w:val="Heading2"/>
+        <w:keepNext/>
       </w:pPr>
       <w:r>
         <w:t>1. เข้าใช้งาน</w:t>
+      </w:r>
+    </w:p>
+    <w:p>
+      <w:pPr>
+        <w:pStyle w:val="Heading3"/>
+        <w:keepNext/>
+      </w:pPr>
+      <w:r>
+        <w:t>ภาพประกอบ: Dashboard พนักงานหลัง login</w:t>
+      </w:r>
+    </w:p>
+    <w:p>
+      <w:r>
+        <w:drawing>
+          <wp:inline xmlns:a="http://schemas.openxmlformats.org/drawingml/2006/main" xmlns:pic="http://schemas.openxmlformats.org/drawingml/2006/picture">
+            <wp:extent cx="5394960" cy="3540442"/>
+            <wp:docPr id="11" name="Picture 11"/>
+            <wp:cNvGraphicFramePr>
+              <a:graphicFrameLocks noChangeAspect="1"/>
+            </wp:cNvGraphicFramePr>
+            <a:graphic>
+              <a:graphicData uri="http://schemas.openxmlformats.org/drawingml/2006/picture">
+                <pic:pic>
+                  <pic:nvPicPr>
+                    <pic:cNvPr id="0" name="20260902154721-staff-dashboard.png"/>
+                    <pic:cNvPicPr/>
+                  </pic:nvPicPr>
+                  <pic:blipFill>
+                    <a:blip r:embed="rId15"/>
+                    <a:stretch>
+                      <a:fillRect/>
+                    </a:stretch>
+                  </pic:blipFill>
+                  <pic:spPr>
+                    <a:xfrm>
+                      <a:off x="0" y="0"/>
+                      <a:ext cx="5394960" cy="3540442"/>
+                    </a:xfrm>
+                    <a:prstGeom prst="rect"/>
+                  </pic:spPr>
+                </pic:pic>
+              </a:graphicData>
+            </a:graphic>
+          </wp:inline>
+        </w:drawing>
       </w:r>
     </w:p>
     <w:p>
@@ -1417,12 +1924,58 @@
     <w:p>
       <w:pPr>
         <w:pStyle w:val="Heading2"/>
+        <w:keepNext/>
       </w:pPr>
       <w:r>
         <w:t>2. หน้า Dashboard</w:t>
       </w:r>
     </w:p>
     <w:p>
+      <w:pPr>
+        <w:pStyle w:val="Heading3"/>
+        <w:keepNext/>
+      </w:pPr>
+      <w:r>
+        <w:t>ภาพประกอบ: Dashboard พนักงานหลัง login</w:t>
+      </w:r>
+    </w:p>
+    <w:p>
+      <w:r>
+        <w:drawing>
+          <wp:inline xmlns:a="http://schemas.openxmlformats.org/drawingml/2006/main" xmlns:pic="http://schemas.openxmlformats.org/drawingml/2006/picture">
+            <wp:extent cx="5394960" cy="3540442"/>
+            <wp:docPr id="12" name="Picture 12"/>
+            <wp:cNvGraphicFramePr>
+              <a:graphicFrameLocks noChangeAspect="1"/>
+            </wp:cNvGraphicFramePr>
+            <a:graphic>
+              <a:graphicData uri="http://schemas.openxmlformats.org/drawingml/2006/picture">
+                <pic:pic>
+                  <pic:nvPicPr>
+                    <pic:cNvPr id="0" name="20260902154721-staff-dashboard.png"/>
+                    <pic:cNvPicPr/>
+                  </pic:nvPicPr>
+                  <pic:blipFill>
+                    <a:blip r:embed="rId15"/>
+                    <a:stretch>
+                      <a:fillRect/>
+                    </a:stretch>
+                  </pic:blipFill>
+                  <pic:spPr>
+                    <a:xfrm>
+                      <a:off x="0" y="0"/>
+                      <a:ext cx="5394960" cy="3540442"/>
+                    </a:xfrm>
+                    <a:prstGeom prst="rect"/>
+                  </pic:spPr>
+                </pic:pic>
+              </a:graphicData>
+            </a:graphic>
+          </wp:inline>
+        </w:drawing>
+      </w:r>
+    </w:p>
+    <w:p>
       <w:r>
         <w:rPr>
           <w:rFonts w:ascii="Aptos" w:hAnsi="Aptos" w:eastAsia="Aptos"/>
@@ -1526,6 +2079,7 @@
     <w:p>
       <w:pPr>
         <w:pStyle w:val="Heading2"/>
+        <w:keepNext w:val="0"/>
       </w:pPr>
       <w:r>
         <w:t>3. ความหมายของสถานะคำขอ</w:t>
@@ -1667,6 +2221,7 @@
     <w:p>
       <w:pPr>
         <w:pStyle w:val="Heading2"/>
+        <w:keepNext w:val="0"/>
       </w:pPr>
       <w:r>
         <w:t>4. ความหมายของสถานะขนส่ง</w:t>
@@ -1770,9 +2325,55 @@
     <w:p>
       <w:pPr>
         <w:pStyle w:val="Heading2"/>
+        <w:keepNext/>
       </w:pPr>
       <w:r>
         <w:t>5. ปุ่มบันทึกคำขอ</w:t>
+      </w:r>
+    </w:p>
+    <w:p>
+      <w:pPr>
+        <w:pStyle w:val="Heading3"/>
+        <w:keepNext/>
+      </w:pPr>
+      <w:r>
+        <w:t>ภาพประกอบ: Drawer รายละเอียด พร้อมบันทึกคำขอและอัปเดตขนส่ง</w:t>
+      </w:r>
+    </w:p>
+    <w:p>
+      <w:r>
+        <w:drawing>
+          <wp:inline xmlns:a="http://schemas.openxmlformats.org/drawingml/2006/main" xmlns:pic="http://schemas.openxmlformats.org/drawingml/2006/picture">
+            <wp:extent cx="5394960" cy="3540442"/>
+            <wp:docPr id="13" name="Picture 13"/>
+            <wp:cNvGraphicFramePr>
+              <a:graphicFrameLocks noChangeAspect="1"/>
+            </wp:cNvGraphicFramePr>
+            <a:graphic>
+              <a:graphicData uri="http://schemas.openxmlformats.org/drawingml/2006/picture">
+                <pic:pic>
+                  <pic:nvPicPr>
+                    <pic:cNvPr id="0" name="20260902154721-staff-detail-drawer.png"/>
+                    <pic:cNvPicPr/>
+                  </pic:nvPicPr>
+                  <pic:blipFill>
+                    <a:blip r:embed="rId16"/>
+                    <a:stretch>
+                      <a:fillRect/>
+                    </a:stretch>
+                  </pic:blipFill>
+                  <pic:spPr>
+                    <a:xfrm>
+                      <a:off x="0" y="0"/>
+                      <a:ext cx="5394960" cy="3540442"/>
+                    </a:xfrm>
+                    <a:prstGeom prst="rect"/>
+                  </pic:spPr>
+                </pic:pic>
+              </a:graphicData>
+            </a:graphic>
+          </wp:inline>
+        </w:drawing>
       </w:r>
     </w:p>
     <w:p>
@@ -1892,9 +2493,100 @@
     <w:p>
       <w:pPr>
         <w:pStyle w:val="Heading2"/>
+        <w:keepNext/>
       </w:pPr>
       <w:r>
         <w:t>6. ปุ่มอัปเดตขนส่ง</w:t>
+      </w:r>
+    </w:p>
+    <w:p>
+      <w:pPr>
+        <w:pStyle w:val="Heading3"/>
+        <w:keepNext/>
+      </w:pPr>
+      <w:r>
+        <w:t>ภาพประกอบ: Drawer รายละเอียด พร้อมบันทึกคำขอและอัปเดตขนส่ง</w:t>
+      </w:r>
+    </w:p>
+    <w:p>
+      <w:r>
+        <w:drawing>
+          <wp:inline xmlns:a="http://schemas.openxmlformats.org/drawingml/2006/main" xmlns:pic="http://schemas.openxmlformats.org/drawingml/2006/picture">
+            <wp:extent cx="5394960" cy="3540442"/>
+            <wp:docPr id="14" name="Picture 14"/>
+            <wp:cNvGraphicFramePr>
+              <a:graphicFrameLocks noChangeAspect="1"/>
+            </wp:cNvGraphicFramePr>
+            <a:graphic>
+              <a:graphicData uri="http://schemas.openxmlformats.org/drawingml/2006/picture">
+                <pic:pic>
+                  <pic:nvPicPr>
+                    <pic:cNvPr id="0" name="20260902154721-staff-detail-drawer.png"/>
+                    <pic:cNvPicPr/>
+                  </pic:nvPicPr>
+                  <pic:blipFill>
+                    <a:blip r:embed="rId16"/>
+                    <a:stretch>
+                      <a:fillRect/>
+                    </a:stretch>
+                  </pic:blipFill>
+                  <pic:spPr>
+                    <a:xfrm>
+                      <a:off x="0" y="0"/>
+                      <a:ext cx="5394960" cy="3540442"/>
+                    </a:xfrm>
+                    <a:prstGeom prst="rect"/>
+                  </pic:spPr>
+                </pic:pic>
+              </a:graphicData>
+            </a:graphic>
+          </wp:inline>
+        </w:drawing>
+      </w:r>
+    </w:p>
+    <w:p>
+      <w:pPr>
+        <w:pStyle w:val="Heading3"/>
+        <w:keepNext/>
+      </w:pPr>
+      <w:r>
+        <w:t>ภาพประกอบ: Tracking URL แสดงเป็น link คลิกได้</w:t>
+      </w:r>
+    </w:p>
+    <w:p>
+      <w:r>
+        <w:drawing>
+          <wp:inline xmlns:a="http://schemas.openxmlformats.org/drawingml/2006/main" xmlns:pic="http://schemas.openxmlformats.org/drawingml/2006/picture">
+            <wp:extent cx="5394960" cy="3540442"/>
+            <wp:docPr id="15" name="Picture 15"/>
+            <wp:cNvGraphicFramePr>
+              <a:graphicFrameLocks noChangeAspect="1"/>
+            </wp:cNvGraphicFramePr>
+            <a:graphic>
+              <a:graphicData uri="http://schemas.openxmlformats.org/drawingml/2006/picture">
+                <pic:pic>
+                  <pic:nvPicPr>
+                    <pic:cNvPr id="0" name="20260902154721-staff-tracking-url-link.png"/>
+                    <pic:cNvPicPr/>
+                  </pic:nvPicPr>
+                  <pic:blipFill>
+                    <a:blip r:embed="rId17"/>
+                    <a:stretch>
+                      <a:fillRect/>
+                    </a:stretch>
+                  </pic:blipFill>
+                  <pic:spPr>
+                    <a:xfrm>
+                      <a:off x="0" y="0"/>
+                      <a:ext cx="5394960" cy="3540442"/>
+                    </a:xfrm>
+                    <a:prstGeom prst="rect"/>
+                  </pic:spPr>
+                </pic:pic>
+              </a:graphicData>
+            </a:graphic>
+          </wp:inline>
+        </w:drawing>
       </w:r>
     </w:p>
     <w:p>
@@ -2022,9 +2714,55 @@
     <w:p>
       <w:pPr>
         <w:pStyle w:val="Heading2"/>
+        <w:keepNext/>
       </w:pPr>
       <w:r>
         <w:t>7. หน้าตารางข้อมูลเต็ม</w:t>
+      </w:r>
+    </w:p>
+    <w:p>
+      <w:pPr>
+        <w:pStyle w:val="Heading3"/>
+        <w:keepNext/>
+      </w:pPr>
+      <w:r>
+        <w:t>ภาพประกอบ: หน้าตารางข้อมูลเต็ม แสดง column ข้อมูลทั้งหมด</w:t>
+      </w:r>
+    </w:p>
+    <w:p>
+      <w:r>
+        <w:drawing>
+          <wp:inline xmlns:a="http://schemas.openxmlformats.org/drawingml/2006/main" xmlns:pic="http://schemas.openxmlformats.org/drawingml/2006/picture">
+            <wp:extent cx="5394960" cy="3540442"/>
+            <wp:docPr id="16" name="Picture 16"/>
+            <wp:cNvGraphicFramePr>
+              <a:graphicFrameLocks noChangeAspect="1"/>
+            </wp:cNvGraphicFramePr>
+            <a:graphic>
+              <a:graphicData uri="http://schemas.openxmlformats.org/drawingml/2006/picture">
+                <pic:pic>
+                  <pic:nvPicPr>
+                    <pic:cNvPr id="0" name="20260902154721-staff-full-table.png"/>
+                    <pic:cNvPicPr/>
+                  </pic:nvPicPr>
+                  <pic:blipFill>
+                    <a:blip r:embed="rId18"/>
+                    <a:stretch>
+                      <a:fillRect/>
+                    </a:stretch>
+                  </pic:blipFill>
+                  <pic:spPr>
+                    <a:xfrm>
+                      <a:off x="0" y="0"/>
+                      <a:ext cx="5394960" cy="3540442"/>
+                    </a:xfrm>
+                    <a:prstGeom prst="rect"/>
+                  </pic:spPr>
+                </pic:pic>
+              </a:graphicData>
+            </a:graphic>
+          </wp:inline>
+        </w:drawing>
       </w:r>
     </w:p>
     <w:p>
@@ -2194,9 +2932,145 @@
     <w:p>
       <w:pPr>
         <w:pStyle w:val="Heading2"/>
+        <w:keepNext/>
       </w:pPr>
       <w:r>
         <w:t>8. การค้นหาและจัดเรียงในตาราง</w:t>
+      </w:r>
+    </w:p>
+    <w:p>
+      <w:pPr>
+        <w:pStyle w:val="Heading3"/>
+        <w:keepNext/>
+      </w:pPr>
+      <w:r>
+        <w:t>ภาพประกอบ: Filter header ตารางด้วยจังหวัด</w:t>
+      </w:r>
+    </w:p>
+    <w:p>
+      <w:r>
+        <w:drawing>
+          <wp:inline xmlns:a="http://schemas.openxmlformats.org/drawingml/2006/main" xmlns:pic="http://schemas.openxmlformats.org/drawingml/2006/picture">
+            <wp:extent cx="5394960" cy="3540442"/>
+            <wp:docPr id="17" name="Picture 17"/>
+            <wp:cNvGraphicFramePr>
+              <a:graphicFrameLocks noChangeAspect="1"/>
+            </wp:cNvGraphicFramePr>
+            <a:graphic>
+              <a:graphicData uri="http://schemas.openxmlformats.org/drawingml/2006/picture">
+                <pic:pic>
+                  <pic:nvPicPr>
+                    <pic:cNvPr id="0" name="20260902154721-staff-filter-province.png"/>
+                    <pic:cNvPicPr/>
+                  </pic:nvPicPr>
+                  <pic:blipFill>
+                    <a:blip r:embed="rId19"/>
+                    <a:stretch>
+                      <a:fillRect/>
+                    </a:stretch>
+                  </pic:blipFill>
+                  <pic:spPr>
+                    <a:xfrm>
+                      <a:off x="0" y="0"/>
+                      <a:ext cx="5394960" cy="3540442"/>
+                    </a:xfrm>
+                    <a:prstGeom prst="rect"/>
+                  </pic:spPr>
+                </pic:pic>
+              </a:graphicData>
+            </a:graphic>
+          </wp:inline>
+        </w:drawing>
+      </w:r>
+    </w:p>
+    <w:p>
+      <w:pPr>
+        <w:pStyle w:val="Heading3"/>
+        <w:keepNext/>
+      </w:pPr>
+      <w:r>
+        <w:t>ภาพประกอบ: Filter วันที่ส่งและวันที่ลงทะเบียนแบบช่วงเวลา</w:t>
+      </w:r>
+    </w:p>
+    <w:p>
+      <w:r>
+        <w:drawing>
+          <wp:inline xmlns:a="http://schemas.openxmlformats.org/drawingml/2006/main" xmlns:pic="http://schemas.openxmlformats.org/drawingml/2006/picture">
+            <wp:extent cx="5394960" cy="3540442"/>
+            <wp:docPr id="18" name="Picture 18"/>
+            <wp:cNvGraphicFramePr>
+              <a:graphicFrameLocks noChangeAspect="1"/>
+            </wp:cNvGraphicFramePr>
+            <a:graphic>
+              <a:graphicData uri="http://schemas.openxmlformats.org/drawingml/2006/picture">
+                <pic:pic>
+                  <pic:nvPicPr>
+                    <pic:cNvPr id="0" name="20260902154721-staff-date-range-filter.png"/>
+                    <pic:cNvPicPr/>
+                  </pic:nvPicPr>
+                  <pic:blipFill>
+                    <a:blip r:embed="rId20"/>
+                    <a:stretch>
+                      <a:fillRect/>
+                    </a:stretch>
+                  </pic:blipFill>
+                  <pic:spPr>
+                    <a:xfrm>
+                      <a:off x="0" y="0"/>
+                      <a:ext cx="5394960" cy="3540442"/>
+                    </a:xfrm>
+                    <a:prstGeom prst="rect"/>
+                  </pic:spPr>
+                </pic:pic>
+              </a:graphicData>
+            </a:graphic>
+          </wp:inline>
+        </w:drawing>
+      </w:r>
+    </w:p>
+    <w:p>
+      <w:pPr>
+        <w:pStyle w:val="Heading3"/>
+        <w:keepNext/>
+      </w:pPr>
+      <w:r>
+        <w:t>ภาพประกอบ: Sorting จาก header ตาราง</w:t>
+      </w:r>
+    </w:p>
+    <w:p>
+      <w:r>
+        <w:drawing>
+          <wp:inline xmlns:a="http://schemas.openxmlformats.org/drawingml/2006/main" xmlns:pic="http://schemas.openxmlformats.org/drawingml/2006/picture">
+            <wp:extent cx="5394960" cy="3540442"/>
+            <wp:docPr id="19" name="Picture 19"/>
+            <wp:cNvGraphicFramePr>
+              <a:graphicFrameLocks noChangeAspect="1"/>
+            </wp:cNvGraphicFramePr>
+            <a:graphic>
+              <a:graphicData uri="http://schemas.openxmlformats.org/drawingml/2006/picture">
+                <pic:pic>
+                  <pic:nvPicPr>
+                    <pic:cNvPr id="0" name="20260902154721-staff-sorting.png"/>
+                    <pic:cNvPicPr/>
+                  </pic:nvPicPr>
+                  <pic:blipFill>
+                    <a:blip r:embed="rId21"/>
+                    <a:stretch>
+                      <a:fillRect/>
+                    </a:stretch>
+                  </pic:blipFill>
+                  <pic:spPr>
+                    <a:xfrm>
+                      <a:off x="0" y="0"/>
+                      <a:ext cx="5394960" cy="3540442"/>
+                    </a:xfrm>
+                    <a:prstGeom prst="rect"/>
+                  </pic:spPr>
+                </pic:pic>
+              </a:graphicData>
+            </a:graphic>
+          </wp:inline>
+        </w:drawing>
       </w:r>
     </w:p>
     <w:p>
@@ -2325,9 +3199,55 @@
     <w:p>
       <w:pPr>
         <w:pStyle w:val="Heading2"/>
+        <w:keepNext/>
       </w:pPr>
       <w:r>
         <w:t>9. Tracking URL</w:t>
+      </w:r>
+    </w:p>
+    <w:p>
+      <w:pPr>
+        <w:pStyle w:val="Heading3"/>
+        <w:keepNext/>
+      </w:pPr>
+      <w:r>
+        <w:t>ภาพประกอบ: Tracking URL แสดงเป็น link คลิกได้</w:t>
+      </w:r>
+    </w:p>
+    <w:p>
+      <w:r>
+        <w:drawing>
+          <wp:inline xmlns:a="http://schemas.openxmlformats.org/drawingml/2006/main" xmlns:pic="http://schemas.openxmlformats.org/drawingml/2006/picture">
+            <wp:extent cx="5394960" cy="3540442"/>
+            <wp:docPr id="20" name="Picture 20"/>
+            <wp:cNvGraphicFramePr>
+              <a:graphicFrameLocks noChangeAspect="1"/>
+            </wp:cNvGraphicFramePr>
+            <a:graphic>
+              <a:graphicData uri="http://schemas.openxmlformats.org/drawingml/2006/picture">
+                <pic:pic>
+                  <pic:nvPicPr>
+                    <pic:cNvPr id="0" name="20260902154721-staff-tracking-url-link.png"/>
+                    <pic:cNvPicPr/>
+                  </pic:nvPicPr>
+                  <pic:blipFill>
+                    <a:blip r:embed="rId17"/>
+                    <a:stretch>
+                      <a:fillRect/>
+                    </a:stretch>
+                  </pic:blipFill>
+                  <pic:spPr>
+                    <a:xfrm>
+                      <a:off x="0" y="0"/>
+                      <a:ext cx="5394960" cy="3540442"/>
+                    </a:xfrm>
+                    <a:prstGeom prst="rect"/>
+                  </pic:spPr>
+                </pic:pic>
+              </a:graphicData>
+            </a:graphic>
+          </wp:inline>
+        </w:drawing>
       </w:r>
     </w:p>
     <w:p>
@@ -2373,9 +3293,55 @@
     <w:p>
       <w:pPr>
         <w:pStyle w:val="Heading2"/>
+        <w:keepNext/>
       </w:pPr>
       <w:r>
         <w:t>10. Export CSV สำหรับไปรษณีย์</w:t>
+      </w:r>
+    </w:p>
+    <w:p>
+      <w:pPr>
+        <w:pStyle w:val="Heading3"/>
+        <w:keepNext/>
+      </w:pPr>
+      <w:r>
+        <w:t>ภาพประกอบ: Export CSV จากหน้าพนักงาน</w:t>
+      </w:r>
+    </w:p>
+    <w:p>
+      <w:r>
+        <w:drawing>
+          <wp:inline xmlns:a="http://schemas.openxmlformats.org/drawingml/2006/main" xmlns:pic="http://schemas.openxmlformats.org/drawingml/2006/picture">
+            <wp:extent cx="5394960" cy="3540442"/>
+            <wp:docPr id="21" name="Picture 21"/>
+            <wp:cNvGraphicFramePr>
+              <a:graphicFrameLocks noChangeAspect="1"/>
+            </wp:cNvGraphicFramePr>
+            <a:graphic>
+              <a:graphicData uri="http://schemas.openxmlformats.org/drawingml/2006/picture">
+                <pic:pic>
+                  <pic:nvPicPr>
+                    <pic:cNvPr id="0" name="20260902154721-staff-export.png"/>
+                    <pic:cNvPicPr/>
+                  </pic:nvPicPr>
+                  <pic:blipFill>
+                    <a:blip r:embed="rId22"/>
+                    <a:stretch>
+                      <a:fillRect/>
+                    </a:stretch>
+                  </pic:blipFill>
+                  <pic:spPr>
+                    <a:xfrm>
+                      <a:off x="0" y="0"/>
+                      <a:ext cx="5394960" cy="3540442"/>
+                    </a:xfrm>
+                    <a:prstGeom prst="rect"/>
+                  </pic:spPr>
+                </pic:pic>
+              </a:graphicData>
+            </a:graphic>
+          </wp:inline>
+        </w:drawing>
       </w:r>
     </w:p>
     <w:p>
@@ -2520,9 +3486,55 @@
     <w:p>
       <w:pPr>
         <w:pStyle w:val="Heading2"/>
+        <w:keepNext/>
       </w:pPr>
       <w:r>
         <w:t>11. Import tracking กลับเข้าระบบ</w:t>
+      </w:r>
+    </w:p>
+    <w:p>
+      <w:pPr>
+        <w:pStyle w:val="Heading3"/>
+        <w:keepNext/>
+      </w:pPr>
+      <w:r>
+        <w:t>ภาพประกอบ: หน้าตารางข้อมูลเต็ม แสดง column ข้อมูลทั้งหมด</w:t>
+      </w:r>
+    </w:p>
+    <w:p>
+      <w:r>
+        <w:drawing>
+          <wp:inline xmlns:a="http://schemas.openxmlformats.org/drawingml/2006/main" xmlns:pic="http://schemas.openxmlformats.org/drawingml/2006/picture">
+            <wp:extent cx="5394960" cy="3540442"/>
+            <wp:docPr id="22" name="Picture 22"/>
+            <wp:cNvGraphicFramePr>
+              <a:graphicFrameLocks noChangeAspect="1"/>
+            </wp:cNvGraphicFramePr>
+            <a:graphic>
+              <a:graphicData uri="http://schemas.openxmlformats.org/drawingml/2006/picture">
+                <pic:pic>
+                  <pic:nvPicPr>
+                    <pic:cNvPr id="0" name="20260902154721-staff-full-table.png"/>
+                    <pic:cNvPicPr/>
+                  </pic:nvPicPr>
+                  <pic:blipFill>
+                    <a:blip r:embed="rId18"/>
+                    <a:stretch>
+                      <a:fillRect/>
+                    </a:stretch>
+                  </pic:blipFill>
+                  <pic:spPr>
+                    <a:xfrm>
+                      <a:off x="0" y="0"/>
+                      <a:ext cx="5394960" cy="3540442"/>
+                    </a:xfrm>
+                    <a:prstGeom prst="rect"/>
+                  </pic:spPr>
+                </pic:pic>
+              </a:graphicData>
+            </a:graphic>
+          </wp:inline>
+        </w:drawing>
       </w:r>
     </w:p>
     <w:p>
@@ -2769,9 +3781,55 @@
     <w:p>
       <w:pPr>
         <w:pStyle w:val="Heading2"/>
+        <w:keepNext/>
       </w:pPr>
       <w:r>
         <w:t>12. เช็คสถานะให้ลูกค้า</w:t>
+      </w:r>
+    </w:p>
+    <w:p>
+      <w:pPr>
+        <w:pStyle w:val="Heading3"/>
+        <w:keepNext/>
+      </w:pPr>
+      <w:r>
+        <w:t>ภาพประกอบ: หน้าเช็คสถานะพบเลข tracking และ Tracking URL</w:t>
+      </w:r>
+    </w:p>
+    <w:p>
+      <w:r>
+        <w:drawing>
+          <wp:inline xmlns:a="http://schemas.openxmlformats.org/drawingml/2006/main" xmlns:pic="http://schemas.openxmlformats.org/drawingml/2006/picture">
+            <wp:extent cx="5394960" cy="3540442"/>
+            <wp:docPr id="23" name="Picture 23"/>
+            <wp:cNvGraphicFramePr>
+              <a:graphicFrameLocks noChangeAspect="1"/>
+            </wp:cNvGraphicFramePr>
+            <a:graphic>
+              <a:graphicData uri="http://schemas.openxmlformats.org/drawingml/2006/picture">
+                <pic:pic>
+                  <pic:nvPicPr>
+                    <pic:cNvPr id="0" name="20260902154721-tracking-found.png"/>
+                    <pic:cNvPicPr/>
+                  </pic:nvPicPr>
+                  <pic:blipFill>
+                    <a:blip r:embed="rId13"/>
+                    <a:stretch>
+                      <a:fillRect/>
+                    </a:stretch>
+                  </pic:blipFill>
+                  <pic:spPr>
+                    <a:xfrm>
+                      <a:off x="0" y="0"/>
+                      <a:ext cx="5394960" cy="3540442"/>
+                    </a:xfrm>
+                    <a:prstGeom prst="rect"/>
+                  </pic:spPr>
+                </pic:pic>
+              </a:graphicData>
+            </a:graphic>
+          </wp:inline>
+        </w:drawing>
       </w:r>
     </w:p>
     <w:p>
@@ -2823,6 +3881,7 @@
     <w:p>
       <w:pPr>
         <w:pStyle w:val="Heading2"/>
+        <w:keepNext w:val="0"/>
       </w:pPr>
       <w:r>
         <w:t>13. แนวทางปฏิบัติเรื่องข้อมูลส่วนบุคคล</w:t>
@@ -2886,9 +3945,55 @@
     <w:p>
       <w:pPr>
         <w:pStyle w:val="Heading2"/>
+        <w:keepNext/>
       </w:pPr>
       <w:r>
         <w:t>14. ปัญหาที่พบบ่อย</w:t>
+      </w:r>
+    </w:p>
+    <w:p>
+      <w:pPr>
+        <w:pStyle w:val="Heading3"/>
+        <w:keepNext/>
+      </w:pPr>
+      <w:r>
+        <w:t>ภาพประกอบ: หน้าตารางข้อมูลเต็ม แสดง column ข้อมูลทั้งหมด</w:t>
+      </w:r>
+    </w:p>
+    <w:p>
+      <w:r>
+        <w:drawing>
+          <wp:inline xmlns:a="http://schemas.openxmlformats.org/drawingml/2006/main" xmlns:pic="http://schemas.openxmlformats.org/drawingml/2006/picture">
+            <wp:extent cx="5394960" cy="3540442"/>
+            <wp:docPr id="24" name="Picture 24"/>
+            <wp:cNvGraphicFramePr>
+              <a:graphicFrameLocks noChangeAspect="1"/>
+            </wp:cNvGraphicFramePr>
+            <a:graphic>
+              <a:graphicData uri="http://schemas.openxmlformats.org/drawingml/2006/picture">
+                <pic:pic>
+                  <pic:nvPicPr>
+                    <pic:cNvPr id="0" name="20260902154721-staff-full-table.png"/>
+                    <pic:cNvPicPr/>
+                  </pic:nvPicPr>
+                  <pic:blipFill>
+                    <a:blip r:embed="rId18"/>
+                    <a:stretch>
+                      <a:fillRect/>
+                    </a:stretch>
+                  </pic:blipFill>
+                  <pic:spPr>
+                    <a:xfrm>
+                      <a:off x="0" y="0"/>
+                      <a:ext cx="5394960" cy="3540442"/>
+                    </a:xfrm>
+                    <a:prstGeom prst="rect"/>
+                  </pic:spPr>
+                </pic:pic>
+              </a:graphicData>
+            </a:graphic>
+          </wp:inline>
+        </w:drawing>
       </w:r>
     </w:p>
     <w:p>
@@ -3052,6 +4157,7 @@
     <w:p>
       <w:pPr>
         <w:pStyle w:val="Heading1"/>
+        <w:keepNext w:val="0"/>
       </w:pPr>
       <w:r>
         <w:t>Mahosample Test Cases</w:t>
@@ -3068,6 +4174,7 @@
     <w:p>
       <w:pPr>
         <w:pStyle w:val="Heading2"/>
+        <w:keepNext w:val="0"/>
       </w:pPr>
       <w:r>
         <w:t>ขอบเขตการทดสอบ</w:t>
@@ -3175,6 +4282,7 @@
     <w:p>
       <w:pPr>
         <w:pStyle w:val="Heading2"/>
+        <w:keepNext w:val="0"/>
       </w:pPr>
       <w:r>
         <w:t>ข้อมูลทดสอบ</w:t>
@@ -3248,9 +4356,100 @@
     <w:p>
       <w:pPr>
         <w:pStyle w:val="Heading2"/>
+        <w:keepNext/>
       </w:pPr>
       <w:r>
         <w:t>TC-PUB-001 ส่งแบบฟอร์มลงทะเบียนสำเร็จ</w:t>
+      </w:r>
+    </w:p>
+    <w:p>
+      <w:pPr>
+        <w:pStyle w:val="Heading3"/>
+        <w:keepNext/>
+      </w:pPr>
+      <w:r>
+        <w:t>ภาพประกอบ: หน้าแบบฟอร์มลงทะเบียนรับตัวอย่าง มะโฮ</w:t>
+      </w:r>
+    </w:p>
+    <w:p>
+      <w:r>
+        <w:drawing>
+          <wp:inline xmlns:a="http://schemas.openxmlformats.org/drawingml/2006/main" xmlns:pic="http://schemas.openxmlformats.org/drawingml/2006/picture">
+            <wp:extent cx="5394960" cy="3540442"/>
+            <wp:docPr id="25" name="Picture 25"/>
+            <wp:cNvGraphicFramePr>
+              <a:graphicFrameLocks noChangeAspect="1"/>
+            </wp:cNvGraphicFramePr>
+            <a:graphic>
+              <a:graphicData uri="http://schemas.openxmlformats.org/drawingml/2006/picture">
+                <pic:pic>
+                  <pic:nvPicPr>
+                    <pic:cNvPr id="0" name="20260902154721-public-registration-form.png"/>
+                    <pic:cNvPicPr/>
+                  </pic:nvPicPr>
+                  <pic:blipFill>
+                    <a:blip r:embed="rId10"/>
+                    <a:stretch>
+                      <a:fillRect/>
+                    </a:stretch>
+                  </pic:blipFill>
+                  <pic:spPr>
+                    <a:xfrm>
+                      <a:off x="0" y="0"/>
+                      <a:ext cx="5394960" cy="3540442"/>
+                    </a:xfrm>
+                    <a:prstGeom prst="rect"/>
+                  </pic:spPr>
+                </pic:pic>
+              </a:graphicData>
+            </a:graphic>
+          </wp:inline>
+        </w:drawing>
+      </w:r>
+    </w:p>
+    <w:p>
+      <w:pPr>
+        <w:pStyle w:val="Heading3"/>
+        <w:keepNext/>
+      </w:pPr>
+      <w:r>
+        <w:t>ภาพประกอบ: Success card หลังส่งฟอร์ม พร้อมเลขรายการภายใน</w:t>
+      </w:r>
+    </w:p>
+    <w:p>
+      <w:r>
+        <w:drawing>
+          <wp:inline xmlns:a="http://schemas.openxmlformats.org/drawingml/2006/main" xmlns:pic="http://schemas.openxmlformats.org/drawingml/2006/picture">
+            <wp:extent cx="5394960" cy="3540442"/>
+            <wp:docPr id="26" name="Picture 26"/>
+            <wp:cNvGraphicFramePr>
+              <a:graphicFrameLocks noChangeAspect="1"/>
+            </wp:cNvGraphicFramePr>
+            <a:graphic>
+              <a:graphicData uri="http://schemas.openxmlformats.org/drawingml/2006/picture">
+                <pic:pic>
+                  <pic:nvPicPr>
+                    <pic:cNvPr id="0" name="20260902154721-public-success-card.png"/>
+                    <pic:cNvPicPr/>
+                  </pic:nvPicPr>
+                  <pic:blipFill>
+                    <a:blip r:embed="rId12"/>
+                    <a:stretch>
+                      <a:fillRect/>
+                    </a:stretch>
+                  </pic:blipFill>
+                  <pic:spPr>
+                    <a:xfrm>
+                      <a:off x="0" y="0"/>
+                      <a:ext cx="5394960" cy="3540442"/>
+                    </a:xfrm>
+                    <a:prstGeom prst="rect"/>
+                  </pic:spPr>
+                </pic:pic>
+              </a:graphicData>
+            </a:graphic>
+          </wp:inline>
+        </w:drawing>
       </w:r>
     </w:p>
     <w:p>
@@ -3475,12 +4674,58 @@
     <w:p>
       <w:pPr>
         <w:pStyle w:val="Heading2"/>
+        <w:keepNext/>
       </w:pPr>
       <w:r>
         <w:t>TC-PUB-002 ตรวจ validation เมื่อไม่กรอกช่องทางติดต่อ</w:t>
       </w:r>
     </w:p>
     <w:p>
+      <w:pPr>
+        <w:pStyle w:val="Heading3"/>
+        <w:keepNext/>
+      </w:pPr>
+      <w:r>
+        <w:t>ภาพประกอบ: Validation เมื่อไม่กรอกช่องทางติดต่อ</w:t>
+      </w:r>
+    </w:p>
+    <w:p>
+      <w:r>
+        <w:drawing>
+          <wp:inline xmlns:a="http://schemas.openxmlformats.org/drawingml/2006/main" xmlns:pic="http://schemas.openxmlformats.org/drawingml/2006/picture">
+            <wp:extent cx="5394960" cy="3540442"/>
+            <wp:docPr id="27" name="Picture 27"/>
+            <wp:cNvGraphicFramePr>
+              <a:graphicFrameLocks noChangeAspect="1"/>
+            </wp:cNvGraphicFramePr>
+            <a:graphic>
+              <a:graphicData uri="http://schemas.openxmlformats.org/drawingml/2006/picture">
+                <pic:pic>
+                  <pic:nvPicPr>
+                    <pic:cNvPr id="0" name="20260902154721-public-contact-validation.png"/>
+                    <pic:cNvPicPr/>
+                  </pic:nvPicPr>
+                  <pic:blipFill>
+                    <a:blip r:embed="rId11"/>
+                    <a:stretch>
+                      <a:fillRect/>
+                    </a:stretch>
+                  </pic:blipFill>
+                  <pic:spPr>
+                    <a:xfrm>
+                      <a:off x="0" y="0"/>
+                      <a:ext cx="5394960" cy="3540442"/>
+                    </a:xfrm>
+                    <a:prstGeom prst="rect"/>
+                  </pic:spPr>
+                </pic:pic>
+              </a:graphicData>
+            </a:graphic>
+          </wp:inline>
+        </w:drawing>
+      </w:r>
+    </w:p>
+    <w:p>
       <w:r>
         <w:rPr>
           <w:rFonts w:ascii="Aptos" w:hAnsi="Aptos" w:eastAsia="Aptos"/>
@@ -3573,12 +4818,58 @@
     <w:p>
       <w:pPr>
         <w:pStyle w:val="Heading2"/>
+        <w:keepNext/>
       </w:pPr>
       <w:r>
         <w:t>TC-PUB-003 ตรวจ validation เบอร์โทรศัพท์</w:t>
       </w:r>
     </w:p>
     <w:p>
+      <w:pPr>
+        <w:pStyle w:val="Heading3"/>
+        <w:keepNext/>
+      </w:pPr>
+      <w:r>
+        <w:t>ภาพประกอบ: Validation เมื่อไม่กรอกช่องทางติดต่อ</w:t>
+      </w:r>
+    </w:p>
+    <w:p>
+      <w:r>
+        <w:drawing>
+          <wp:inline xmlns:a="http://schemas.openxmlformats.org/drawingml/2006/main" xmlns:pic="http://schemas.openxmlformats.org/drawingml/2006/picture">
+            <wp:extent cx="5394960" cy="3540442"/>
+            <wp:docPr id="28" name="Picture 28"/>
+            <wp:cNvGraphicFramePr>
+              <a:graphicFrameLocks noChangeAspect="1"/>
+            </wp:cNvGraphicFramePr>
+            <a:graphic>
+              <a:graphicData uri="http://schemas.openxmlformats.org/drawingml/2006/picture">
+                <pic:pic>
+                  <pic:nvPicPr>
+                    <pic:cNvPr id="0" name="20260902154721-public-contact-validation.png"/>
+                    <pic:cNvPicPr/>
+                  </pic:nvPicPr>
+                  <pic:blipFill>
+                    <a:blip r:embed="rId11"/>
+                    <a:stretch>
+                      <a:fillRect/>
+                    </a:stretch>
+                  </pic:blipFill>
+                  <pic:spPr>
+                    <a:xfrm>
+                      <a:off x="0" y="0"/>
+                      <a:ext cx="5394960" cy="3540442"/>
+                    </a:xfrm>
+                    <a:prstGeom prst="rect"/>
+                  </pic:spPr>
+                </pic:pic>
+              </a:graphicData>
+            </a:graphic>
+          </wp:inline>
+        </w:drawing>
+      </w:r>
+    </w:p>
+    <w:p>
       <w:r>
         <w:rPr>
           <w:rFonts w:ascii="Aptos" w:hAnsi="Aptos" w:eastAsia="Aptos"/>
@@ -3641,12 +4932,58 @@
     <w:p>
       <w:pPr>
         <w:pStyle w:val="Heading2"/>
+        <w:keepNext/>
       </w:pPr>
       <w:r>
         <w:t>TC-PUB-004 ตรวจ validation รหัสไปรษณีย์</w:t>
       </w:r>
     </w:p>
     <w:p>
+      <w:pPr>
+        <w:pStyle w:val="Heading3"/>
+        <w:keepNext/>
+      </w:pPr>
+      <w:r>
+        <w:t>ภาพประกอบ: Validation เมื่อไม่กรอกช่องทางติดต่อ</w:t>
+      </w:r>
+    </w:p>
+    <w:p>
+      <w:r>
+        <w:drawing>
+          <wp:inline xmlns:a="http://schemas.openxmlformats.org/drawingml/2006/main" xmlns:pic="http://schemas.openxmlformats.org/drawingml/2006/picture">
+            <wp:extent cx="5394960" cy="3540442"/>
+            <wp:docPr id="29" name="Picture 29"/>
+            <wp:cNvGraphicFramePr>
+              <a:graphicFrameLocks noChangeAspect="1"/>
+            </wp:cNvGraphicFramePr>
+            <a:graphic>
+              <a:graphicData uri="http://schemas.openxmlformats.org/drawingml/2006/picture">
+                <pic:pic>
+                  <pic:nvPicPr>
+                    <pic:cNvPr id="0" name="20260902154721-public-contact-validation.png"/>
+                    <pic:cNvPicPr/>
+                  </pic:nvPicPr>
+                  <pic:blipFill>
+                    <a:blip r:embed="rId11"/>
+                    <a:stretch>
+                      <a:fillRect/>
+                    </a:stretch>
+                  </pic:blipFill>
+                  <pic:spPr>
+                    <a:xfrm>
+                      <a:off x="0" y="0"/>
+                      <a:ext cx="5394960" cy="3540442"/>
+                    </a:xfrm>
+                    <a:prstGeom prst="rect"/>
+                  </pic:spPr>
+                </pic:pic>
+              </a:graphicData>
+            </a:graphic>
+          </wp:inline>
+        </w:drawing>
+      </w:r>
+    </w:p>
+    <w:p>
       <w:r>
         <w:rPr>
           <w:rFonts w:ascii="Aptos" w:hAnsi="Aptos" w:eastAsia="Aptos"/>
@@ -3709,12 +5046,58 @@
     <w:p>
       <w:pPr>
         <w:pStyle w:val="Heading2"/>
+        <w:keepNext/>
       </w:pPr>
       <w:r>
         <w:t>TC-PUB-005 ตรวจ validation PDPA</w:t>
       </w:r>
     </w:p>
     <w:p>
+      <w:pPr>
+        <w:pStyle w:val="Heading3"/>
+        <w:keepNext/>
+      </w:pPr>
+      <w:r>
+        <w:t>ภาพประกอบ: Validation เมื่อไม่กรอกช่องทางติดต่อ</w:t>
+      </w:r>
+    </w:p>
+    <w:p>
+      <w:r>
+        <w:drawing>
+          <wp:inline xmlns:a="http://schemas.openxmlformats.org/drawingml/2006/main" xmlns:pic="http://schemas.openxmlformats.org/drawingml/2006/picture">
+            <wp:extent cx="5394960" cy="3540442"/>
+            <wp:docPr id="30" name="Picture 30"/>
+            <wp:cNvGraphicFramePr>
+              <a:graphicFrameLocks noChangeAspect="1"/>
+            </wp:cNvGraphicFramePr>
+            <a:graphic>
+              <a:graphicData uri="http://schemas.openxmlformats.org/drawingml/2006/picture">
+                <pic:pic>
+                  <pic:nvPicPr>
+                    <pic:cNvPr id="0" name="20260902154721-public-contact-validation.png"/>
+                    <pic:cNvPicPr/>
+                  </pic:nvPicPr>
+                  <pic:blipFill>
+                    <a:blip r:embed="rId11"/>
+                    <a:stretch>
+                      <a:fillRect/>
+                    </a:stretch>
+                  </pic:blipFill>
+                  <pic:spPr>
+                    <a:xfrm>
+                      <a:off x="0" y="0"/>
+                      <a:ext cx="5394960" cy="3540442"/>
+                    </a:xfrm>
+                    <a:prstGeom prst="rect"/>
+                  </pic:spPr>
+                </pic:pic>
+              </a:graphicData>
+            </a:graphic>
+          </wp:inline>
+        </w:drawing>
+      </w:r>
+    </w:p>
+    <w:p>
       <w:r>
         <w:rPr>
           <w:rFonts w:ascii="Aptos" w:hAnsi="Aptos" w:eastAsia="Aptos"/>
@@ -3788,12 +5171,58 @@
     <w:p>
       <w:pPr>
         <w:pStyle w:val="Heading2"/>
+        <w:keepNext/>
       </w:pPr>
       <w:r>
         <w:t>TC-PUB-006 ตรวจ duplicate เบอร์โทรศัพท์</w:t>
       </w:r>
     </w:p>
     <w:p>
+      <w:pPr>
+        <w:pStyle w:val="Heading3"/>
+        <w:keepNext/>
+      </w:pPr>
+      <w:r>
+        <w:t>ภาพประกอบ: Validation เมื่อไม่กรอกช่องทางติดต่อ</w:t>
+      </w:r>
+    </w:p>
+    <w:p>
+      <w:r>
+        <w:drawing>
+          <wp:inline xmlns:a="http://schemas.openxmlformats.org/drawingml/2006/main" xmlns:pic="http://schemas.openxmlformats.org/drawingml/2006/picture">
+            <wp:extent cx="5394960" cy="3540442"/>
+            <wp:docPr id="31" name="Picture 31"/>
+            <wp:cNvGraphicFramePr>
+              <a:graphicFrameLocks noChangeAspect="1"/>
+            </wp:cNvGraphicFramePr>
+            <a:graphic>
+              <a:graphicData uri="http://schemas.openxmlformats.org/drawingml/2006/picture">
+                <pic:pic>
+                  <pic:nvPicPr>
+                    <pic:cNvPr id="0" name="20260902154721-public-contact-validation.png"/>
+                    <pic:cNvPicPr/>
+                  </pic:nvPicPr>
+                  <pic:blipFill>
+                    <a:blip r:embed="rId11"/>
+                    <a:stretch>
+                      <a:fillRect/>
+                    </a:stretch>
+                  </pic:blipFill>
+                  <pic:spPr>
+                    <a:xfrm>
+                      <a:off x="0" y="0"/>
+                      <a:ext cx="5394960" cy="3540442"/>
+                    </a:xfrm>
+                    <a:prstGeom prst="rect"/>
+                  </pic:spPr>
+                </pic:pic>
+              </a:graphicData>
+            </a:graphic>
+          </wp:inline>
+        </w:drawing>
+      </w:r>
+    </w:p>
+    <w:p>
       <w:r>
         <w:rPr>
           <w:rFonts w:ascii="Aptos" w:hAnsi="Aptos" w:eastAsia="Aptos"/>
@@ -3886,12 +5315,58 @@
     <w:p>
       <w:pPr>
         <w:pStyle w:val="Heading2"/>
+        <w:keepNext/>
       </w:pPr>
       <w:r>
         <w:t>TC-PUB-007 ตรวจ duplicate ที่อยู่จัดส่ง</w:t>
       </w:r>
     </w:p>
     <w:p>
+      <w:pPr>
+        <w:pStyle w:val="Heading3"/>
+        <w:keepNext/>
+      </w:pPr>
+      <w:r>
+        <w:t>ภาพประกอบ: Validation เมื่อไม่กรอกช่องทางติดต่อ</w:t>
+      </w:r>
+    </w:p>
+    <w:p>
+      <w:r>
+        <w:drawing>
+          <wp:inline xmlns:a="http://schemas.openxmlformats.org/drawingml/2006/main" xmlns:pic="http://schemas.openxmlformats.org/drawingml/2006/picture">
+            <wp:extent cx="5394960" cy="3540442"/>
+            <wp:docPr id="32" name="Picture 32"/>
+            <wp:cNvGraphicFramePr>
+              <a:graphicFrameLocks noChangeAspect="1"/>
+            </wp:cNvGraphicFramePr>
+            <a:graphic>
+              <a:graphicData uri="http://schemas.openxmlformats.org/drawingml/2006/picture">
+                <pic:pic>
+                  <pic:nvPicPr>
+                    <pic:cNvPr id="0" name="20260902154721-public-contact-validation.png"/>
+                    <pic:cNvPicPr/>
+                  </pic:nvPicPr>
+                  <pic:blipFill>
+                    <a:blip r:embed="rId11"/>
+                    <a:stretch>
+                      <a:fillRect/>
+                    </a:stretch>
+                  </pic:blipFill>
+                  <pic:spPr>
+                    <a:xfrm>
+                      <a:off x="0" y="0"/>
+                      <a:ext cx="5394960" cy="3540442"/>
+                    </a:xfrm>
+                    <a:prstGeom prst="rect"/>
+                  </pic:spPr>
+                </pic:pic>
+              </a:graphicData>
+            </a:graphic>
+          </wp:inline>
+        </w:drawing>
+      </w:r>
+    </w:p>
+    <w:p>
       <w:r>
         <w:rPr>
           <w:rFonts w:ascii="Aptos" w:hAnsi="Aptos" w:eastAsia="Aptos"/>
@@ -3984,12 +5459,58 @@
     <w:p>
       <w:pPr>
         <w:pStyle w:val="Heading2"/>
+        <w:keepNext/>
       </w:pPr>
       <w:r>
         <w:t>TC-PUB-008 ตรวจ duplicate ทั้งเบอร์โทรศัพท์และที่อยู่จัดส่ง</w:t>
       </w:r>
     </w:p>
     <w:p>
+      <w:pPr>
+        <w:pStyle w:val="Heading3"/>
+        <w:keepNext/>
+      </w:pPr>
+      <w:r>
+        <w:t>ภาพประกอบ: Validation เมื่อไม่กรอกช่องทางติดต่อ</w:t>
+      </w:r>
+    </w:p>
+    <w:p>
+      <w:r>
+        <w:drawing>
+          <wp:inline xmlns:a="http://schemas.openxmlformats.org/drawingml/2006/main" xmlns:pic="http://schemas.openxmlformats.org/drawingml/2006/picture">
+            <wp:extent cx="5394960" cy="3540442"/>
+            <wp:docPr id="33" name="Picture 33"/>
+            <wp:cNvGraphicFramePr>
+              <a:graphicFrameLocks noChangeAspect="1"/>
+            </wp:cNvGraphicFramePr>
+            <a:graphic>
+              <a:graphicData uri="http://schemas.openxmlformats.org/drawingml/2006/picture">
+                <pic:pic>
+                  <pic:nvPicPr>
+                    <pic:cNvPr id="0" name="20260902154721-public-contact-validation.png"/>
+                    <pic:cNvPicPr/>
+                  </pic:nvPicPr>
+                  <pic:blipFill>
+                    <a:blip r:embed="rId11"/>
+                    <a:stretch>
+                      <a:fillRect/>
+                    </a:stretch>
+                  </pic:blipFill>
+                  <pic:spPr>
+                    <a:xfrm>
+                      <a:off x="0" y="0"/>
+                      <a:ext cx="5394960" cy="3540442"/>
+                    </a:xfrm>
+                    <a:prstGeom prst="rect"/>
+                  </pic:spPr>
+                </pic:pic>
+              </a:graphicData>
+            </a:graphic>
+          </wp:inline>
+        </w:drawing>
+      </w:r>
+    </w:p>
+    <w:p>
       <w:r>
         <w:rPr>
           <w:rFonts w:ascii="Aptos" w:hAnsi="Aptos" w:eastAsia="Aptos"/>
@@ -4082,9 +5603,55 @@
     <w:p>
       <w:pPr>
         <w:pStyle w:val="Heading2"/>
+        <w:keepNext/>
       </w:pPr>
       <w:r>
         <w:t>TC-TRK-001 เช็คสถานะด้วยเลข tracking</w:t>
+      </w:r>
+    </w:p>
+    <w:p>
+      <w:pPr>
+        <w:pStyle w:val="Heading3"/>
+        <w:keepNext/>
+      </w:pPr>
+      <w:r>
+        <w:t>ภาพประกอบ: หน้าเช็คสถานะพบเลข tracking และ Tracking URL</w:t>
+      </w:r>
+    </w:p>
+    <w:p>
+      <w:r>
+        <w:drawing>
+          <wp:inline xmlns:a="http://schemas.openxmlformats.org/drawingml/2006/main" xmlns:pic="http://schemas.openxmlformats.org/drawingml/2006/picture">
+            <wp:extent cx="5394960" cy="3540442"/>
+            <wp:docPr id="34" name="Picture 34"/>
+            <wp:cNvGraphicFramePr>
+              <a:graphicFrameLocks noChangeAspect="1"/>
+            </wp:cNvGraphicFramePr>
+            <a:graphic>
+              <a:graphicData uri="http://schemas.openxmlformats.org/drawingml/2006/picture">
+                <pic:pic>
+                  <pic:nvPicPr>
+                    <pic:cNvPr id="0" name="20260902154721-tracking-found.png"/>
+                    <pic:cNvPicPr/>
+                  </pic:nvPicPr>
+                  <pic:blipFill>
+                    <a:blip r:embed="rId13"/>
+                    <a:stretch>
+                      <a:fillRect/>
+                    </a:stretch>
+                  </pic:blipFill>
+                  <pic:spPr>
+                    <a:xfrm>
+                      <a:off x="0" y="0"/>
+                      <a:ext cx="5394960" cy="3540442"/>
+                    </a:xfrm>
+                    <a:prstGeom prst="rect"/>
+                  </pic:spPr>
+                </pic:pic>
+              </a:graphicData>
+            </a:graphic>
+          </wp:inline>
+        </w:drawing>
       </w:r>
     </w:p>
     <w:p>
@@ -4221,12 +5788,58 @@
     <w:p>
       <w:pPr>
         <w:pStyle w:val="Heading2"/>
+        <w:keepNext/>
       </w:pPr>
       <w:r>
         <w:t>TC-TRK-002 ไม่พบเลข tracking</w:t>
       </w:r>
     </w:p>
     <w:p>
+      <w:pPr>
+        <w:pStyle w:val="Heading3"/>
+        <w:keepNext/>
+      </w:pPr>
+      <w:r>
+        <w:t>ภาพประกอบ: หน้าเช็คสถานะเมื่อไม่พบเลข tracking</w:t>
+      </w:r>
+    </w:p>
+    <w:p>
+      <w:r>
+        <w:drawing>
+          <wp:inline xmlns:a="http://schemas.openxmlformats.org/drawingml/2006/main" xmlns:pic="http://schemas.openxmlformats.org/drawingml/2006/picture">
+            <wp:extent cx="5394960" cy="3540442"/>
+            <wp:docPr id="35" name="Picture 35"/>
+            <wp:cNvGraphicFramePr>
+              <a:graphicFrameLocks noChangeAspect="1"/>
+            </wp:cNvGraphicFramePr>
+            <a:graphic>
+              <a:graphicData uri="http://schemas.openxmlformats.org/drawingml/2006/picture">
+                <pic:pic>
+                  <pic:nvPicPr>
+                    <pic:cNvPr id="0" name="20260902154721-tracking-not-found.png"/>
+                    <pic:cNvPicPr/>
+                  </pic:nvPicPr>
+                  <pic:blipFill>
+                    <a:blip r:embed="rId14"/>
+                    <a:stretch>
+                      <a:fillRect/>
+                    </a:stretch>
+                  </pic:blipFill>
+                  <pic:spPr>
+                    <a:xfrm>
+                      <a:off x="0" y="0"/>
+                      <a:ext cx="5394960" cy="3540442"/>
+                    </a:xfrm>
+                    <a:prstGeom prst="rect"/>
+                  </pic:spPr>
+                </pic:pic>
+              </a:graphicData>
+            </a:graphic>
+          </wp:inline>
+        </w:drawing>
+      </w:r>
+    </w:p>
+    <w:p>
       <w:r>
         <w:rPr>
           <w:rFonts w:ascii="Aptos" w:hAnsi="Aptos" w:eastAsia="Aptos"/>
@@ -4289,9 +5902,55 @@
     <w:p>
       <w:pPr>
         <w:pStyle w:val="Heading2"/>
+        <w:keepNext/>
       </w:pPr>
       <w:r>
         <w:t>TC-STF-001 Login พนักงานสำเร็จ</w:t>
+      </w:r>
+    </w:p>
+    <w:p>
+      <w:pPr>
+        <w:pStyle w:val="Heading3"/>
+        <w:keepNext/>
+      </w:pPr>
+      <w:r>
+        <w:t>ภาพประกอบ: Dashboard พนักงานหลัง login</w:t>
+      </w:r>
+    </w:p>
+    <w:p>
+      <w:r>
+        <w:drawing>
+          <wp:inline xmlns:a="http://schemas.openxmlformats.org/drawingml/2006/main" xmlns:pic="http://schemas.openxmlformats.org/drawingml/2006/picture">
+            <wp:extent cx="5394960" cy="3540442"/>
+            <wp:docPr id="36" name="Picture 36"/>
+            <wp:cNvGraphicFramePr>
+              <a:graphicFrameLocks noChangeAspect="1"/>
+            </wp:cNvGraphicFramePr>
+            <a:graphic>
+              <a:graphicData uri="http://schemas.openxmlformats.org/drawingml/2006/picture">
+                <pic:pic>
+                  <pic:nvPicPr>
+                    <pic:cNvPr id="0" name="20260902154721-staff-dashboard.png"/>
+                    <pic:cNvPicPr/>
+                  </pic:nvPicPr>
+                  <pic:blipFill>
+                    <a:blip r:embed="rId15"/>
+                    <a:stretch>
+                      <a:fillRect/>
+                    </a:stretch>
+                  </pic:blipFill>
+                  <pic:spPr>
+                    <a:xfrm>
+                      <a:off x="0" y="0"/>
+                      <a:ext cx="5394960" cy="3540442"/>
+                    </a:xfrm>
+                    <a:prstGeom prst="rect"/>
+                  </pic:spPr>
+                </pic:pic>
+              </a:graphicData>
+            </a:graphic>
+          </wp:inline>
+        </w:drawing>
       </w:r>
     </w:p>
     <w:p>
@@ -4395,6 +6054,7 @@
     <w:p>
       <w:pPr>
         <w:pStyle w:val="Heading2"/>
+        <w:keepNext w:val="0"/>
       </w:pPr>
       <w:r>
         <w:t>TC-STF-002 ป้องกันการเข้าถึงข้อมูลพนักงานโดยไม่ login</w:t>
@@ -4463,9 +6123,55 @@
     <w:p>
       <w:pPr>
         <w:pStyle w:val="Heading2"/>
+        <w:keepNext/>
       </w:pPr>
       <w:r>
         <w:t>TC-STF-003 ดู Dashboard พนักงาน</w:t>
+      </w:r>
+    </w:p>
+    <w:p>
+      <w:pPr>
+        <w:pStyle w:val="Heading3"/>
+        <w:keepNext/>
+      </w:pPr>
+      <w:r>
+        <w:t>ภาพประกอบ: Dashboard พนักงานหลัง login</w:t>
+      </w:r>
+    </w:p>
+    <w:p>
+      <w:r>
+        <w:drawing>
+          <wp:inline xmlns:a="http://schemas.openxmlformats.org/drawingml/2006/main" xmlns:pic="http://schemas.openxmlformats.org/drawingml/2006/picture">
+            <wp:extent cx="5394960" cy="3540442"/>
+            <wp:docPr id="37" name="Picture 37"/>
+            <wp:cNvGraphicFramePr>
+              <a:graphicFrameLocks noChangeAspect="1"/>
+            </wp:cNvGraphicFramePr>
+            <a:graphic>
+              <a:graphicData uri="http://schemas.openxmlformats.org/drawingml/2006/picture">
+                <pic:pic>
+                  <pic:nvPicPr>
+                    <pic:cNvPr id="0" name="20260902154721-staff-dashboard.png"/>
+                    <pic:cNvPicPr/>
+                  </pic:nvPicPr>
+                  <pic:blipFill>
+                    <a:blip r:embed="rId15"/>
+                    <a:stretch>
+                      <a:fillRect/>
+                    </a:stretch>
+                  </pic:blipFill>
+                  <pic:spPr>
+                    <a:xfrm>
+                      <a:off x="0" y="0"/>
+                      <a:ext cx="5394960" cy="3540442"/>
+                    </a:xfrm>
+                    <a:prstGeom prst="rect"/>
+                  </pic:spPr>
+                </pic:pic>
+              </a:graphicData>
+            </a:graphic>
+          </wp:inline>
+        </w:drawing>
       </w:r>
     </w:p>
     <w:p>
@@ -4550,9 +6256,55 @@
     <w:p>
       <w:pPr>
         <w:pStyle w:val="Heading2"/>
+        <w:keepNext/>
       </w:pPr>
       <w:r>
         <w:t>TC-STF-004 บันทึกคำขอ</w:t>
+      </w:r>
+    </w:p>
+    <w:p>
+      <w:pPr>
+        <w:pStyle w:val="Heading3"/>
+        <w:keepNext/>
+      </w:pPr>
+      <w:r>
+        <w:t>ภาพประกอบ: Drawer รายละเอียด พร้อมบันทึกคำขอและอัปเดตขนส่ง</w:t>
+      </w:r>
+    </w:p>
+    <w:p>
+      <w:r>
+        <w:drawing>
+          <wp:inline xmlns:a="http://schemas.openxmlformats.org/drawingml/2006/main" xmlns:pic="http://schemas.openxmlformats.org/drawingml/2006/picture">
+            <wp:extent cx="5394960" cy="3540442"/>
+            <wp:docPr id="38" name="Picture 38"/>
+            <wp:cNvGraphicFramePr>
+              <a:graphicFrameLocks noChangeAspect="1"/>
+            </wp:cNvGraphicFramePr>
+            <a:graphic>
+              <a:graphicData uri="http://schemas.openxmlformats.org/drawingml/2006/picture">
+                <pic:pic>
+                  <pic:nvPicPr>
+                    <pic:cNvPr id="0" name="20260902154721-staff-detail-drawer.png"/>
+                    <pic:cNvPicPr/>
+                  </pic:nvPicPr>
+                  <pic:blipFill>
+                    <a:blip r:embed="rId16"/>
+                    <a:stretch>
+                      <a:fillRect/>
+                    </a:stretch>
+                  </pic:blipFill>
+                  <pic:spPr>
+                    <a:xfrm>
+                      <a:off x="0" y="0"/>
+                      <a:ext cx="5394960" cy="3540442"/>
+                    </a:xfrm>
+                    <a:prstGeom prst="rect"/>
+                  </pic:spPr>
+                </pic:pic>
+              </a:graphicData>
+            </a:graphic>
+          </wp:inline>
+        </w:drawing>
       </w:r>
     </w:p>
     <w:p>
@@ -4678,9 +6430,55 @@
     <w:p>
       <w:pPr>
         <w:pStyle w:val="Heading2"/>
+        <w:keepNext/>
       </w:pPr>
       <w:r>
         <w:t>TC-STF-005 อัปเดตขนส่ง</w:t>
+      </w:r>
+    </w:p>
+    <w:p>
+      <w:pPr>
+        <w:pStyle w:val="Heading3"/>
+        <w:keepNext/>
+      </w:pPr>
+      <w:r>
+        <w:t>ภาพประกอบ: Drawer รายละเอียด พร้อมบันทึกคำขอและอัปเดตขนส่ง</w:t>
+      </w:r>
+    </w:p>
+    <w:p>
+      <w:r>
+        <w:drawing>
+          <wp:inline xmlns:a="http://schemas.openxmlformats.org/drawingml/2006/main" xmlns:pic="http://schemas.openxmlformats.org/drawingml/2006/picture">
+            <wp:extent cx="5394960" cy="3540442"/>
+            <wp:docPr id="39" name="Picture 39"/>
+            <wp:cNvGraphicFramePr>
+              <a:graphicFrameLocks noChangeAspect="1"/>
+            </wp:cNvGraphicFramePr>
+            <a:graphic>
+              <a:graphicData uri="http://schemas.openxmlformats.org/drawingml/2006/picture">
+                <pic:pic>
+                  <pic:nvPicPr>
+                    <pic:cNvPr id="0" name="20260902154721-staff-detail-drawer.png"/>
+                    <pic:cNvPicPr/>
+                  </pic:nvPicPr>
+                  <pic:blipFill>
+                    <a:blip r:embed="rId16"/>
+                    <a:stretch>
+                      <a:fillRect/>
+                    </a:stretch>
+                  </pic:blipFill>
+                  <pic:spPr>
+                    <a:xfrm>
+                      <a:off x="0" y="0"/>
+                      <a:ext cx="5394960" cy="3540442"/>
+                    </a:xfrm>
+                    <a:prstGeom prst="rect"/>
+                  </pic:spPr>
+                </pic:pic>
+              </a:graphicData>
+            </a:graphic>
+          </wp:inline>
+        </w:drawing>
       </w:r>
     </w:p>
     <w:p>
@@ -4839,9 +6637,100 @@
     <w:p>
       <w:pPr>
         <w:pStyle w:val="Heading2"/>
+        <w:keepNext/>
       </w:pPr>
       <w:r>
         <w:t>TC-STF-006 ตารางข้อมูลเต็ม แสดงข้อมูลและเปิดรายละเอียด</w:t>
+      </w:r>
+    </w:p>
+    <w:p>
+      <w:pPr>
+        <w:pStyle w:val="Heading3"/>
+        <w:keepNext/>
+      </w:pPr>
+      <w:r>
+        <w:t>ภาพประกอบ: หน้าตารางข้อมูลเต็ม แสดง column ข้อมูลทั้งหมด</w:t>
+      </w:r>
+    </w:p>
+    <w:p>
+      <w:r>
+        <w:drawing>
+          <wp:inline xmlns:a="http://schemas.openxmlformats.org/drawingml/2006/main" xmlns:pic="http://schemas.openxmlformats.org/drawingml/2006/picture">
+            <wp:extent cx="5394960" cy="3540442"/>
+            <wp:docPr id="40" name="Picture 40"/>
+            <wp:cNvGraphicFramePr>
+              <a:graphicFrameLocks noChangeAspect="1"/>
+            </wp:cNvGraphicFramePr>
+            <a:graphic>
+              <a:graphicData uri="http://schemas.openxmlformats.org/drawingml/2006/picture">
+                <pic:pic>
+                  <pic:nvPicPr>
+                    <pic:cNvPr id="0" name="20260902154721-staff-full-table.png"/>
+                    <pic:cNvPicPr/>
+                  </pic:nvPicPr>
+                  <pic:blipFill>
+                    <a:blip r:embed="rId18"/>
+                    <a:stretch>
+                      <a:fillRect/>
+                    </a:stretch>
+                  </pic:blipFill>
+                  <pic:spPr>
+                    <a:xfrm>
+                      <a:off x="0" y="0"/>
+                      <a:ext cx="5394960" cy="3540442"/>
+                    </a:xfrm>
+                    <a:prstGeom prst="rect"/>
+                  </pic:spPr>
+                </pic:pic>
+              </a:graphicData>
+            </a:graphic>
+          </wp:inline>
+        </w:drawing>
+      </w:r>
+    </w:p>
+    <w:p>
+      <w:pPr>
+        <w:pStyle w:val="Heading3"/>
+        <w:keepNext/>
+      </w:pPr>
+      <w:r>
+        <w:t>ภาพประกอบ: Drawer รายละเอียด พร้อมบันทึกคำขอและอัปเดตขนส่ง</w:t>
+      </w:r>
+    </w:p>
+    <w:p>
+      <w:r>
+        <w:drawing>
+          <wp:inline xmlns:a="http://schemas.openxmlformats.org/drawingml/2006/main" xmlns:pic="http://schemas.openxmlformats.org/drawingml/2006/picture">
+            <wp:extent cx="5394960" cy="3540442"/>
+            <wp:docPr id="41" name="Picture 41"/>
+            <wp:cNvGraphicFramePr>
+              <a:graphicFrameLocks noChangeAspect="1"/>
+            </wp:cNvGraphicFramePr>
+            <a:graphic>
+              <a:graphicData uri="http://schemas.openxmlformats.org/drawingml/2006/picture">
+                <pic:pic>
+                  <pic:nvPicPr>
+                    <pic:cNvPr id="0" name="20260902154721-staff-detail-drawer.png"/>
+                    <pic:cNvPicPr/>
+                  </pic:nvPicPr>
+                  <pic:blipFill>
+                    <a:blip r:embed="rId16"/>
+                    <a:stretch>
+                      <a:fillRect/>
+                    </a:stretch>
+                  </pic:blipFill>
+                  <pic:spPr>
+                    <a:xfrm>
+                      <a:off x="0" y="0"/>
+                      <a:ext cx="5394960" cy="3540442"/>
+                    </a:xfrm>
+                    <a:prstGeom prst="rect"/>
+                  </pic:spPr>
+                </pic:pic>
+              </a:graphicData>
+            </a:graphic>
+          </wp:inline>
+        </w:drawing>
       </w:r>
     </w:p>
     <w:p>
@@ -4937,9 +6826,55 @@
     <w:p>
       <w:pPr>
         <w:pStyle w:val="Heading2"/>
+        <w:keepNext/>
       </w:pPr>
       <w:r>
         <w:t>TC-STF-007 Sorting ใน header ตาราง</w:t>
+      </w:r>
+    </w:p>
+    <w:p>
+      <w:pPr>
+        <w:pStyle w:val="Heading3"/>
+        <w:keepNext/>
+      </w:pPr>
+      <w:r>
+        <w:t>ภาพประกอบ: Sorting จาก header ตาราง</w:t>
+      </w:r>
+    </w:p>
+    <w:p>
+      <w:r>
+        <w:drawing>
+          <wp:inline xmlns:a="http://schemas.openxmlformats.org/drawingml/2006/main" xmlns:pic="http://schemas.openxmlformats.org/drawingml/2006/picture">
+            <wp:extent cx="5394960" cy="3540442"/>
+            <wp:docPr id="42" name="Picture 42"/>
+            <wp:cNvGraphicFramePr>
+              <a:graphicFrameLocks noChangeAspect="1"/>
+            </wp:cNvGraphicFramePr>
+            <a:graphic>
+              <a:graphicData uri="http://schemas.openxmlformats.org/drawingml/2006/picture">
+                <pic:pic>
+                  <pic:nvPicPr>
+                    <pic:cNvPr id="0" name="20260902154721-staff-sorting.png"/>
+                    <pic:cNvPicPr/>
+                  </pic:nvPicPr>
+                  <pic:blipFill>
+                    <a:blip r:embed="rId21"/>
+                    <a:stretch>
+                      <a:fillRect/>
+                    </a:stretch>
+                  </pic:blipFill>
+                  <pic:spPr>
+                    <a:xfrm>
+                      <a:off x="0" y="0"/>
+                      <a:ext cx="5394960" cy="3540442"/>
+                    </a:xfrm>
+                    <a:prstGeom prst="rect"/>
+                  </pic:spPr>
+                </pic:pic>
+              </a:graphicData>
+            </a:graphic>
+          </wp:inline>
+        </w:drawing>
       </w:r>
     </w:p>
     <w:p>
@@ -5035,9 +6970,55 @@
     <w:p>
       <w:pPr>
         <w:pStyle w:val="Heading2"/>
+        <w:keepNext/>
       </w:pPr>
       <w:r>
         <w:t>TC-STF-008 Filter ใน header ตาราง</w:t>
+      </w:r>
+    </w:p>
+    <w:p>
+      <w:pPr>
+        <w:pStyle w:val="Heading3"/>
+        <w:keepNext/>
+      </w:pPr>
+      <w:r>
+        <w:t>ภาพประกอบ: Filter header ตารางด้วยจังหวัด</w:t>
+      </w:r>
+    </w:p>
+    <w:p>
+      <w:r>
+        <w:drawing>
+          <wp:inline xmlns:a="http://schemas.openxmlformats.org/drawingml/2006/main" xmlns:pic="http://schemas.openxmlformats.org/drawingml/2006/picture">
+            <wp:extent cx="5394960" cy="3540442"/>
+            <wp:docPr id="43" name="Picture 43"/>
+            <wp:cNvGraphicFramePr>
+              <a:graphicFrameLocks noChangeAspect="1"/>
+            </wp:cNvGraphicFramePr>
+            <a:graphic>
+              <a:graphicData uri="http://schemas.openxmlformats.org/drawingml/2006/picture">
+                <pic:pic>
+                  <pic:nvPicPr>
+                    <pic:cNvPr id="0" name="20260902154721-staff-filter-province.png"/>
+                    <pic:cNvPicPr/>
+                  </pic:nvPicPr>
+                  <pic:blipFill>
+                    <a:blip r:embed="rId19"/>
+                    <a:stretch>
+                      <a:fillRect/>
+                    </a:stretch>
+                  </pic:blipFill>
+                  <pic:spPr>
+                    <a:xfrm>
+                      <a:off x="0" y="0"/>
+                      <a:ext cx="5394960" cy="3540442"/>
+                    </a:xfrm>
+                    <a:prstGeom prst="rect"/>
+                  </pic:spPr>
+                </pic:pic>
+              </a:graphicData>
+            </a:graphic>
+          </wp:inline>
+        </w:drawing>
       </w:r>
     </w:p>
     <w:p>
@@ -5147,9 +7128,55 @@
     <w:p>
       <w:pPr>
         <w:pStyle w:val="Heading2"/>
+        <w:keepNext/>
       </w:pPr>
       <w:r>
         <w:t>TC-STF-009 Filter วันที่ส่งแบบช่วงเวลา</w:t>
+      </w:r>
+    </w:p>
+    <w:p>
+      <w:pPr>
+        <w:pStyle w:val="Heading3"/>
+        <w:keepNext/>
+      </w:pPr>
+      <w:r>
+        <w:t>ภาพประกอบ: Filter วันที่ส่งและวันที่ลงทะเบียนแบบช่วงเวลา</w:t>
+      </w:r>
+    </w:p>
+    <w:p>
+      <w:r>
+        <w:drawing>
+          <wp:inline xmlns:a="http://schemas.openxmlformats.org/drawingml/2006/main" xmlns:pic="http://schemas.openxmlformats.org/drawingml/2006/picture">
+            <wp:extent cx="5394960" cy="3540442"/>
+            <wp:docPr id="44" name="Picture 44"/>
+            <wp:cNvGraphicFramePr>
+              <a:graphicFrameLocks noChangeAspect="1"/>
+            </wp:cNvGraphicFramePr>
+            <a:graphic>
+              <a:graphicData uri="http://schemas.openxmlformats.org/drawingml/2006/picture">
+                <pic:pic>
+                  <pic:nvPicPr>
+                    <pic:cNvPr id="0" name="20260902154721-staff-date-range-filter.png"/>
+                    <pic:cNvPicPr/>
+                  </pic:nvPicPr>
+                  <pic:blipFill>
+                    <a:blip r:embed="rId20"/>
+                    <a:stretch>
+                      <a:fillRect/>
+                    </a:stretch>
+                  </pic:blipFill>
+                  <pic:spPr>
+                    <a:xfrm>
+                      <a:off x="0" y="0"/>
+                      <a:ext cx="5394960" cy="3540442"/>
+                    </a:xfrm>
+                    <a:prstGeom prst="rect"/>
+                  </pic:spPr>
+                </pic:pic>
+              </a:graphicData>
+            </a:graphic>
+          </wp:inline>
+        </w:drawing>
       </w:r>
     </w:p>
     <w:p>
@@ -5250,9 +7277,55 @@
     <w:p>
       <w:pPr>
         <w:pStyle w:val="Heading2"/>
+        <w:keepNext/>
       </w:pPr>
       <w:r>
         <w:t>TC-STF-010 Filter วันที่ลงทะเบียนแบบช่วงเวลา</w:t>
+      </w:r>
+    </w:p>
+    <w:p>
+      <w:pPr>
+        <w:pStyle w:val="Heading3"/>
+        <w:keepNext/>
+      </w:pPr>
+      <w:r>
+        <w:t>ภาพประกอบ: Filter วันที่ส่งและวันที่ลงทะเบียนแบบช่วงเวลา</w:t>
+      </w:r>
+    </w:p>
+    <w:p>
+      <w:r>
+        <w:drawing>
+          <wp:inline xmlns:a="http://schemas.openxmlformats.org/drawingml/2006/main" xmlns:pic="http://schemas.openxmlformats.org/drawingml/2006/picture">
+            <wp:extent cx="5394960" cy="3540442"/>
+            <wp:docPr id="45" name="Picture 45"/>
+            <wp:cNvGraphicFramePr>
+              <a:graphicFrameLocks noChangeAspect="1"/>
+            </wp:cNvGraphicFramePr>
+            <a:graphic>
+              <a:graphicData uri="http://schemas.openxmlformats.org/drawingml/2006/picture">
+                <pic:pic>
+                  <pic:nvPicPr>
+                    <pic:cNvPr id="0" name="20260902154721-staff-date-range-filter.png"/>
+                    <pic:cNvPicPr/>
+                  </pic:nvPicPr>
+                  <pic:blipFill>
+                    <a:blip r:embed="rId20"/>
+                    <a:stretch>
+                      <a:fillRect/>
+                    </a:stretch>
+                  </pic:blipFill>
+                  <pic:spPr>
+                    <a:xfrm>
+                      <a:off x="0" y="0"/>
+                      <a:ext cx="5394960" cy="3540442"/>
+                    </a:xfrm>
+                    <a:prstGeom prst="rect"/>
+                  </pic:spPr>
+                </pic:pic>
+              </a:graphicData>
+            </a:graphic>
+          </wp:inline>
+        </w:drawing>
       </w:r>
     </w:p>
     <w:p>
@@ -5353,9 +7426,55 @@
     <w:p>
       <w:pPr>
         <w:pStyle w:val="Heading2"/>
+        <w:keepNext/>
       </w:pPr>
       <w:r>
         <w:t>TC-STF-011 แสดงผลครั้งละ 100 รายการ</w:t>
+      </w:r>
+    </w:p>
+    <w:p>
+      <w:pPr>
+        <w:pStyle w:val="Heading3"/>
+        <w:keepNext/>
+      </w:pPr>
+      <w:r>
+        <w:t>ภาพประกอบ: หน้าตารางข้อมูลเต็ม แสดง column ข้อมูลทั้งหมด</w:t>
+      </w:r>
+    </w:p>
+    <w:p>
+      <w:r>
+        <w:drawing>
+          <wp:inline xmlns:a="http://schemas.openxmlformats.org/drawingml/2006/main" xmlns:pic="http://schemas.openxmlformats.org/drawingml/2006/picture">
+            <wp:extent cx="5394960" cy="3540442"/>
+            <wp:docPr id="46" name="Picture 46"/>
+            <wp:cNvGraphicFramePr>
+              <a:graphicFrameLocks noChangeAspect="1"/>
+            </wp:cNvGraphicFramePr>
+            <a:graphic>
+              <a:graphicData uri="http://schemas.openxmlformats.org/drawingml/2006/picture">
+                <pic:pic>
+                  <pic:nvPicPr>
+                    <pic:cNvPr id="0" name="20260902154721-staff-full-table.png"/>
+                    <pic:cNvPicPr/>
+                  </pic:nvPicPr>
+                  <pic:blipFill>
+                    <a:blip r:embed="rId18"/>
+                    <a:stretch>
+                      <a:fillRect/>
+                    </a:stretch>
+                  </pic:blipFill>
+                  <pic:spPr>
+                    <a:xfrm>
+                      <a:off x="0" y="0"/>
+                      <a:ext cx="5394960" cy="3540442"/>
+                    </a:xfrm>
+                    <a:prstGeom prst="rect"/>
+                  </pic:spPr>
+                </pic:pic>
+              </a:graphicData>
+            </a:graphic>
+          </wp:inline>
+        </w:drawing>
       </w:r>
     </w:p>
     <w:p>
@@ -5448,9 +7567,55 @@
     <w:p>
       <w:pPr>
         <w:pStyle w:val="Heading2"/>
+        <w:keepNext/>
       </w:pPr>
       <w:r>
         <w:t>TC-STF-012 Tracking URL คลิกได้</w:t>
+      </w:r>
+    </w:p>
+    <w:p>
+      <w:pPr>
+        <w:pStyle w:val="Heading3"/>
+        <w:keepNext/>
+      </w:pPr>
+      <w:r>
+        <w:t>ภาพประกอบ: Tracking URL แสดงเป็น link คลิกได้</w:t>
+      </w:r>
+    </w:p>
+    <w:p>
+      <w:r>
+        <w:drawing>
+          <wp:inline xmlns:a="http://schemas.openxmlformats.org/drawingml/2006/main" xmlns:pic="http://schemas.openxmlformats.org/drawingml/2006/picture">
+            <wp:extent cx="5394960" cy="3540442"/>
+            <wp:docPr id="47" name="Picture 47"/>
+            <wp:cNvGraphicFramePr>
+              <a:graphicFrameLocks noChangeAspect="1"/>
+            </wp:cNvGraphicFramePr>
+            <a:graphic>
+              <a:graphicData uri="http://schemas.openxmlformats.org/drawingml/2006/picture">
+                <pic:pic>
+                  <pic:nvPicPr>
+                    <pic:cNvPr id="0" name="20260902154721-staff-tracking-url-link.png"/>
+                    <pic:cNvPicPr/>
+                  </pic:nvPicPr>
+                  <pic:blipFill>
+                    <a:blip r:embed="rId17"/>
+                    <a:stretch>
+                      <a:fillRect/>
+                    </a:stretch>
+                  </pic:blipFill>
+                  <pic:spPr>
+                    <a:xfrm>
+                      <a:off x="0" y="0"/>
+                      <a:ext cx="5394960" cy="3540442"/>
+                    </a:xfrm>
+                    <a:prstGeom prst="rect"/>
+                  </pic:spPr>
+                </pic:pic>
+              </a:graphicData>
+            </a:graphic>
+          </wp:inline>
+        </w:drawing>
       </w:r>
     </w:p>
     <w:p>
@@ -5573,9 +7738,55 @@
     <w:p>
       <w:pPr>
         <w:pStyle w:val="Heading2"/>
+        <w:keepNext/>
       </w:pPr>
       <w:r>
         <w:t>TC-EXP-001 Export CSV สำหรับไปรษณีย์</w:t>
+      </w:r>
+    </w:p>
+    <w:p>
+      <w:pPr>
+        <w:pStyle w:val="Heading3"/>
+        <w:keepNext/>
+      </w:pPr>
+      <w:r>
+        <w:t>ภาพประกอบ: Export CSV จากหน้าพนักงาน</w:t>
+      </w:r>
+    </w:p>
+    <w:p>
+      <w:r>
+        <w:drawing>
+          <wp:inline xmlns:a="http://schemas.openxmlformats.org/drawingml/2006/main" xmlns:pic="http://schemas.openxmlformats.org/drawingml/2006/picture">
+            <wp:extent cx="5394960" cy="3540442"/>
+            <wp:docPr id="48" name="Picture 48"/>
+            <wp:cNvGraphicFramePr>
+              <a:graphicFrameLocks noChangeAspect="1"/>
+            </wp:cNvGraphicFramePr>
+            <a:graphic>
+              <a:graphicData uri="http://schemas.openxmlformats.org/drawingml/2006/picture">
+                <pic:pic>
+                  <pic:nvPicPr>
+                    <pic:cNvPr id="0" name="20260902154721-staff-export.png"/>
+                    <pic:cNvPicPr/>
+                  </pic:nvPicPr>
+                  <pic:blipFill>
+                    <a:blip r:embed="rId22"/>
+                    <a:stretch>
+                      <a:fillRect/>
+                    </a:stretch>
+                  </pic:blipFill>
+                  <pic:spPr>
+                    <a:xfrm>
+                      <a:off x="0" y="0"/>
+                      <a:ext cx="5394960" cy="3540442"/>
+                    </a:xfrm>
+                    <a:prstGeom prst="rect"/>
+                  </pic:spPr>
+                </pic:pic>
+              </a:graphicData>
+            </a:graphic>
+          </wp:inline>
+        </w:drawing>
       </w:r>
     </w:p>
     <w:p>
@@ -5725,9 +7936,55 @@
     <w:p>
       <w:pPr>
         <w:pStyle w:val="Heading2"/>
+        <w:keepNext/>
       </w:pPr>
       <w:r>
         <w:t>TC-EXP-002 Export CSV จากตารางข้อมูลเต็มตาม filter</w:t>
+      </w:r>
+    </w:p>
+    <w:p>
+      <w:pPr>
+        <w:pStyle w:val="Heading3"/>
+        <w:keepNext/>
+      </w:pPr>
+      <w:r>
+        <w:t>ภาพประกอบ: Export CSV จากหน้าพนักงาน</w:t>
+      </w:r>
+    </w:p>
+    <w:p>
+      <w:r>
+        <w:drawing>
+          <wp:inline xmlns:a="http://schemas.openxmlformats.org/drawingml/2006/main" xmlns:pic="http://schemas.openxmlformats.org/drawingml/2006/picture">
+            <wp:extent cx="5394960" cy="3540442"/>
+            <wp:docPr id="49" name="Picture 49"/>
+            <wp:cNvGraphicFramePr>
+              <a:graphicFrameLocks noChangeAspect="1"/>
+            </wp:cNvGraphicFramePr>
+            <a:graphic>
+              <a:graphicData uri="http://schemas.openxmlformats.org/drawingml/2006/picture">
+                <pic:pic>
+                  <pic:nvPicPr>
+                    <pic:cNvPr id="0" name="20260902154721-staff-export.png"/>
+                    <pic:cNvPicPr/>
+                  </pic:nvPicPr>
+                  <pic:blipFill>
+                    <a:blip r:embed="rId22"/>
+                    <a:stretch>
+                      <a:fillRect/>
+                    </a:stretch>
+                  </pic:blipFill>
+                  <pic:spPr>
+                    <a:xfrm>
+                      <a:off x="0" y="0"/>
+                      <a:ext cx="5394960" cy="3540442"/>
+                    </a:xfrm>
+                    <a:prstGeom prst="rect"/>
+                  </pic:spPr>
+                </pic:pic>
+              </a:graphicData>
+            </a:graphic>
+          </wp:inline>
+        </w:drawing>
       </w:r>
     </w:p>
     <w:p>
@@ -5839,9 +8096,55 @@
     <w:p>
       <w:pPr>
         <w:pStyle w:val="Heading2"/>
+        <w:keepNext/>
       </w:pPr>
       <w:r>
         <w:t>TC-IMP-001 Import tracking จาก CSV</w:t>
+      </w:r>
+    </w:p>
+    <w:p>
+      <w:pPr>
+        <w:pStyle w:val="Heading3"/>
+        <w:keepNext/>
+      </w:pPr>
+      <w:r>
+        <w:t>ภาพประกอบ: หน้าตารางข้อมูลเต็ม แสดง column ข้อมูลทั้งหมด</w:t>
+      </w:r>
+    </w:p>
+    <w:p>
+      <w:r>
+        <w:drawing>
+          <wp:inline xmlns:a="http://schemas.openxmlformats.org/drawingml/2006/main" xmlns:pic="http://schemas.openxmlformats.org/drawingml/2006/picture">
+            <wp:extent cx="5394960" cy="3540442"/>
+            <wp:docPr id="50" name="Picture 50"/>
+            <wp:cNvGraphicFramePr>
+              <a:graphicFrameLocks noChangeAspect="1"/>
+            </wp:cNvGraphicFramePr>
+            <a:graphic>
+              <a:graphicData uri="http://schemas.openxmlformats.org/drawingml/2006/picture">
+                <pic:pic>
+                  <pic:nvPicPr>
+                    <pic:cNvPr id="0" name="20260902154721-staff-full-table.png"/>
+                    <pic:cNvPicPr/>
+                  </pic:nvPicPr>
+                  <pic:blipFill>
+                    <a:blip r:embed="rId18"/>
+                    <a:stretch>
+                      <a:fillRect/>
+                    </a:stretch>
+                  </pic:blipFill>
+                  <pic:spPr>
+                    <a:xfrm>
+                      <a:off x="0" y="0"/>
+                      <a:ext cx="5394960" cy="3540442"/>
+                    </a:xfrm>
+                    <a:prstGeom prst="rect"/>
+                  </pic:spPr>
+                </pic:pic>
+              </a:graphicData>
+            </a:graphic>
+          </wp:inline>
+        </w:drawing>
       </w:r>
     </w:p>
     <w:p>
@@ -6006,9 +8309,55 @@
     <w:p>
       <w:pPr>
         <w:pStyle w:val="Heading2"/>
+        <w:keepNext/>
       </w:pPr>
       <w:r>
         <w:t>TC-IMP-002 Import tracking จากไฟล์ KEX XLSX</w:t>
+      </w:r>
+    </w:p>
+    <w:p>
+      <w:pPr>
+        <w:pStyle w:val="Heading3"/>
+        <w:keepNext/>
+      </w:pPr>
+      <w:r>
+        <w:t>ภาพประกอบ: หน้าตารางข้อมูลเต็ม แสดง column ข้อมูลทั้งหมด</w:t>
+      </w:r>
+    </w:p>
+    <w:p>
+      <w:r>
+        <w:drawing>
+          <wp:inline xmlns:a="http://schemas.openxmlformats.org/drawingml/2006/main" xmlns:pic="http://schemas.openxmlformats.org/drawingml/2006/picture">
+            <wp:extent cx="5394960" cy="3540442"/>
+            <wp:docPr id="51" name="Picture 51"/>
+            <wp:cNvGraphicFramePr>
+              <a:graphicFrameLocks noChangeAspect="1"/>
+            </wp:cNvGraphicFramePr>
+            <a:graphic>
+              <a:graphicData uri="http://schemas.openxmlformats.org/drawingml/2006/picture">
+                <pic:pic>
+                  <pic:nvPicPr>
+                    <pic:cNvPr id="0" name="20260902154721-staff-full-table.png"/>
+                    <pic:cNvPicPr/>
+                  </pic:nvPicPr>
+                  <pic:blipFill>
+                    <a:blip r:embed="rId18"/>
+                    <a:stretch>
+                      <a:fillRect/>
+                    </a:stretch>
+                  </pic:blipFill>
+                  <pic:spPr>
+                    <a:xfrm>
+                      <a:off x="0" y="0"/>
+                      <a:ext cx="5394960" cy="3540442"/>
+                    </a:xfrm>
+                    <a:prstGeom prst="rect"/>
+                  </pic:spPr>
+                </pic:pic>
+              </a:graphicData>
+            </a:graphic>
+          </wp:inline>
+        </w:drawing>
       </w:r>
     </w:p>
     <w:p>
@@ -6198,6 +8547,7 @@
     <w:p>
       <w:pPr>
         <w:pStyle w:val="Heading2"/>
+        <w:keepNext w:val="0"/>
       </w:pPr>
       <w:r>
         <w:t>TC-ADM-001 ลบรายการโดย admin</w:t>
@@ -8475,7 +10825,7 @@
         <w:drawing>
           <wp:inline xmlns:a="http://schemas.openxmlformats.org/drawingml/2006/main" xmlns:pic="http://schemas.openxmlformats.org/drawingml/2006/picture">
             <wp:extent cx="5852160" cy="3840480"/>
-            <wp:docPr id="1" name="Picture 1"/>
+            <wp:docPr id="52" name="Picture 52"/>
             <wp:cNvGraphicFramePr>
               <a:graphicFrameLocks noChangeAspect="1"/>
             </wp:cNvGraphicFramePr>
@@ -8520,7 +10870,7 @@
         <w:drawing>
           <wp:inline xmlns:a="http://schemas.openxmlformats.org/drawingml/2006/main" xmlns:pic="http://schemas.openxmlformats.org/drawingml/2006/picture">
             <wp:extent cx="5852160" cy="3840480"/>
-            <wp:docPr id="2" name="Picture 2"/>
+            <wp:docPr id="53" name="Picture 53"/>
             <wp:cNvGraphicFramePr>
               <a:graphicFrameLocks noChangeAspect="1"/>
             </wp:cNvGraphicFramePr>
@@ -8565,7 +10915,7 @@
         <w:drawing>
           <wp:inline xmlns:a="http://schemas.openxmlformats.org/drawingml/2006/main" xmlns:pic="http://schemas.openxmlformats.org/drawingml/2006/picture">
             <wp:extent cx="5852160" cy="3840480"/>
-            <wp:docPr id="3" name="Picture 3"/>
+            <wp:docPr id="54" name="Picture 54"/>
             <wp:cNvGraphicFramePr>
               <a:graphicFrameLocks noChangeAspect="1"/>
             </wp:cNvGraphicFramePr>
@@ -8610,7 +10960,7 @@
         <w:drawing>
           <wp:inline xmlns:a="http://schemas.openxmlformats.org/drawingml/2006/main" xmlns:pic="http://schemas.openxmlformats.org/drawingml/2006/picture">
             <wp:extent cx="5852160" cy="3840480"/>
-            <wp:docPr id="4" name="Picture 4"/>
+            <wp:docPr id="55" name="Picture 55"/>
             <wp:cNvGraphicFramePr>
               <a:graphicFrameLocks noChangeAspect="1"/>
             </wp:cNvGraphicFramePr>
@@ -8655,7 +11005,7 @@
         <w:drawing>
           <wp:inline xmlns:a="http://schemas.openxmlformats.org/drawingml/2006/main" xmlns:pic="http://schemas.openxmlformats.org/drawingml/2006/picture">
             <wp:extent cx="5852160" cy="3840480"/>
-            <wp:docPr id="5" name="Picture 5"/>
+            <wp:docPr id="56" name="Picture 56"/>
             <wp:cNvGraphicFramePr>
               <a:graphicFrameLocks noChangeAspect="1"/>
             </wp:cNvGraphicFramePr>
@@ -8700,7 +11050,7 @@
         <w:drawing>
           <wp:inline xmlns:a="http://schemas.openxmlformats.org/drawingml/2006/main" xmlns:pic="http://schemas.openxmlformats.org/drawingml/2006/picture">
             <wp:extent cx="5852160" cy="3840480"/>
-            <wp:docPr id="6" name="Picture 6"/>
+            <wp:docPr id="57" name="Picture 57"/>
             <wp:cNvGraphicFramePr>
               <a:graphicFrameLocks noChangeAspect="1"/>
             </wp:cNvGraphicFramePr>
@@ -8745,7 +11095,7 @@
         <w:drawing>
           <wp:inline xmlns:a="http://schemas.openxmlformats.org/drawingml/2006/main" xmlns:pic="http://schemas.openxmlformats.org/drawingml/2006/picture">
             <wp:extent cx="5852160" cy="3840480"/>
-            <wp:docPr id="7" name="Picture 7"/>
+            <wp:docPr id="58" name="Picture 58"/>
             <wp:cNvGraphicFramePr>
               <a:graphicFrameLocks noChangeAspect="1"/>
             </wp:cNvGraphicFramePr>
@@ -8754,6 +11104,186 @@
                 <pic:pic>
                   <pic:nvPicPr>
                     <pic:cNvPr id="0" name="20260902154721-staff-full-table.png"/>
+                    <pic:cNvPicPr/>
+                  </pic:nvPicPr>
+                  <pic:blipFill>
+                    <a:blip r:embed="rId18"/>
+                    <a:stretch>
+                      <a:fillRect/>
+                    </a:stretch>
+                  </pic:blipFill>
+                  <pic:spPr>
+                    <a:xfrm>
+                      <a:off x="0" y="0"/>
+                      <a:ext cx="5852160" cy="3840480"/>
+                    </a:xfrm>
+                    <a:prstGeom prst="rect"/>
+                  </pic:spPr>
+                </pic:pic>
+              </a:graphicData>
+            </a:graphic>
+          </wp:inline>
+        </w:drawing>
+      </w:r>
+    </w:p>
+    <w:p>
+      <w:pPr>
+        <w:pStyle w:val="Heading2"/>
+        <w:keepNext/>
+      </w:pPr>
+      <w:r>
+        <w:t>ภาพที่ 8: Filter header ตารางด้วยจังหวัด</w:t>
+      </w:r>
+    </w:p>
+    <w:p>
+      <w:r>
+        <w:drawing>
+          <wp:inline xmlns:a="http://schemas.openxmlformats.org/drawingml/2006/main" xmlns:pic="http://schemas.openxmlformats.org/drawingml/2006/picture">
+            <wp:extent cx="5852160" cy="3840480"/>
+            <wp:docPr id="59" name="Picture 59"/>
+            <wp:cNvGraphicFramePr>
+              <a:graphicFrameLocks noChangeAspect="1"/>
+            </wp:cNvGraphicFramePr>
+            <a:graphic>
+              <a:graphicData uri="http://schemas.openxmlformats.org/drawingml/2006/picture">
+                <pic:pic>
+                  <pic:nvPicPr>
+                    <pic:cNvPr id="0" name="20260902154721-staff-filter-province.png"/>
+                    <pic:cNvPicPr/>
+                  </pic:nvPicPr>
+                  <pic:blipFill>
+                    <a:blip r:embed="rId19"/>
+                    <a:stretch>
+                      <a:fillRect/>
+                    </a:stretch>
+                  </pic:blipFill>
+                  <pic:spPr>
+                    <a:xfrm>
+                      <a:off x="0" y="0"/>
+                      <a:ext cx="5852160" cy="3840480"/>
+                    </a:xfrm>
+                    <a:prstGeom prst="rect"/>
+                  </pic:spPr>
+                </pic:pic>
+              </a:graphicData>
+            </a:graphic>
+          </wp:inline>
+        </w:drawing>
+      </w:r>
+    </w:p>
+    <w:p>
+      <w:pPr>
+        <w:pStyle w:val="Heading2"/>
+        <w:keepNext/>
+      </w:pPr>
+      <w:r>
+        <w:t>ภาพที่ 9: Filter วันที่ส่งและวันที่ลงทะเบียนแบบช่วงเวลา</w:t>
+      </w:r>
+    </w:p>
+    <w:p>
+      <w:r>
+        <w:drawing>
+          <wp:inline xmlns:a="http://schemas.openxmlformats.org/drawingml/2006/main" xmlns:pic="http://schemas.openxmlformats.org/drawingml/2006/picture">
+            <wp:extent cx="5852160" cy="3840480"/>
+            <wp:docPr id="60" name="Picture 60"/>
+            <wp:cNvGraphicFramePr>
+              <a:graphicFrameLocks noChangeAspect="1"/>
+            </wp:cNvGraphicFramePr>
+            <a:graphic>
+              <a:graphicData uri="http://schemas.openxmlformats.org/drawingml/2006/picture">
+                <pic:pic>
+                  <pic:nvPicPr>
+                    <pic:cNvPr id="0" name="20260902154721-staff-date-range-filter.png"/>
+                    <pic:cNvPicPr/>
+                  </pic:nvPicPr>
+                  <pic:blipFill>
+                    <a:blip r:embed="rId20"/>
+                    <a:stretch>
+                      <a:fillRect/>
+                    </a:stretch>
+                  </pic:blipFill>
+                  <pic:spPr>
+                    <a:xfrm>
+                      <a:off x="0" y="0"/>
+                      <a:ext cx="5852160" cy="3840480"/>
+                    </a:xfrm>
+                    <a:prstGeom prst="rect"/>
+                  </pic:spPr>
+                </pic:pic>
+              </a:graphicData>
+            </a:graphic>
+          </wp:inline>
+        </w:drawing>
+      </w:r>
+    </w:p>
+    <w:p>
+      <w:pPr>
+        <w:pStyle w:val="Heading2"/>
+        <w:keepNext/>
+      </w:pPr>
+      <w:r>
+        <w:t>ภาพที่ 10: Sorting จาก header ตาราง</w:t>
+      </w:r>
+    </w:p>
+    <w:p>
+      <w:r>
+        <w:drawing>
+          <wp:inline xmlns:a="http://schemas.openxmlformats.org/drawingml/2006/main" xmlns:pic="http://schemas.openxmlformats.org/drawingml/2006/picture">
+            <wp:extent cx="5852160" cy="3840480"/>
+            <wp:docPr id="61" name="Picture 61"/>
+            <wp:cNvGraphicFramePr>
+              <a:graphicFrameLocks noChangeAspect="1"/>
+            </wp:cNvGraphicFramePr>
+            <a:graphic>
+              <a:graphicData uri="http://schemas.openxmlformats.org/drawingml/2006/picture">
+                <pic:pic>
+                  <pic:nvPicPr>
+                    <pic:cNvPr id="0" name="20260902154721-staff-sorting.png"/>
+                    <pic:cNvPicPr/>
+                  </pic:nvPicPr>
+                  <pic:blipFill>
+                    <a:blip r:embed="rId21"/>
+                    <a:stretch>
+                      <a:fillRect/>
+                    </a:stretch>
+                  </pic:blipFill>
+                  <pic:spPr>
+                    <a:xfrm>
+                      <a:off x="0" y="0"/>
+                      <a:ext cx="5852160" cy="3840480"/>
+                    </a:xfrm>
+                    <a:prstGeom prst="rect"/>
+                  </pic:spPr>
+                </pic:pic>
+              </a:graphicData>
+            </a:graphic>
+          </wp:inline>
+        </w:drawing>
+      </w:r>
+    </w:p>
+    <w:p>
+      <w:pPr>
+        <w:pStyle w:val="Heading2"/>
+        <w:keepNext/>
+      </w:pPr>
+      <w:r>
+        <w:t>ภาพที่ 11: Drawer รายละเอียด พร้อมบันทึกคำขอและอัปเดตขนส่ง</w:t>
+      </w:r>
+    </w:p>
+    <w:p>
+      <w:r>
+        <w:drawing>
+          <wp:inline xmlns:a="http://schemas.openxmlformats.org/drawingml/2006/main" xmlns:pic="http://schemas.openxmlformats.org/drawingml/2006/picture">
+            <wp:extent cx="5852160" cy="3840480"/>
+            <wp:docPr id="62" name="Picture 62"/>
+            <wp:cNvGraphicFramePr>
+              <a:graphicFrameLocks noChangeAspect="1"/>
+            </wp:cNvGraphicFramePr>
+            <a:graphic>
+              <a:graphicData uri="http://schemas.openxmlformats.org/drawingml/2006/picture">
+                <pic:pic>
+                  <pic:nvPicPr>
+                    <pic:cNvPr id="0" name="20260902154721-staff-detail-drawer.png"/>
                     <pic:cNvPicPr/>
                   </pic:nvPicPr>
                   <pic:blipFill>
@@ -8782,7 +11312,7 @@
         <w:keepNext/>
       </w:pPr>
       <w:r>
-        <w:t>ภาพที่ 8: Filter header ตารางด้วยจังหวัด</w:t>
+        <w:t>ภาพที่ 12: Tracking URL แสดงเป็น link คลิกได้</w:t>
       </w:r>
     </w:p>
     <w:p>
@@ -8790,7 +11320,7 @@
         <w:drawing>
           <wp:inline xmlns:a="http://schemas.openxmlformats.org/drawingml/2006/main" xmlns:pic="http://schemas.openxmlformats.org/drawingml/2006/picture">
             <wp:extent cx="5852160" cy="3840480"/>
-            <wp:docPr id="8" name="Picture 8"/>
+            <wp:docPr id="63" name="Picture 63"/>
             <wp:cNvGraphicFramePr>
               <a:graphicFrameLocks noChangeAspect="1"/>
             </wp:cNvGraphicFramePr>
@@ -8798,7 +11328,7 @@
               <a:graphicData uri="http://schemas.openxmlformats.org/drawingml/2006/picture">
                 <pic:pic>
                   <pic:nvPicPr>
-                    <pic:cNvPr id="0" name="20260902154721-staff-filter-province.png"/>
+                    <pic:cNvPr id="0" name="20260902154721-staff-tracking-url-link.png"/>
                     <pic:cNvPicPr/>
                   </pic:nvPicPr>
                   <pic:blipFill>
@@ -8827,7 +11357,7 @@
         <w:keepNext/>
       </w:pPr>
       <w:r>
-        <w:t>ภาพที่ 9: Filter วันที่ส่งและวันที่ลงทะเบียนแบบช่วงเวลา</w:t>
+        <w:t>ภาพที่ 13: Export CSV จากหน้าพนักงาน</w:t>
       </w:r>
     </w:p>
     <w:p>
@@ -8835,187 +11365,7 @@
         <w:drawing>
           <wp:inline xmlns:a="http://schemas.openxmlformats.org/drawingml/2006/main" xmlns:pic="http://schemas.openxmlformats.org/drawingml/2006/picture">
             <wp:extent cx="5852160" cy="3840480"/>
-            <wp:docPr id="9" name="Picture 9"/>
-            <wp:cNvGraphicFramePr>
-              <a:graphicFrameLocks noChangeAspect="1"/>
-            </wp:cNvGraphicFramePr>
-            <a:graphic>
-              <a:graphicData uri="http://schemas.openxmlformats.org/drawingml/2006/picture">
-                <pic:pic>
-                  <pic:nvPicPr>
-                    <pic:cNvPr id="0" name="20260902154721-staff-date-range-filter.png"/>
-                    <pic:cNvPicPr/>
-                  </pic:nvPicPr>
-                  <pic:blipFill>
-                    <a:blip r:embed="rId18"/>
-                    <a:stretch>
-                      <a:fillRect/>
-                    </a:stretch>
-                  </pic:blipFill>
-                  <pic:spPr>
-                    <a:xfrm>
-                      <a:off x="0" y="0"/>
-                      <a:ext cx="5852160" cy="3840480"/>
-                    </a:xfrm>
-                    <a:prstGeom prst="rect"/>
-                  </pic:spPr>
-                </pic:pic>
-              </a:graphicData>
-            </a:graphic>
-          </wp:inline>
-        </w:drawing>
-      </w:r>
-    </w:p>
-    <w:p>
-      <w:pPr>
-        <w:pStyle w:val="Heading2"/>
-        <w:keepNext/>
-      </w:pPr>
-      <w:r>
-        <w:t>ภาพที่ 10: Sorting จาก header ตาราง</w:t>
-      </w:r>
-    </w:p>
-    <w:p>
-      <w:r>
-        <w:drawing>
-          <wp:inline xmlns:a="http://schemas.openxmlformats.org/drawingml/2006/main" xmlns:pic="http://schemas.openxmlformats.org/drawingml/2006/picture">
-            <wp:extent cx="5852160" cy="3840480"/>
-            <wp:docPr id="10" name="Picture 10"/>
-            <wp:cNvGraphicFramePr>
-              <a:graphicFrameLocks noChangeAspect="1"/>
-            </wp:cNvGraphicFramePr>
-            <a:graphic>
-              <a:graphicData uri="http://schemas.openxmlformats.org/drawingml/2006/picture">
-                <pic:pic>
-                  <pic:nvPicPr>
-                    <pic:cNvPr id="0" name="20260902154721-staff-sorting.png"/>
-                    <pic:cNvPicPr/>
-                  </pic:nvPicPr>
-                  <pic:blipFill>
-                    <a:blip r:embed="rId19"/>
-                    <a:stretch>
-                      <a:fillRect/>
-                    </a:stretch>
-                  </pic:blipFill>
-                  <pic:spPr>
-                    <a:xfrm>
-                      <a:off x="0" y="0"/>
-                      <a:ext cx="5852160" cy="3840480"/>
-                    </a:xfrm>
-                    <a:prstGeom prst="rect"/>
-                  </pic:spPr>
-                </pic:pic>
-              </a:graphicData>
-            </a:graphic>
-          </wp:inline>
-        </w:drawing>
-      </w:r>
-    </w:p>
-    <w:p>
-      <w:pPr>
-        <w:pStyle w:val="Heading2"/>
-        <w:keepNext/>
-      </w:pPr>
-      <w:r>
-        <w:t>ภาพที่ 11: Drawer รายละเอียด พร้อมบันทึกคำขอและอัปเดตขนส่ง</w:t>
-      </w:r>
-    </w:p>
-    <w:p>
-      <w:r>
-        <w:drawing>
-          <wp:inline xmlns:a="http://schemas.openxmlformats.org/drawingml/2006/main" xmlns:pic="http://schemas.openxmlformats.org/drawingml/2006/picture">
-            <wp:extent cx="5852160" cy="3840480"/>
-            <wp:docPr id="11" name="Picture 11"/>
-            <wp:cNvGraphicFramePr>
-              <a:graphicFrameLocks noChangeAspect="1"/>
-            </wp:cNvGraphicFramePr>
-            <a:graphic>
-              <a:graphicData uri="http://schemas.openxmlformats.org/drawingml/2006/picture">
-                <pic:pic>
-                  <pic:nvPicPr>
-                    <pic:cNvPr id="0" name="20260902154721-staff-detail-drawer.png"/>
-                    <pic:cNvPicPr/>
-                  </pic:nvPicPr>
-                  <pic:blipFill>
-                    <a:blip r:embed="rId20"/>
-                    <a:stretch>
-                      <a:fillRect/>
-                    </a:stretch>
-                  </pic:blipFill>
-                  <pic:spPr>
-                    <a:xfrm>
-                      <a:off x="0" y="0"/>
-                      <a:ext cx="5852160" cy="3840480"/>
-                    </a:xfrm>
-                    <a:prstGeom prst="rect"/>
-                  </pic:spPr>
-                </pic:pic>
-              </a:graphicData>
-            </a:graphic>
-          </wp:inline>
-        </w:drawing>
-      </w:r>
-    </w:p>
-    <w:p>
-      <w:pPr>
-        <w:pStyle w:val="Heading2"/>
-        <w:keepNext/>
-      </w:pPr>
-      <w:r>
-        <w:t>ภาพที่ 12: Tracking URL แสดงเป็น link คลิกได้</w:t>
-      </w:r>
-    </w:p>
-    <w:p>
-      <w:r>
-        <w:drawing>
-          <wp:inline xmlns:a="http://schemas.openxmlformats.org/drawingml/2006/main" xmlns:pic="http://schemas.openxmlformats.org/drawingml/2006/picture">
-            <wp:extent cx="5852160" cy="3840480"/>
-            <wp:docPr id="12" name="Picture 12"/>
-            <wp:cNvGraphicFramePr>
-              <a:graphicFrameLocks noChangeAspect="1"/>
-            </wp:cNvGraphicFramePr>
-            <a:graphic>
-              <a:graphicData uri="http://schemas.openxmlformats.org/drawingml/2006/picture">
-                <pic:pic>
-                  <pic:nvPicPr>
-                    <pic:cNvPr id="0" name="20260902154721-staff-tracking-url-link.png"/>
-                    <pic:cNvPicPr/>
-                  </pic:nvPicPr>
-                  <pic:blipFill>
-                    <a:blip r:embed="rId21"/>
-                    <a:stretch>
-                      <a:fillRect/>
-                    </a:stretch>
-                  </pic:blipFill>
-                  <pic:spPr>
-                    <a:xfrm>
-                      <a:off x="0" y="0"/>
-                      <a:ext cx="5852160" cy="3840480"/>
-                    </a:xfrm>
-                    <a:prstGeom prst="rect"/>
-                  </pic:spPr>
-                </pic:pic>
-              </a:graphicData>
-            </a:graphic>
-          </wp:inline>
-        </w:drawing>
-      </w:r>
-    </w:p>
-    <w:p>
-      <w:pPr>
-        <w:pStyle w:val="Heading2"/>
-        <w:keepNext/>
-      </w:pPr>
-      <w:r>
-        <w:t>ภาพที่ 13: Export CSV จากหน้าพนักงาน</w:t>
-      </w:r>
-    </w:p>
-    <w:p>
-      <w:r>
-        <w:drawing>
-          <wp:inline xmlns:a="http://schemas.openxmlformats.org/drawingml/2006/main" xmlns:pic="http://schemas.openxmlformats.org/drawingml/2006/picture">
-            <wp:extent cx="5852160" cy="3840480"/>
-            <wp:docPr id="13" name="Picture 13"/>
+            <wp:docPr id="64" name="Picture 64"/>
             <wp:cNvGraphicFramePr>
               <a:graphicFrameLocks noChangeAspect="1"/>
             </wp:cNvGraphicFramePr>

</xml_diff>